<commit_message>
many updates and corrections.  Created companion glossary doc.
</commit_message>
<xml_diff>
--- a/docs/00_Development_Environment_and_Source_Control_Setup_Guide.docx
+++ b/docs/00_Development_Environment_and_Source_Control_Setup_Guide.docx
@@ -187,6 +187,15 @@
       <w:sdtEndPr/>
       <w:sdtContent>
         <w:p>
+          <w:pPr>
+            <w:pStyle w:val="TOC1"/>
+            <w:tabs>
+              <w:tab w:val="right" w:leader="dot" w:pos="9350"/>
+            </w:tabs>
+            <w:rPr>
+              <w:noProof/>
+            </w:rPr>
+          </w:pPr>
           <w:r>
             <w:fldChar w:fldCharType="begin"/>
           </w:r>
@@ -196,6 +205,2893 @@
           <w:r>
             <w:fldChar w:fldCharType="separate"/>
           </w:r>
+          <w:hyperlink w:anchor="_Toc240886166" w:history="1">
+            <w:r>
+              <w:rPr>
+                <w:rStyle w:val="Hyperlink"/>
+                <w:b/>
+                <w:bCs/>
+                <w:noProof/>
+              </w:rPr>
+              <w:t>1. Purpose</w:t>
+            </w:r>
+            <w:r>
+              <w:rPr>
+                <w:noProof/>
+              </w:rPr>
+              <w:tab/>
+            </w:r>
+            <w:r>
+              <w:rPr>
+                <w:noProof/>
+              </w:rPr>
+              <w:fldChar w:fldCharType="begin"/>
+            </w:r>
+            <w:r>
+              <w:rPr>
+                <w:noProof/>
+              </w:rPr>
+              <w:instrText xml:space="preserve"> PAGEREF _Toc240886166 \h </w:instrText>
+            </w:r>
+            <w:r>
+              <w:rPr>
+                <w:noProof/>
+              </w:rPr>
+            </w:r>
+            <w:r>
+              <w:rPr>
+                <w:noProof/>
+              </w:rPr>
+              <w:fldChar w:fldCharType="separate"/>
+            </w:r>
+            <w:r>
+              <w:rPr>
+                <w:noProof/>
+              </w:rPr>
+              <w:t>3</w:t>
+            </w:r>
+            <w:r>
+              <w:rPr>
+                <w:noProof/>
+              </w:rPr>
+              <w:fldChar w:fldCharType="end"/>
+            </w:r>
+          </w:hyperlink>
+        </w:p>
+        <w:p>
+          <w:pPr>
+            <w:pStyle w:val="TOC1"/>
+            <w:tabs>
+              <w:tab w:val="right" w:leader="dot" w:pos="9350"/>
+            </w:tabs>
+            <w:rPr>
+              <w:noProof/>
+            </w:rPr>
+          </w:pPr>
+          <w:hyperlink w:anchor="_Toc240886167" w:history="1">
+            <w:r>
+              <w:rPr>
+                <w:rStyle w:val="Hyperlink"/>
+                <w:b/>
+                <w:bCs/>
+                <w:noProof/>
+              </w:rPr>
+              <w:t>2. Concepts in Plain Language</w:t>
+            </w:r>
+            <w:r>
+              <w:rPr>
+                <w:noProof/>
+              </w:rPr>
+              <w:tab/>
+            </w:r>
+            <w:r>
+              <w:rPr>
+                <w:noProof/>
+              </w:rPr>
+              <w:fldChar w:fldCharType="begin"/>
+            </w:r>
+            <w:r>
+              <w:rPr>
+                <w:noProof/>
+              </w:rPr>
+              <w:instrText xml:space="preserve"> PAGEREF _Toc240886167 \h </w:instrText>
+            </w:r>
+            <w:r>
+              <w:rPr>
+                <w:noProof/>
+              </w:rPr>
+            </w:r>
+            <w:r>
+              <w:rPr>
+                <w:noProof/>
+              </w:rPr>
+              <w:fldChar w:fldCharType="separate"/>
+            </w:r>
+            <w:r>
+              <w:rPr>
+                <w:noProof/>
+              </w:rPr>
+              <w:t>3</w:t>
+            </w:r>
+            <w:r>
+              <w:rPr>
+                <w:noProof/>
+              </w:rPr>
+              <w:fldChar w:fldCharType="end"/>
+            </w:r>
+          </w:hyperlink>
+        </w:p>
+        <w:p>
+          <w:pPr>
+            <w:pStyle w:val="TOC1"/>
+            <w:tabs>
+              <w:tab w:val="right" w:leader="dot" w:pos="9350"/>
+            </w:tabs>
+            <w:rPr>
+              <w:noProof/>
+            </w:rPr>
+          </w:pPr>
+          <w:hyperlink w:anchor="_Toc240886168" w:history="1">
+            <w:r>
+              <w:rPr>
+                <w:rStyle w:val="Hyperlink"/>
+                <w:b/>
+                <w:bCs/>
+                <w:noProof/>
+              </w:rPr>
+              <w:t>3. Repository Design</w:t>
+            </w:r>
+            <w:r>
+              <w:rPr>
+                <w:noProof/>
+              </w:rPr>
+              <w:tab/>
+            </w:r>
+            <w:r>
+              <w:rPr>
+                <w:noProof/>
+              </w:rPr>
+              <w:fldChar w:fldCharType="begin"/>
+            </w:r>
+            <w:r>
+              <w:rPr>
+                <w:noProof/>
+              </w:rPr>
+              <w:instrText xml:space="preserve"> PAGEREF _Toc240886168 \h </w:instrText>
+            </w:r>
+            <w:r>
+              <w:rPr>
+                <w:noProof/>
+              </w:rPr>
+            </w:r>
+            <w:r>
+              <w:rPr>
+                <w:noProof/>
+              </w:rPr>
+              <w:fldChar w:fldCharType="separate"/>
+            </w:r>
+            <w:r>
+              <w:rPr>
+                <w:noProof/>
+              </w:rPr>
+              <w:t>4</w:t>
+            </w:r>
+            <w:r>
+              <w:rPr>
+                <w:noProof/>
+              </w:rPr>
+              <w:fldChar w:fldCharType="end"/>
+            </w:r>
+          </w:hyperlink>
+        </w:p>
+        <w:p>
+          <w:pPr>
+            <w:pStyle w:val="TOC2"/>
+            <w:tabs>
+              <w:tab w:val="right" w:leader="dot" w:pos="9350"/>
+            </w:tabs>
+            <w:rPr>
+              <w:noProof/>
+            </w:rPr>
+          </w:pPr>
+          <w:hyperlink w:anchor="_Toc240886169" w:history="1">
+            <w:r>
+              <w:rPr>
+                <w:rStyle w:val="Hyperlink"/>
+                <w:b/>
+                <w:bCs/>
+                <w:noProof/>
+              </w:rPr>
+              <w:t>3.1 Structure (single repository)</w:t>
+            </w:r>
+            <w:r>
+              <w:rPr>
+                <w:noProof/>
+              </w:rPr>
+              <w:tab/>
+            </w:r>
+            <w:r>
+              <w:rPr>
+                <w:noProof/>
+              </w:rPr>
+              <w:fldChar w:fldCharType="begin"/>
+            </w:r>
+            <w:r>
+              <w:rPr>
+                <w:noProof/>
+              </w:rPr>
+              <w:instrText xml:space="preserve"> PAGEREF _Toc240886169 \h </w:instrText>
+            </w:r>
+            <w:r>
+              <w:rPr>
+                <w:noProof/>
+              </w:rPr>
+            </w:r>
+            <w:r>
+              <w:rPr>
+                <w:noProof/>
+              </w:rPr>
+              <w:fldChar w:fldCharType="separate"/>
+            </w:r>
+            <w:r>
+              <w:rPr>
+                <w:noProof/>
+              </w:rPr>
+              <w:t>4</w:t>
+            </w:r>
+            <w:r>
+              <w:rPr>
+                <w:noProof/>
+              </w:rPr>
+              <w:fldChar w:fldCharType="end"/>
+            </w:r>
+          </w:hyperlink>
+        </w:p>
+        <w:p>
+          <w:pPr>
+            <w:pStyle w:val="TOC2"/>
+            <w:tabs>
+              <w:tab w:val="right" w:leader="dot" w:pos="9350"/>
+            </w:tabs>
+            <w:rPr>
+              <w:noProof/>
+            </w:rPr>
+          </w:pPr>
+          <w:hyperlink w:anchor="_Toc240886170" w:history="1">
+            <w:r>
+              <w:rPr>
+                <w:rStyle w:val="Hyperlink"/>
+                <w:b/>
+                <w:bCs/>
+                <w:noProof/>
+              </w:rPr>
+              <w:t>3.2 Visibility: public</w:t>
+            </w:r>
+            <w:r>
+              <w:rPr>
+                <w:noProof/>
+              </w:rPr>
+              <w:tab/>
+            </w:r>
+            <w:r>
+              <w:rPr>
+                <w:noProof/>
+              </w:rPr>
+              <w:fldChar w:fldCharType="begin"/>
+            </w:r>
+            <w:r>
+              <w:rPr>
+                <w:noProof/>
+              </w:rPr>
+              <w:instrText xml:space="preserve"> PAGEREF _Toc240886170 \h </w:instrText>
+            </w:r>
+            <w:r>
+              <w:rPr>
+                <w:noProof/>
+              </w:rPr>
+            </w:r>
+            <w:r>
+              <w:rPr>
+                <w:noProof/>
+              </w:rPr>
+              <w:fldChar w:fldCharType="separate"/>
+            </w:r>
+            <w:r>
+              <w:rPr>
+                <w:noProof/>
+              </w:rPr>
+              <w:t>5</w:t>
+            </w:r>
+            <w:r>
+              <w:rPr>
+                <w:noProof/>
+              </w:rPr>
+              <w:fldChar w:fldCharType="end"/>
+            </w:r>
+          </w:hyperlink>
+        </w:p>
+        <w:p>
+          <w:pPr>
+            <w:pStyle w:val="TOC2"/>
+            <w:tabs>
+              <w:tab w:val="right" w:leader="dot" w:pos="9350"/>
+            </w:tabs>
+            <w:rPr>
+              <w:noProof/>
+            </w:rPr>
+          </w:pPr>
+          <w:hyperlink w:anchor="_Toc240886171" w:history="1">
+            <w:r>
+              <w:rPr>
+                <w:rStyle w:val="Hyperlink"/>
+                <w:b/>
+                <w:bCs/>
+                <w:noProof/>
+              </w:rPr>
+              <w:t>3.3 Four Power BI Files, Two Serializations</w:t>
+            </w:r>
+            <w:r>
+              <w:rPr>
+                <w:noProof/>
+              </w:rPr>
+              <w:tab/>
+            </w:r>
+            <w:r>
+              <w:rPr>
+                <w:noProof/>
+              </w:rPr>
+              <w:fldChar w:fldCharType="begin"/>
+            </w:r>
+            <w:r>
+              <w:rPr>
+                <w:noProof/>
+              </w:rPr>
+              <w:instrText xml:space="preserve"> PAGEREF _Toc240886171 \h </w:instrText>
+            </w:r>
+            <w:r>
+              <w:rPr>
+                <w:noProof/>
+              </w:rPr>
+            </w:r>
+            <w:r>
+              <w:rPr>
+                <w:noProof/>
+              </w:rPr>
+              <w:fldChar w:fldCharType="separate"/>
+            </w:r>
+            <w:r>
+              <w:rPr>
+                <w:noProof/>
+              </w:rPr>
+              <w:t>5</w:t>
+            </w:r>
+            <w:r>
+              <w:rPr>
+                <w:noProof/>
+              </w:rPr>
+              <w:fldChar w:fldCharType="end"/>
+            </w:r>
+          </w:hyperlink>
+        </w:p>
+        <w:p>
+          <w:pPr>
+            <w:pStyle w:val="TOC1"/>
+            <w:tabs>
+              <w:tab w:val="right" w:leader="dot" w:pos="9350"/>
+            </w:tabs>
+            <w:rPr>
+              <w:noProof/>
+            </w:rPr>
+          </w:pPr>
+          <w:hyperlink w:anchor="_Toc240886172" w:history="1">
+            <w:r>
+              <w:rPr>
+                <w:rStyle w:val="Hyperlink"/>
+                <w:b/>
+                <w:bCs/>
+                <w:noProof/>
+              </w:rPr>
+              <w:t>4. Create the GitHub Account and Repository</w:t>
+            </w:r>
+            <w:r>
+              <w:rPr>
+                <w:noProof/>
+              </w:rPr>
+              <w:tab/>
+            </w:r>
+            <w:r>
+              <w:rPr>
+                <w:noProof/>
+              </w:rPr>
+              <w:fldChar w:fldCharType="begin"/>
+            </w:r>
+            <w:r>
+              <w:rPr>
+                <w:noProof/>
+              </w:rPr>
+              <w:instrText xml:space="preserve"> PAGEREF _Toc240886172 \h </w:instrText>
+            </w:r>
+            <w:r>
+              <w:rPr>
+                <w:noProof/>
+              </w:rPr>
+            </w:r>
+            <w:r>
+              <w:rPr>
+                <w:noProof/>
+              </w:rPr>
+              <w:fldChar w:fldCharType="separate"/>
+            </w:r>
+            <w:r>
+              <w:rPr>
+                <w:noProof/>
+              </w:rPr>
+              <w:t>5</w:t>
+            </w:r>
+            <w:r>
+              <w:rPr>
+                <w:noProof/>
+              </w:rPr>
+              <w:fldChar w:fldCharType="end"/>
+            </w:r>
+          </w:hyperlink>
+        </w:p>
+        <w:p>
+          <w:pPr>
+            <w:pStyle w:val="TOC2"/>
+            <w:tabs>
+              <w:tab w:val="right" w:leader="dot" w:pos="9350"/>
+            </w:tabs>
+            <w:rPr>
+              <w:noProof/>
+            </w:rPr>
+          </w:pPr>
+          <w:hyperlink w:anchor="_Toc240886173" w:history="1">
+            <w:r>
+              <w:rPr>
+                <w:rStyle w:val="Hyperlink"/>
+                <w:b/>
+                <w:bCs/>
+                <w:noProof/>
+              </w:rPr>
+              <w:t>4.1 Account</w:t>
+            </w:r>
+            <w:r>
+              <w:rPr>
+                <w:noProof/>
+              </w:rPr>
+              <w:tab/>
+            </w:r>
+            <w:r>
+              <w:rPr>
+                <w:noProof/>
+              </w:rPr>
+              <w:fldChar w:fldCharType="begin"/>
+            </w:r>
+            <w:r>
+              <w:rPr>
+                <w:noProof/>
+              </w:rPr>
+              <w:instrText xml:space="preserve"> PAGEREF _Toc240886173 \h </w:instrText>
+            </w:r>
+            <w:r>
+              <w:rPr>
+                <w:noProof/>
+              </w:rPr>
+            </w:r>
+            <w:r>
+              <w:rPr>
+                <w:noProof/>
+              </w:rPr>
+              <w:fldChar w:fldCharType="separate"/>
+            </w:r>
+            <w:r>
+              <w:rPr>
+                <w:noProof/>
+              </w:rPr>
+              <w:t>5</w:t>
+            </w:r>
+            <w:r>
+              <w:rPr>
+                <w:noProof/>
+              </w:rPr>
+              <w:fldChar w:fldCharType="end"/>
+            </w:r>
+          </w:hyperlink>
+        </w:p>
+        <w:p>
+          <w:pPr>
+            <w:pStyle w:val="TOC2"/>
+            <w:tabs>
+              <w:tab w:val="right" w:leader="dot" w:pos="9350"/>
+            </w:tabs>
+            <w:rPr>
+              <w:noProof/>
+            </w:rPr>
+          </w:pPr>
+          <w:hyperlink w:anchor="_Toc240886174" w:history="1">
+            <w:r>
+              <w:rPr>
+                <w:rStyle w:val="Hyperlink"/>
+                <w:b/>
+                <w:bCs/>
+                <w:noProof/>
+              </w:rPr>
+              <w:t>4.2 Create the repository</w:t>
+            </w:r>
+            <w:r>
+              <w:rPr>
+                <w:noProof/>
+              </w:rPr>
+              <w:tab/>
+            </w:r>
+            <w:r>
+              <w:rPr>
+                <w:noProof/>
+              </w:rPr>
+              <w:fldChar w:fldCharType="begin"/>
+            </w:r>
+            <w:r>
+              <w:rPr>
+                <w:noProof/>
+              </w:rPr>
+              <w:instrText xml:space="preserve"> PAGEREF _Toc240886174 \h </w:instrText>
+            </w:r>
+            <w:r>
+              <w:rPr>
+                <w:noProof/>
+              </w:rPr>
+            </w:r>
+            <w:r>
+              <w:rPr>
+                <w:noProof/>
+              </w:rPr>
+              <w:fldChar w:fldCharType="separate"/>
+            </w:r>
+            <w:r>
+              <w:rPr>
+                <w:noProof/>
+              </w:rPr>
+              <w:t>5</w:t>
+            </w:r>
+            <w:r>
+              <w:rPr>
+                <w:noProof/>
+              </w:rPr>
+              <w:fldChar w:fldCharType="end"/>
+            </w:r>
+          </w:hyperlink>
+        </w:p>
+        <w:p>
+          <w:pPr>
+            <w:pStyle w:val="TOC2"/>
+            <w:tabs>
+              <w:tab w:val="right" w:leader="dot" w:pos="9350"/>
+            </w:tabs>
+            <w:rPr>
+              <w:noProof/>
+            </w:rPr>
+          </w:pPr>
+          <w:hyperlink w:anchor="_Toc240886175" w:history="1">
+            <w:r>
+              <w:rPr>
+                <w:rStyle w:val="Hyperlink"/>
+                <w:b/>
+                <w:bCs/>
+                <w:noProof/>
+              </w:rPr>
+              <w:t>4.3 Add the .gitignore before anything else</w:t>
+            </w:r>
+            <w:r>
+              <w:rPr>
+                <w:noProof/>
+              </w:rPr>
+              <w:tab/>
+            </w:r>
+            <w:r>
+              <w:rPr>
+                <w:noProof/>
+              </w:rPr>
+              <w:fldChar w:fldCharType="begin"/>
+            </w:r>
+            <w:r>
+              <w:rPr>
+                <w:noProof/>
+              </w:rPr>
+              <w:instrText xml:space="preserve"> PAGEREF _Toc240886175 \h </w:instrText>
+            </w:r>
+            <w:r>
+              <w:rPr>
+                <w:noProof/>
+              </w:rPr>
+            </w:r>
+            <w:r>
+              <w:rPr>
+                <w:noProof/>
+              </w:rPr>
+              <w:fldChar w:fldCharType="separate"/>
+            </w:r>
+            <w:r>
+              <w:rPr>
+                <w:noProof/>
+              </w:rPr>
+              <w:t>6</w:t>
+            </w:r>
+            <w:r>
+              <w:rPr>
+                <w:noProof/>
+              </w:rPr>
+              <w:fldChar w:fldCharType="end"/>
+            </w:r>
+          </w:hyperlink>
+        </w:p>
+        <w:p>
+          <w:pPr>
+            <w:pStyle w:val="TOC2"/>
+            <w:tabs>
+              <w:tab w:val="right" w:leader="dot" w:pos="9350"/>
+            </w:tabs>
+            <w:rPr>
+              <w:noProof/>
+            </w:rPr>
+          </w:pPr>
+          <w:hyperlink w:anchor="_Toc240886176" w:history="1">
+            <w:r>
+              <w:rPr>
+                <w:rStyle w:val="Hyperlink"/>
+                <w:b/>
+                <w:bCs/>
+                <w:noProof/>
+              </w:rPr>
+              <w:t>4.4 Create the folder skeleton</w:t>
+            </w:r>
+            <w:r>
+              <w:rPr>
+                <w:noProof/>
+              </w:rPr>
+              <w:tab/>
+            </w:r>
+            <w:r>
+              <w:rPr>
+                <w:noProof/>
+              </w:rPr>
+              <w:fldChar w:fldCharType="begin"/>
+            </w:r>
+            <w:r>
+              <w:rPr>
+                <w:noProof/>
+              </w:rPr>
+              <w:instrText xml:space="preserve"> PAGEREF _Toc240886176 \h </w:instrText>
+            </w:r>
+            <w:r>
+              <w:rPr>
+                <w:noProof/>
+              </w:rPr>
+            </w:r>
+            <w:r>
+              <w:rPr>
+                <w:noProof/>
+              </w:rPr>
+              <w:fldChar w:fldCharType="separate"/>
+            </w:r>
+            <w:r>
+              <w:rPr>
+                <w:noProof/>
+              </w:rPr>
+              <w:t>7</w:t>
+            </w:r>
+            <w:r>
+              <w:rPr>
+                <w:noProof/>
+              </w:rPr>
+              <w:fldChar w:fldCharType="end"/>
+            </w:r>
+          </w:hyperlink>
+        </w:p>
+        <w:p>
+          <w:pPr>
+            <w:pStyle w:val="TOC1"/>
+            <w:tabs>
+              <w:tab w:val="right" w:leader="dot" w:pos="9350"/>
+            </w:tabs>
+            <w:rPr>
+              <w:noProof/>
+            </w:rPr>
+          </w:pPr>
+          <w:hyperlink w:anchor="_Toc240886177" w:history="1">
+            <w:r>
+              <w:rPr>
+                <w:rStyle w:val="Hyperlink"/>
+                <w:b/>
+                <w:bCs/>
+                <w:noProof/>
+              </w:rPr>
+              <w:t>5. Clone the Repository — Before Any Other Work</w:t>
+            </w:r>
+            <w:r>
+              <w:rPr>
+                <w:noProof/>
+              </w:rPr>
+              <w:tab/>
+            </w:r>
+            <w:r>
+              <w:rPr>
+                <w:noProof/>
+              </w:rPr>
+              <w:fldChar w:fldCharType="begin"/>
+            </w:r>
+            <w:r>
+              <w:rPr>
+                <w:noProof/>
+              </w:rPr>
+              <w:instrText xml:space="preserve"> PAGEREF _Toc240886177 \h </w:instrText>
+            </w:r>
+            <w:r>
+              <w:rPr>
+                <w:noProof/>
+              </w:rPr>
+            </w:r>
+            <w:r>
+              <w:rPr>
+                <w:noProof/>
+              </w:rPr>
+              <w:fldChar w:fldCharType="separate"/>
+            </w:r>
+            <w:r>
+              <w:rPr>
+                <w:noProof/>
+              </w:rPr>
+              <w:t>7</w:t>
+            </w:r>
+            <w:r>
+              <w:rPr>
+                <w:noProof/>
+              </w:rPr>
+              <w:fldChar w:fldCharType="end"/>
+            </w:r>
+          </w:hyperlink>
+        </w:p>
+        <w:p>
+          <w:pPr>
+            <w:pStyle w:val="TOC1"/>
+            <w:tabs>
+              <w:tab w:val="right" w:leader="dot" w:pos="9350"/>
+            </w:tabs>
+            <w:rPr>
+              <w:noProof/>
+            </w:rPr>
+          </w:pPr>
+          <w:hyperlink w:anchor="_Toc240886178" w:history="1">
+            <w:r>
+              <w:rPr>
+                <w:rStyle w:val="Hyperlink"/>
+                <w:b/>
+                <w:bCs/>
+                <w:noProof/>
+              </w:rPr>
+              <w:t>6. Local Development Environment</w:t>
+            </w:r>
+            <w:r>
+              <w:rPr>
+                <w:noProof/>
+              </w:rPr>
+              <w:tab/>
+            </w:r>
+            <w:r>
+              <w:rPr>
+                <w:noProof/>
+              </w:rPr>
+              <w:fldChar w:fldCharType="begin"/>
+            </w:r>
+            <w:r>
+              <w:rPr>
+                <w:noProof/>
+              </w:rPr>
+              <w:instrText xml:space="preserve"> PAGEREF _Toc240886178 \h </w:instrText>
+            </w:r>
+            <w:r>
+              <w:rPr>
+                <w:noProof/>
+              </w:rPr>
+            </w:r>
+            <w:r>
+              <w:rPr>
+                <w:noProof/>
+              </w:rPr>
+              <w:fldChar w:fldCharType="separate"/>
+            </w:r>
+            <w:r>
+              <w:rPr>
+                <w:noProof/>
+              </w:rPr>
+              <w:t>7</w:t>
+            </w:r>
+            <w:r>
+              <w:rPr>
+                <w:noProof/>
+              </w:rPr>
+              <w:fldChar w:fldCharType="end"/>
+            </w:r>
+          </w:hyperlink>
+        </w:p>
+        <w:p>
+          <w:pPr>
+            <w:pStyle w:val="TOC2"/>
+            <w:tabs>
+              <w:tab w:val="right" w:leader="dot" w:pos="9350"/>
+            </w:tabs>
+            <w:rPr>
+              <w:noProof/>
+            </w:rPr>
+          </w:pPr>
+          <w:hyperlink w:anchor="_Toc240886179" w:history="1">
+            <w:r>
+              <w:rPr>
+                <w:rStyle w:val="Hyperlink"/>
+                <w:b/>
+                <w:bCs/>
+                <w:noProof/>
+              </w:rPr>
+              <w:t>6.1 Install order</w:t>
+            </w:r>
+            <w:r>
+              <w:rPr>
+                <w:noProof/>
+              </w:rPr>
+              <w:tab/>
+            </w:r>
+            <w:r>
+              <w:rPr>
+                <w:noProof/>
+              </w:rPr>
+              <w:fldChar w:fldCharType="begin"/>
+            </w:r>
+            <w:r>
+              <w:rPr>
+                <w:noProof/>
+              </w:rPr>
+              <w:instrText xml:space="preserve"> PAGEREF _Toc240886179 \h </w:instrText>
+            </w:r>
+            <w:r>
+              <w:rPr>
+                <w:noProof/>
+              </w:rPr>
+            </w:r>
+            <w:r>
+              <w:rPr>
+                <w:noProof/>
+              </w:rPr>
+              <w:fldChar w:fldCharType="separate"/>
+            </w:r>
+            <w:r>
+              <w:rPr>
+                <w:noProof/>
+              </w:rPr>
+              <w:t>8</w:t>
+            </w:r>
+            <w:r>
+              <w:rPr>
+                <w:noProof/>
+              </w:rPr>
+              <w:fldChar w:fldCharType="end"/>
+            </w:r>
+          </w:hyperlink>
+        </w:p>
+        <w:p>
+          <w:pPr>
+            <w:pStyle w:val="TOC2"/>
+            <w:tabs>
+              <w:tab w:val="right" w:leader="dot" w:pos="9350"/>
+            </w:tabs>
+            <w:rPr>
+              <w:noProof/>
+            </w:rPr>
+          </w:pPr>
+          <w:hyperlink w:anchor="_Toc240886180" w:history="1">
+            <w:r>
+              <w:rPr>
+                <w:rStyle w:val="Hyperlink"/>
+                <w:b/>
+                <w:bCs/>
+                <w:noProof/>
+              </w:rPr>
+              <w:t>6.2 The local folder layout</w:t>
+            </w:r>
+            <w:r>
+              <w:rPr>
+                <w:noProof/>
+              </w:rPr>
+              <w:tab/>
+            </w:r>
+            <w:r>
+              <w:rPr>
+                <w:noProof/>
+              </w:rPr>
+              <w:fldChar w:fldCharType="begin"/>
+            </w:r>
+            <w:r>
+              <w:rPr>
+                <w:noProof/>
+              </w:rPr>
+              <w:instrText xml:space="preserve"> PAGEREF _Toc240886180 \h </w:instrText>
+            </w:r>
+            <w:r>
+              <w:rPr>
+                <w:noProof/>
+              </w:rPr>
+            </w:r>
+            <w:r>
+              <w:rPr>
+                <w:noProof/>
+              </w:rPr>
+              <w:fldChar w:fldCharType="separate"/>
+            </w:r>
+            <w:r>
+              <w:rPr>
+                <w:noProof/>
+              </w:rPr>
+              <w:t>8</w:t>
+            </w:r>
+            <w:r>
+              <w:rPr>
+                <w:noProof/>
+              </w:rPr>
+              <w:fldChar w:fldCharType="end"/>
+            </w:r>
+          </w:hyperlink>
+        </w:p>
+        <w:p>
+          <w:pPr>
+            <w:pStyle w:val="TOC2"/>
+            <w:tabs>
+              <w:tab w:val="right" w:leader="dot" w:pos="9350"/>
+            </w:tabs>
+            <w:rPr>
+              <w:noProof/>
+            </w:rPr>
+          </w:pPr>
+          <w:hyperlink w:anchor="_Toc240886181" w:history="1">
+            <w:r>
+              <w:rPr>
+                <w:rStyle w:val="Hyperlink"/>
+                <w:b/>
+                <w:bCs/>
+                <w:noProof/>
+              </w:rPr>
+              <w:t>6.3 Build the warehouse locally</w:t>
+            </w:r>
+            <w:r>
+              <w:rPr>
+                <w:noProof/>
+              </w:rPr>
+              <w:tab/>
+            </w:r>
+            <w:r>
+              <w:rPr>
+                <w:noProof/>
+              </w:rPr>
+              <w:fldChar w:fldCharType="begin"/>
+            </w:r>
+            <w:r>
+              <w:rPr>
+                <w:noProof/>
+              </w:rPr>
+              <w:instrText xml:space="preserve"> PAGEREF _Toc240886181 \h </w:instrText>
+            </w:r>
+            <w:r>
+              <w:rPr>
+                <w:noProof/>
+              </w:rPr>
+            </w:r>
+            <w:r>
+              <w:rPr>
+                <w:noProof/>
+              </w:rPr>
+              <w:fldChar w:fldCharType="separate"/>
+            </w:r>
+            <w:r>
+              <w:rPr>
+                <w:noProof/>
+              </w:rPr>
+              <w:t>8</w:t>
+            </w:r>
+            <w:r>
+              <w:rPr>
+                <w:noProof/>
+              </w:rPr>
+              <w:fldChar w:fldCharType="end"/>
+            </w:r>
+          </w:hyperlink>
+        </w:p>
+        <w:p>
+          <w:pPr>
+            <w:pStyle w:val="TOC1"/>
+            <w:tabs>
+              <w:tab w:val="right" w:leader="dot" w:pos="9350"/>
+            </w:tabs>
+            <w:rPr>
+              <w:noProof/>
+            </w:rPr>
+          </w:pPr>
+          <w:hyperlink w:anchor="_Toc240886182" w:history="1">
+            <w:r>
+              <w:rPr>
+                <w:rStyle w:val="Hyperlink"/>
+                <w:b/>
+                <w:bCs/>
+                <w:noProof/>
+              </w:rPr>
+              <w:t>7. Three Everyday Workflows at a Glance</w:t>
+            </w:r>
+            <w:r>
+              <w:rPr>
+                <w:noProof/>
+              </w:rPr>
+              <w:tab/>
+            </w:r>
+            <w:r>
+              <w:rPr>
+                <w:noProof/>
+              </w:rPr>
+              <w:fldChar w:fldCharType="begin"/>
+            </w:r>
+            <w:r>
+              <w:rPr>
+                <w:noProof/>
+              </w:rPr>
+              <w:instrText xml:space="preserve"> PAGEREF _Toc240886182 \h </w:instrText>
+            </w:r>
+            <w:r>
+              <w:rPr>
+                <w:noProof/>
+              </w:rPr>
+            </w:r>
+            <w:r>
+              <w:rPr>
+                <w:noProof/>
+              </w:rPr>
+              <w:fldChar w:fldCharType="separate"/>
+            </w:r>
+            <w:r>
+              <w:rPr>
+                <w:noProof/>
+              </w:rPr>
+              <w:t>8</w:t>
+            </w:r>
+            <w:r>
+              <w:rPr>
+                <w:noProof/>
+              </w:rPr>
+              <w:fldChar w:fldCharType="end"/>
+            </w:r>
+          </w:hyperlink>
+        </w:p>
+        <w:p>
+          <w:pPr>
+            <w:pStyle w:val="TOC1"/>
+            <w:tabs>
+              <w:tab w:val="right" w:leader="dot" w:pos="9350"/>
+            </w:tabs>
+            <w:rPr>
+              <w:noProof/>
+            </w:rPr>
+          </w:pPr>
+          <w:hyperlink w:anchor="_Toc240886183" w:history="1">
+            <w:r>
+              <w:rPr>
+                <w:rStyle w:val="Hyperlink"/>
+                <w:b/>
+                <w:bCs/>
+                <w:noProof/>
+              </w:rPr>
+              <w:t>8. Fallback — Uploading Documents via the GitHub Website</w:t>
+            </w:r>
+            <w:r>
+              <w:rPr>
+                <w:noProof/>
+              </w:rPr>
+              <w:tab/>
+            </w:r>
+            <w:r>
+              <w:rPr>
+                <w:noProof/>
+              </w:rPr>
+              <w:fldChar w:fldCharType="begin"/>
+            </w:r>
+            <w:r>
+              <w:rPr>
+                <w:noProof/>
+              </w:rPr>
+              <w:instrText xml:space="preserve"> PAGEREF _Toc240886183 \h </w:instrText>
+            </w:r>
+            <w:r>
+              <w:rPr>
+                <w:noProof/>
+              </w:rPr>
+            </w:r>
+            <w:r>
+              <w:rPr>
+                <w:noProof/>
+              </w:rPr>
+              <w:fldChar w:fldCharType="separate"/>
+            </w:r>
+            <w:r>
+              <w:rPr>
+                <w:noProof/>
+              </w:rPr>
+              <w:t>9</w:t>
+            </w:r>
+            <w:r>
+              <w:rPr>
+                <w:noProof/>
+              </w:rPr>
+              <w:fldChar w:fldCharType="end"/>
+            </w:r>
+          </w:hyperlink>
+        </w:p>
+        <w:p>
+          <w:pPr>
+            <w:pStyle w:val="TOC1"/>
+            <w:tabs>
+              <w:tab w:val="right" w:leader="dot" w:pos="9350"/>
+            </w:tabs>
+            <w:rPr>
+              <w:noProof/>
+            </w:rPr>
+          </w:pPr>
+          <w:hyperlink w:anchor="_Toc240886184" w:history="1">
+            <w:r>
+              <w:rPr>
+                <w:rStyle w:val="Hyperlink"/>
+                <w:b/>
+                <w:bCs/>
+                <w:noProof/>
+              </w:rPr>
+              <w:t>9. Power BI Git Workflow — PBIP Format</w:t>
+            </w:r>
+            <w:r>
+              <w:rPr>
+                <w:noProof/>
+              </w:rPr>
+              <w:tab/>
+            </w:r>
+            <w:r>
+              <w:rPr>
+                <w:noProof/>
+              </w:rPr>
+              <w:fldChar w:fldCharType="begin"/>
+            </w:r>
+            <w:r>
+              <w:rPr>
+                <w:noProof/>
+              </w:rPr>
+              <w:instrText xml:space="preserve"> PAGEREF _Toc240886184 \h </w:instrText>
+            </w:r>
+            <w:r>
+              <w:rPr>
+                <w:noProof/>
+              </w:rPr>
+            </w:r>
+            <w:r>
+              <w:rPr>
+                <w:noProof/>
+              </w:rPr>
+              <w:fldChar w:fldCharType="separate"/>
+            </w:r>
+            <w:r>
+              <w:rPr>
+                <w:noProof/>
+              </w:rPr>
+              <w:t>9</w:t>
+            </w:r>
+            <w:r>
+              <w:rPr>
+                <w:noProof/>
+              </w:rPr>
+              <w:fldChar w:fldCharType="end"/>
+            </w:r>
+          </w:hyperlink>
+        </w:p>
+        <w:p>
+          <w:pPr>
+            <w:pStyle w:val="TOC2"/>
+            <w:tabs>
+              <w:tab w:val="right" w:leader="dot" w:pos="9350"/>
+            </w:tabs>
+            <w:rPr>
+              <w:noProof/>
+            </w:rPr>
+          </w:pPr>
+          <w:hyperlink w:anchor="_Toc240886185" w:history="1">
+            <w:r>
+              <w:rPr>
+                <w:rStyle w:val="Hyperlink"/>
+                <w:b/>
+                <w:bCs/>
+                <w:noProof/>
+              </w:rPr>
+              <w:t>9.1 Enable and understand PBIP</w:t>
+            </w:r>
+            <w:r>
+              <w:rPr>
+                <w:noProof/>
+              </w:rPr>
+              <w:tab/>
+            </w:r>
+            <w:r>
+              <w:rPr>
+                <w:noProof/>
+              </w:rPr>
+              <w:fldChar w:fldCharType="begin"/>
+            </w:r>
+            <w:r>
+              <w:rPr>
+                <w:noProof/>
+              </w:rPr>
+              <w:instrText xml:space="preserve"> PAGEREF _Toc240886185 \h </w:instrText>
+            </w:r>
+            <w:r>
+              <w:rPr>
+                <w:noProof/>
+              </w:rPr>
+            </w:r>
+            <w:r>
+              <w:rPr>
+                <w:noProof/>
+              </w:rPr>
+              <w:fldChar w:fldCharType="separate"/>
+            </w:r>
+            <w:r>
+              <w:rPr>
+                <w:noProof/>
+              </w:rPr>
+              <w:t>9</w:t>
+            </w:r>
+            <w:r>
+              <w:rPr>
+                <w:noProof/>
+              </w:rPr>
+              <w:fldChar w:fldCharType="end"/>
+            </w:r>
+          </w:hyperlink>
+        </w:p>
+        <w:p>
+          <w:pPr>
+            <w:pStyle w:val="TOC2"/>
+            <w:tabs>
+              <w:tab w:val="right" w:leader="dot" w:pos="9350"/>
+            </w:tabs>
+            <w:rPr>
+              <w:noProof/>
+            </w:rPr>
+          </w:pPr>
+          <w:hyperlink w:anchor="_Toc240886186" w:history="1">
+            <w:r>
+              <w:rPr>
+                <w:rStyle w:val="Hyperlink"/>
+                <w:b/>
+                <w:bCs/>
+                <w:noProof/>
+              </w:rPr>
+              <w:t>9.2 The semantic model file</w:t>
+            </w:r>
+            <w:r>
+              <w:rPr>
+                <w:noProof/>
+              </w:rPr>
+              <w:tab/>
+            </w:r>
+            <w:r>
+              <w:rPr>
+                <w:noProof/>
+              </w:rPr>
+              <w:fldChar w:fldCharType="begin"/>
+            </w:r>
+            <w:r>
+              <w:rPr>
+                <w:noProof/>
+              </w:rPr>
+              <w:instrText xml:space="preserve"> PAGEREF _Toc240886186 \h </w:instrText>
+            </w:r>
+            <w:r>
+              <w:rPr>
+                <w:noProof/>
+              </w:rPr>
+            </w:r>
+            <w:r>
+              <w:rPr>
+                <w:noProof/>
+              </w:rPr>
+              <w:fldChar w:fldCharType="separate"/>
+            </w:r>
+            <w:r>
+              <w:rPr>
+                <w:noProof/>
+              </w:rPr>
+              <w:t>10</w:t>
+            </w:r>
+            <w:r>
+              <w:rPr>
+                <w:noProof/>
+              </w:rPr>
+              <w:fldChar w:fldCharType="end"/>
+            </w:r>
+          </w:hyperlink>
+        </w:p>
+        <w:p>
+          <w:pPr>
+            <w:pStyle w:val="TOC2"/>
+            <w:tabs>
+              <w:tab w:val="right" w:leader="dot" w:pos="9350"/>
+            </w:tabs>
+            <w:rPr>
+              <w:noProof/>
+            </w:rPr>
+          </w:pPr>
+          <w:hyperlink w:anchor="_Toc240886187" w:history="1">
+            <w:r>
+              <w:rPr>
+                <w:rStyle w:val="Hyperlink"/>
+                <w:b/>
+                <w:bCs/>
+                <w:noProof/>
+              </w:rPr>
+              <w:t>9.3 The three thin reports</w:t>
+            </w:r>
+            <w:r>
+              <w:rPr>
+                <w:noProof/>
+              </w:rPr>
+              <w:tab/>
+            </w:r>
+            <w:r>
+              <w:rPr>
+                <w:noProof/>
+              </w:rPr>
+              <w:fldChar w:fldCharType="begin"/>
+            </w:r>
+            <w:r>
+              <w:rPr>
+                <w:noProof/>
+              </w:rPr>
+              <w:instrText xml:space="preserve"> PAGEREF _Toc240886187 \h </w:instrText>
+            </w:r>
+            <w:r>
+              <w:rPr>
+                <w:noProof/>
+              </w:rPr>
+            </w:r>
+            <w:r>
+              <w:rPr>
+                <w:noProof/>
+              </w:rPr>
+              <w:fldChar w:fldCharType="separate"/>
+            </w:r>
+            <w:r>
+              <w:rPr>
+                <w:noProof/>
+              </w:rPr>
+              <w:t>10</w:t>
+            </w:r>
+            <w:r>
+              <w:rPr>
+                <w:noProof/>
+              </w:rPr>
+              <w:fldChar w:fldCharType="end"/>
+            </w:r>
+          </w:hyperlink>
+        </w:p>
+        <w:p>
+          <w:pPr>
+            <w:pStyle w:val="TOC2"/>
+            <w:tabs>
+              <w:tab w:val="right" w:leader="dot" w:pos="9350"/>
+            </w:tabs>
+            <w:rPr>
+              <w:noProof/>
+            </w:rPr>
+          </w:pPr>
+          <w:hyperlink w:anchor="_Toc240886188" w:history="1">
+            <w:r>
+              <w:rPr>
+                <w:rStyle w:val="Hyperlink"/>
+                <w:b/>
+                <w:bCs/>
+                <w:noProof/>
+              </w:rPr>
+              <w:t>9.4 The daily loop: save → review diff → commit → push</w:t>
+            </w:r>
+            <w:r>
+              <w:rPr>
+                <w:noProof/>
+              </w:rPr>
+              <w:tab/>
+            </w:r>
+            <w:r>
+              <w:rPr>
+                <w:noProof/>
+              </w:rPr>
+              <w:fldChar w:fldCharType="begin"/>
+            </w:r>
+            <w:r>
+              <w:rPr>
+                <w:noProof/>
+              </w:rPr>
+              <w:instrText xml:space="preserve"> PAGEREF _Toc240886188 \h </w:instrText>
+            </w:r>
+            <w:r>
+              <w:rPr>
+                <w:noProof/>
+              </w:rPr>
+            </w:r>
+            <w:r>
+              <w:rPr>
+                <w:noProof/>
+              </w:rPr>
+              <w:fldChar w:fldCharType="separate"/>
+            </w:r>
+            <w:r>
+              <w:rPr>
+                <w:noProof/>
+              </w:rPr>
+              <w:t>10</w:t>
+            </w:r>
+            <w:r>
+              <w:rPr>
+                <w:noProof/>
+              </w:rPr>
+              <w:fldChar w:fldCharType="end"/>
+            </w:r>
+          </w:hyperlink>
+        </w:p>
+        <w:p>
+          <w:pPr>
+            <w:pStyle w:val="TOC2"/>
+            <w:tabs>
+              <w:tab w:val="right" w:leader="dot" w:pos="9350"/>
+            </w:tabs>
+            <w:rPr>
+              <w:noProof/>
+            </w:rPr>
+          </w:pPr>
+          <w:hyperlink w:anchor="_Toc240886189" w:history="1">
+            <w:r>
+              <w:rPr>
+                <w:rStyle w:val="Hyperlink"/>
+                <w:b/>
+                <w:bCs/>
+                <w:noProof/>
+              </w:rPr>
+              <w:t>9.5 Branching once, so you have done it</w:t>
+            </w:r>
+            <w:r>
+              <w:rPr>
+                <w:noProof/>
+              </w:rPr>
+              <w:tab/>
+            </w:r>
+            <w:r>
+              <w:rPr>
+                <w:noProof/>
+              </w:rPr>
+              <w:fldChar w:fldCharType="begin"/>
+            </w:r>
+            <w:r>
+              <w:rPr>
+                <w:noProof/>
+              </w:rPr>
+              <w:instrText xml:space="preserve"> PAGEREF _Toc240886189 \h </w:instrText>
+            </w:r>
+            <w:r>
+              <w:rPr>
+                <w:noProof/>
+              </w:rPr>
+            </w:r>
+            <w:r>
+              <w:rPr>
+                <w:noProof/>
+              </w:rPr>
+              <w:fldChar w:fldCharType="separate"/>
+            </w:r>
+            <w:r>
+              <w:rPr>
+                <w:noProof/>
+              </w:rPr>
+              <w:t>11</w:t>
+            </w:r>
+            <w:r>
+              <w:rPr>
+                <w:noProof/>
+              </w:rPr>
+              <w:fldChar w:fldCharType="end"/>
+            </w:r>
+          </w:hyperlink>
+        </w:p>
+        <w:p>
+          <w:pPr>
+            <w:pStyle w:val="TOC1"/>
+            <w:tabs>
+              <w:tab w:val="right" w:leader="dot" w:pos="9350"/>
+            </w:tabs>
+            <w:rPr>
+              <w:noProof/>
+            </w:rPr>
+          </w:pPr>
+          <w:hyperlink w:anchor="_Toc240886190" w:history="1">
+            <w:r>
+              <w:rPr>
+                <w:rStyle w:val="Hyperlink"/>
+                <w:b/>
+                <w:bCs/>
+                <w:noProof/>
+              </w:rPr>
+              <w:t>10. Syncing Power BI to GitHub Directly — Fabric Git Integration</w:t>
+            </w:r>
+            <w:r>
+              <w:rPr>
+                <w:noProof/>
+              </w:rPr>
+              <w:tab/>
+            </w:r>
+            <w:r>
+              <w:rPr>
+                <w:noProof/>
+              </w:rPr>
+              <w:fldChar w:fldCharType="begin"/>
+            </w:r>
+            <w:r>
+              <w:rPr>
+                <w:noProof/>
+              </w:rPr>
+              <w:instrText xml:space="preserve"> PAGEREF _Toc240886190 \h </w:instrText>
+            </w:r>
+            <w:r>
+              <w:rPr>
+                <w:noProof/>
+              </w:rPr>
+            </w:r>
+            <w:r>
+              <w:rPr>
+                <w:noProof/>
+              </w:rPr>
+              <w:fldChar w:fldCharType="separate"/>
+            </w:r>
+            <w:r>
+              <w:rPr>
+                <w:noProof/>
+              </w:rPr>
+              <w:t>11</w:t>
+            </w:r>
+            <w:r>
+              <w:rPr>
+                <w:noProof/>
+              </w:rPr>
+              <w:fldChar w:fldCharType="end"/>
+            </w:r>
+          </w:hyperlink>
+        </w:p>
+        <w:p>
+          <w:pPr>
+            <w:pStyle w:val="TOC2"/>
+            <w:tabs>
+              <w:tab w:val="right" w:leader="dot" w:pos="9350"/>
+            </w:tabs>
+            <w:rPr>
+              <w:noProof/>
+            </w:rPr>
+          </w:pPr>
+          <w:hyperlink w:anchor="_Toc240886191" w:history="1">
+            <w:r>
+              <w:rPr>
+                <w:rStyle w:val="Hyperlink"/>
+                <w:b/>
+                <w:bCs/>
+                <w:noProof/>
+              </w:rPr>
+              <w:t>10.1 What it does and what it needs</w:t>
+            </w:r>
+            <w:r>
+              <w:rPr>
+                <w:noProof/>
+              </w:rPr>
+              <w:tab/>
+            </w:r>
+            <w:r>
+              <w:rPr>
+                <w:noProof/>
+              </w:rPr>
+              <w:fldChar w:fldCharType="begin"/>
+            </w:r>
+            <w:r>
+              <w:rPr>
+                <w:noProof/>
+              </w:rPr>
+              <w:instrText xml:space="preserve"> PAGEREF _Toc240886191 \h </w:instrText>
+            </w:r>
+            <w:r>
+              <w:rPr>
+                <w:noProof/>
+              </w:rPr>
+            </w:r>
+            <w:r>
+              <w:rPr>
+                <w:noProof/>
+              </w:rPr>
+              <w:fldChar w:fldCharType="separate"/>
+            </w:r>
+            <w:r>
+              <w:rPr>
+                <w:noProof/>
+              </w:rPr>
+              <w:t>11</w:t>
+            </w:r>
+            <w:r>
+              <w:rPr>
+                <w:noProof/>
+              </w:rPr>
+              <w:fldChar w:fldCharType="end"/>
+            </w:r>
+          </w:hyperlink>
+        </w:p>
+        <w:p>
+          <w:pPr>
+            <w:pStyle w:val="TOC2"/>
+            <w:tabs>
+              <w:tab w:val="right" w:leader="dot" w:pos="9350"/>
+            </w:tabs>
+            <w:rPr>
+              <w:noProof/>
+            </w:rPr>
+          </w:pPr>
+          <w:hyperlink w:anchor="_Toc240886192" w:history="1">
+            <w:r>
+              <w:rPr>
+                <w:rStyle w:val="Hyperlink"/>
+                <w:b/>
+                <w:bCs/>
+                <w:noProof/>
+              </w:rPr>
+              <w:t>10.2 How to connect a workspace</w:t>
+            </w:r>
+            <w:r>
+              <w:rPr>
+                <w:noProof/>
+              </w:rPr>
+              <w:tab/>
+            </w:r>
+            <w:r>
+              <w:rPr>
+                <w:noProof/>
+              </w:rPr>
+              <w:fldChar w:fldCharType="begin"/>
+            </w:r>
+            <w:r>
+              <w:rPr>
+                <w:noProof/>
+              </w:rPr>
+              <w:instrText xml:space="preserve"> PAGEREF _Toc240886192 \h </w:instrText>
+            </w:r>
+            <w:r>
+              <w:rPr>
+                <w:noProof/>
+              </w:rPr>
+            </w:r>
+            <w:r>
+              <w:rPr>
+                <w:noProof/>
+              </w:rPr>
+              <w:fldChar w:fldCharType="separate"/>
+            </w:r>
+            <w:r>
+              <w:rPr>
+                <w:noProof/>
+              </w:rPr>
+              <w:t>11</w:t>
+            </w:r>
+            <w:r>
+              <w:rPr>
+                <w:noProof/>
+              </w:rPr>
+              <w:fldChar w:fldCharType="end"/>
+            </w:r>
+          </w:hyperlink>
+        </w:p>
+        <w:p>
+          <w:pPr>
+            <w:pStyle w:val="TOC2"/>
+            <w:tabs>
+              <w:tab w:val="right" w:leader="dot" w:pos="9350"/>
+            </w:tabs>
+            <w:rPr>
+              <w:noProof/>
+            </w:rPr>
+          </w:pPr>
+          <w:hyperlink w:anchor="_Toc240886193" w:history="1">
+            <w:r>
+              <w:rPr>
+                <w:rStyle w:val="Hyperlink"/>
+                <w:b/>
+                <w:bCs/>
+                <w:noProof/>
+              </w:rPr>
+              <w:t>10.3 Why this guide does not use it</w:t>
+            </w:r>
+            <w:r>
+              <w:rPr>
+                <w:noProof/>
+              </w:rPr>
+              <w:tab/>
+            </w:r>
+            <w:r>
+              <w:rPr>
+                <w:noProof/>
+              </w:rPr>
+              <w:fldChar w:fldCharType="begin"/>
+            </w:r>
+            <w:r>
+              <w:rPr>
+                <w:noProof/>
+              </w:rPr>
+              <w:instrText xml:space="preserve"> PAGEREF _Toc240886193 \h </w:instrText>
+            </w:r>
+            <w:r>
+              <w:rPr>
+                <w:noProof/>
+              </w:rPr>
+            </w:r>
+            <w:r>
+              <w:rPr>
+                <w:noProof/>
+              </w:rPr>
+              <w:fldChar w:fldCharType="separate"/>
+            </w:r>
+            <w:r>
+              <w:rPr>
+                <w:noProof/>
+              </w:rPr>
+              <w:t>12</w:t>
+            </w:r>
+            <w:r>
+              <w:rPr>
+                <w:noProof/>
+              </w:rPr>
+              <w:fldChar w:fldCharType="end"/>
+            </w:r>
+          </w:hyperlink>
+        </w:p>
+        <w:p>
+          <w:pPr>
+            <w:pStyle w:val="TOC1"/>
+            <w:tabs>
+              <w:tab w:val="right" w:leader="dot" w:pos="9350"/>
+            </w:tabs>
+            <w:rPr>
+              <w:noProof/>
+            </w:rPr>
+          </w:pPr>
+          <w:hyperlink w:anchor="_Toc240886194" w:history="1">
+            <w:r>
+              <w:rPr>
+                <w:rStyle w:val="Hyperlink"/>
+                <w:b/>
+                <w:bCs/>
+                <w:noProof/>
+              </w:rPr>
+              <w:t>11. Versioning the Binaries, SQL and Screenshots</w:t>
+            </w:r>
+            <w:r>
+              <w:rPr>
+                <w:noProof/>
+              </w:rPr>
+              <w:tab/>
+            </w:r>
+            <w:r>
+              <w:rPr>
+                <w:noProof/>
+              </w:rPr>
+              <w:fldChar w:fldCharType="begin"/>
+            </w:r>
+            <w:r>
+              <w:rPr>
+                <w:noProof/>
+              </w:rPr>
+              <w:instrText xml:space="preserve"> PAGEREF _Toc240886194 \h </w:instrText>
+            </w:r>
+            <w:r>
+              <w:rPr>
+                <w:noProof/>
+              </w:rPr>
+            </w:r>
+            <w:r>
+              <w:rPr>
+                <w:noProof/>
+              </w:rPr>
+              <w:fldChar w:fldCharType="separate"/>
+            </w:r>
+            <w:r>
+              <w:rPr>
+                <w:noProof/>
+              </w:rPr>
+              <w:t>12</w:t>
+            </w:r>
+            <w:r>
+              <w:rPr>
+                <w:noProof/>
+              </w:rPr>
+              <w:fldChar w:fldCharType="end"/>
+            </w:r>
+          </w:hyperlink>
+        </w:p>
+        <w:p>
+          <w:pPr>
+            <w:pStyle w:val="TOC1"/>
+            <w:tabs>
+              <w:tab w:val="right" w:leader="dot" w:pos="9350"/>
+            </w:tabs>
+            <w:rPr>
+              <w:noProof/>
+            </w:rPr>
+          </w:pPr>
+          <w:hyperlink w:anchor="_Toc240886195" w:history="1">
+            <w:r>
+              <w:rPr>
+                <w:rStyle w:val="Hyperlink"/>
+                <w:b/>
+                <w:bCs/>
+                <w:noProof/>
+              </w:rPr>
+              <w:t>12. The Census API Key</w:t>
+            </w:r>
+            <w:r>
+              <w:rPr>
+                <w:noProof/>
+              </w:rPr>
+              <w:tab/>
+            </w:r>
+            <w:r>
+              <w:rPr>
+                <w:noProof/>
+              </w:rPr>
+              <w:fldChar w:fldCharType="begin"/>
+            </w:r>
+            <w:r>
+              <w:rPr>
+                <w:noProof/>
+              </w:rPr>
+              <w:instrText xml:space="preserve"> PAGEREF _Toc240886195 \h </w:instrText>
+            </w:r>
+            <w:r>
+              <w:rPr>
+                <w:noProof/>
+              </w:rPr>
+            </w:r>
+            <w:r>
+              <w:rPr>
+                <w:noProof/>
+              </w:rPr>
+              <w:fldChar w:fldCharType="separate"/>
+            </w:r>
+            <w:r>
+              <w:rPr>
+                <w:noProof/>
+              </w:rPr>
+              <w:t>13</w:t>
+            </w:r>
+            <w:r>
+              <w:rPr>
+                <w:noProof/>
+              </w:rPr>
+              <w:fldChar w:fldCharType="end"/>
+            </w:r>
+          </w:hyperlink>
+        </w:p>
+        <w:p>
+          <w:pPr>
+            <w:pStyle w:val="TOC1"/>
+            <w:tabs>
+              <w:tab w:val="right" w:leader="dot" w:pos="9350"/>
+            </w:tabs>
+            <w:rPr>
+              <w:noProof/>
+            </w:rPr>
+          </w:pPr>
+          <w:hyperlink w:anchor="_Toc240886196" w:history="1">
+            <w:r>
+              <w:rPr>
+                <w:rStyle w:val="Hyperlink"/>
+                <w:b/>
+                <w:bCs/>
+                <w:noProof/>
+              </w:rPr>
+              <w:t>13. README.md — the Portfolio Landing Page</w:t>
+            </w:r>
+            <w:r>
+              <w:rPr>
+                <w:noProof/>
+              </w:rPr>
+              <w:tab/>
+            </w:r>
+            <w:r>
+              <w:rPr>
+                <w:noProof/>
+              </w:rPr>
+              <w:fldChar w:fldCharType="begin"/>
+            </w:r>
+            <w:r>
+              <w:rPr>
+                <w:noProof/>
+              </w:rPr>
+              <w:instrText xml:space="preserve"> PAGEREF _Toc240886196 \h </w:instrText>
+            </w:r>
+            <w:r>
+              <w:rPr>
+                <w:noProof/>
+              </w:rPr>
+            </w:r>
+            <w:r>
+              <w:rPr>
+                <w:noProof/>
+              </w:rPr>
+              <w:fldChar w:fldCharType="separate"/>
+            </w:r>
+            <w:r>
+              <w:rPr>
+                <w:noProof/>
+              </w:rPr>
+              <w:t>13</w:t>
+            </w:r>
+            <w:r>
+              <w:rPr>
+                <w:noProof/>
+              </w:rPr>
+              <w:fldChar w:fldCharType="end"/>
+            </w:r>
+          </w:hyperlink>
+        </w:p>
+        <w:p>
+          <w:pPr>
+            <w:pStyle w:val="TOC1"/>
+            <w:tabs>
+              <w:tab w:val="right" w:leader="dot" w:pos="9350"/>
+            </w:tabs>
+            <w:rPr>
+              <w:noProof/>
+            </w:rPr>
+          </w:pPr>
+          <w:hyperlink w:anchor="_Toc240886197" w:history="1">
+            <w:r>
+              <w:rPr>
+                <w:rStyle w:val="Hyperlink"/>
+                <w:b/>
+                <w:bCs/>
+                <w:noProof/>
+              </w:rPr>
+              <w:t>14. Verification Checklist</w:t>
+            </w:r>
+            <w:r>
+              <w:rPr>
+                <w:noProof/>
+              </w:rPr>
+              <w:tab/>
+            </w:r>
+            <w:r>
+              <w:rPr>
+                <w:noProof/>
+              </w:rPr>
+              <w:fldChar w:fldCharType="begin"/>
+            </w:r>
+            <w:r>
+              <w:rPr>
+                <w:noProof/>
+              </w:rPr>
+              <w:instrText xml:space="preserve"> PAGEREF _Toc240886197 \h </w:instrText>
+            </w:r>
+            <w:r>
+              <w:rPr>
+                <w:noProof/>
+              </w:rPr>
+            </w:r>
+            <w:r>
+              <w:rPr>
+                <w:noProof/>
+              </w:rPr>
+              <w:fldChar w:fldCharType="separate"/>
+            </w:r>
+            <w:r>
+              <w:rPr>
+                <w:noProof/>
+              </w:rPr>
+              <w:t>14</w:t>
+            </w:r>
+            <w:r>
+              <w:rPr>
+                <w:noProof/>
+              </w:rPr>
+              <w:fldChar w:fldCharType="end"/>
+            </w:r>
+          </w:hyperlink>
+        </w:p>
+        <w:p>
+          <w:pPr>
+            <w:pStyle w:val="TOC1"/>
+            <w:tabs>
+              <w:tab w:val="right" w:leader="dot" w:pos="9350"/>
+            </w:tabs>
+            <w:rPr>
+              <w:noProof/>
+            </w:rPr>
+          </w:pPr>
+          <w:hyperlink w:anchor="_Toc240886198" w:history="1">
+            <w:r>
+              <w:rPr>
+                <w:rStyle w:val="Hyperlink"/>
+                <w:b/>
+                <w:bCs/>
+                <w:noProof/>
+              </w:rPr>
+              <w:t>15. References</w:t>
+            </w:r>
+            <w:r>
+              <w:rPr>
+                <w:noProof/>
+              </w:rPr>
+              <w:tab/>
+            </w:r>
+            <w:r>
+              <w:rPr>
+                <w:noProof/>
+              </w:rPr>
+              <w:fldChar w:fldCharType="begin"/>
+            </w:r>
+            <w:r>
+              <w:rPr>
+                <w:noProof/>
+              </w:rPr>
+              <w:instrText xml:space="preserve"> PAGEREF _Toc240886198 \h </w:instrText>
+            </w:r>
+            <w:r>
+              <w:rPr>
+                <w:noProof/>
+              </w:rPr>
+            </w:r>
+            <w:r>
+              <w:rPr>
+                <w:noProof/>
+              </w:rPr>
+              <w:fldChar w:fldCharType="separate"/>
+            </w:r>
+            <w:r>
+              <w:rPr>
+                <w:noProof/>
+              </w:rPr>
+              <w:t>14</w:t>
+            </w:r>
+            <w:r>
+              <w:rPr>
+                <w:noProof/>
+              </w:rPr>
+              <w:fldChar w:fldCharType="end"/>
+            </w:r>
+          </w:hyperlink>
+        </w:p>
+        <w:p>
+          <w:pPr>
+            <w:pStyle w:val="TOC1"/>
+            <w:tabs>
+              <w:tab w:val="right" w:leader="dot" w:pos="9350"/>
+            </w:tabs>
+            <w:rPr>
+              <w:noProof/>
+            </w:rPr>
+          </w:pPr>
+          <w:hyperlink w:anchor="_Toc240886199" w:history="1">
+            <w:r>
+              <w:rPr>
+                <w:rStyle w:val="Hyperlink"/>
+                <w:b/>
+                <w:bCs/>
+                <w:noProof/>
+              </w:rPr>
+              <w:t>Appendix A — CONTRIBUTING.md</w:t>
+            </w:r>
+            <w:r>
+              <w:rPr>
+                <w:noProof/>
+              </w:rPr>
+              <w:tab/>
+            </w:r>
+            <w:r>
+              <w:rPr>
+                <w:noProof/>
+              </w:rPr>
+              <w:fldChar w:fldCharType="begin"/>
+            </w:r>
+            <w:r>
+              <w:rPr>
+                <w:noProof/>
+              </w:rPr>
+              <w:instrText xml:space="preserve"> PAGEREF _Toc240886199 \h </w:instrText>
+            </w:r>
+            <w:r>
+              <w:rPr>
+                <w:noProof/>
+              </w:rPr>
+            </w:r>
+            <w:r>
+              <w:rPr>
+                <w:noProof/>
+              </w:rPr>
+              <w:fldChar w:fldCharType="separate"/>
+            </w:r>
+            <w:r>
+              <w:rPr>
+                <w:noProof/>
+              </w:rPr>
+              <w:t>15</w:t>
+            </w:r>
+            <w:r>
+              <w:rPr>
+                <w:noProof/>
+              </w:rPr>
+              <w:fldChar w:fldCharType="end"/>
+            </w:r>
+          </w:hyperlink>
+        </w:p>
+        <w:p>
+          <w:pPr>
+            <w:pStyle w:val="TOC1"/>
+            <w:tabs>
+              <w:tab w:val="right" w:leader="dot" w:pos="9350"/>
+            </w:tabs>
+            <w:rPr>
+              <w:noProof/>
+            </w:rPr>
+          </w:pPr>
+          <w:hyperlink w:anchor="_Toc240886200" w:history="1">
+            <w:r>
+              <w:rPr>
+                <w:rStyle w:val="Hyperlink"/>
+                <w:b/>
+                <w:bCs/>
+                <w:noProof/>
+              </w:rPr>
+              <w:t>Appendix B — Artifact Placement Inventory</w:t>
+            </w:r>
+            <w:r>
+              <w:rPr>
+                <w:noProof/>
+              </w:rPr>
+              <w:tab/>
+            </w:r>
+            <w:r>
+              <w:rPr>
+                <w:noProof/>
+              </w:rPr>
+              <w:fldChar w:fldCharType="begin"/>
+            </w:r>
+            <w:r>
+              <w:rPr>
+                <w:noProof/>
+              </w:rPr>
+              <w:instrText xml:space="preserve"> PAGEREF _Toc240886200 \h </w:instrText>
+            </w:r>
+            <w:r>
+              <w:rPr>
+                <w:noProof/>
+              </w:rPr>
+            </w:r>
+            <w:r>
+              <w:rPr>
+                <w:noProof/>
+              </w:rPr>
+              <w:fldChar w:fldCharType="separate"/>
+            </w:r>
+            <w:r>
+              <w:rPr>
+                <w:noProof/>
+              </w:rPr>
+              <w:t>15</w:t>
+            </w:r>
+            <w:r>
+              <w:rPr>
+                <w:noProof/>
+              </w:rPr>
+              <w:fldChar w:fldCharType="end"/>
+            </w:r>
+          </w:hyperlink>
+        </w:p>
+        <w:p>
+          <w:pPr>
+            <w:pStyle w:val="TOC1"/>
+            <w:tabs>
+              <w:tab w:val="right" w:leader="dot" w:pos="9350"/>
+            </w:tabs>
+            <w:rPr>
+              <w:noProof/>
+            </w:rPr>
+          </w:pPr>
+          <w:hyperlink w:anchor="_Toc240886201" w:history="1">
+            <w:r>
+              <w:rPr>
+                <w:rStyle w:val="Hyperlink"/>
+                <w:b/>
+                <w:bCs/>
+                <w:noProof/>
+              </w:rPr>
+              <w:t>Appendix C — Folder README Files</w:t>
+            </w:r>
+            <w:r>
+              <w:rPr>
+                <w:noProof/>
+              </w:rPr>
+              <w:tab/>
+            </w:r>
+            <w:r>
+              <w:rPr>
+                <w:noProof/>
+              </w:rPr>
+              <w:fldChar w:fldCharType="begin"/>
+            </w:r>
+            <w:r>
+              <w:rPr>
+                <w:noProof/>
+              </w:rPr>
+              <w:instrText xml:space="preserve"> PAGEREF _Toc240886201 \h </w:instrText>
+            </w:r>
+            <w:r>
+              <w:rPr>
+                <w:noProof/>
+              </w:rPr>
+            </w:r>
+            <w:r>
+              <w:rPr>
+                <w:noProof/>
+              </w:rPr>
+              <w:fldChar w:fldCharType="separate"/>
+            </w:r>
+            <w:r>
+              <w:rPr>
+                <w:noProof/>
+              </w:rPr>
+              <w:t>17</w:t>
+            </w:r>
+            <w:r>
+              <w:rPr>
+                <w:noProof/>
+              </w:rPr>
+              <w:fldChar w:fldCharType="end"/>
+            </w:r>
+          </w:hyperlink>
+        </w:p>
+        <w:p>
+          <w:pPr>
+            <w:pStyle w:val="TOC2"/>
+            <w:tabs>
+              <w:tab w:val="right" w:leader="dot" w:pos="9350"/>
+            </w:tabs>
+            <w:rPr>
+              <w:noProof/>
+            </w:rPr>
+          </w:pPr>
+          <w:hyperlink w:anchor="_Toc240886202" w:history="1">
+            <w:r>
+              <w:rPr>
+                <w:rStyle w:val="Hyperlink"/>
+                <w:b/>
+                <w:bCs/>
+                <w:noProof/>
+              </w:rPr>
+              <w:t>C.1 docs/README.md</w:t>
+            </w:r>
+            <w:r>
+              <w:rPr>
+                <w:noProof/>
+              </w:rPr>
+              <w:tab/>
+            </w:r>
+            <w:r>
+              <w:rPr>
+                <w:noProof/>
+              </w:rPr>
+              <w:fldChar w:fldCharType="begin"/>
+            </w:r>
+            <w:r>
+              <w:rPr>
+                <w:noProof/>
+              </w:rPr>
+              <w:instrText xml:space="preserve"> PAGEREF _Toc240886202 \h </w:instrText>
+            </w:r>
+            <w:r>
+              <w:rPr>
+                <w:noProof/>
+              </w:rPr>
+            </w:r>
+            <w:r>
+              <w:rPr>
+                <w:noProof/>
+              </w:rPr>
+              <w:fldChar w:fldCharType="separate"/>
+            </w:r>
+            <w:r>
+              <w:rPr>
+                <w:noProof/>
+              </w:rPr>
+              <w:t>17</w:t>
+            </w:r>
+            <w:r>
+              <w:rPr>
+                <w:noProof/>
+              </w:rPr>
+              <w:fldChar w:fldCharType="end"/>
+            </w:r>
+          </w:hyperlink>
+        </w:p>
+        <w:p>
+          <w:pPr>
+            <w:pStyle w:val="TOC2"/>
+            <w:tabs>
+              <w:tab w:val="right" w:leader="dot" w:pos="9350"/>
+            </w:tabs>
+            <w:rPr>
+              <w:noProof/>
+            </w:rPr>
+          </w:pPr>
+          <w:hyperlink w:anchor="_Toc240886203" w:history="1">
+            <w:r>
+              <w:rPr>
+                <w:rStyle w:val="Hyperlink"/>
+                <w:b/>
+                <w:bCs/>
+                <w:noProof/>
+              </w:rPr>
+              <w:t>C.2 sql/README.md</w:t>
+            </w:r>
+            <w:r>
+              <w:rPr>
+                <w:noProof/>
+              </w:rPr>
+              <w:tab/>
+            </w:r>
+            <w:r>
+              <w:rPr>
+                <w:noProof/>
+              </w:rPr>
+              <w:fldChar w:fldCharType="begin"/>
+            </w:r>
+            <w:r>
+              <w:rPr>
+                <w:noProof/>
+              </w:rPr>
+              <w:instrText xml:space="preserve"> PAGEREF _Toc240886203 \h </w:instrText>
+            </w:r>
+            <w:r>
+              <w:rPr>
+                <w:noProof/>
+              </w:rPr>
+            </w:r>
+            <w:r>
+              <w:rPr>
+                <w:noProof/>
+              </w:rPr>
+              <w:fldChar w:fldCharType="separate"/>
+            </w:r>
+            <w:r>
+              <w:rPr>
+                <w:noProof/>
+              </w:rPr>
+              <w:t>17</w:t>
+            </w:r>
+            <w:r>
+              <w:rPr>
+                <w:noProof/>
+              </w:rPr>
+              <w:fldChar w:fldCharType="end"/>
+            </w:r>
+          </w:hyperlink>
+        </w:p>
+        <w:p>
+          <w:pPr>
+            <w:pStyle w:val="TOC2"/>
+            <w:tabs>
+              <w:tab w:val="right" w:leader="dot" w:pos="9350"/>
+            </w:tabs>
+            <w:rPr>
+              <w:noProof/>
+            </w:rPr>
+          </w:pPr>
+          <w:hyperlink w:anchor="_Toc240886204" w:history="1">
+            <w:r>
+              <w:rPr>
+                <w:rStyle w:val="Hyperlink"/>
+                <w:b/>
+                <w:bCs/>
+                <w:noProof/>
+              </w:rPr>
+              <w:t>C.3 powerquery/README.md</w:t>
+            </w:r>
+            <w:r>
+              <w:rPr>
+                <w:noProof/>
+              </w:rPr>
+              <w:tab/>
+            </w:r>
+            <w:r>
+              <w:rPr>
+                <w:noProof/>
+              </w:rPr>
+              <w:fldChar w:fldCharType="begin"/>
+            </w:r>
+            <w:r>
+              <w:rPr>
+                <w:noProof/>
+              </w:rPr>
+              <w:instrText xml:space="preserve"> PAGEREF _Toc240886204 \h </w:instrText>
+            </w:r>
+            <w:r>
+              <w:rPr>
+                <w:noProof/>
+              </w:rPr>
+            </w:r>
+            <w:r>
+              <w:rPr>
+                <w:noProof/>
+              </w:rPr>
+              <w:fldChar w:fldCharType="separate"/>
+            </w:r>
+            <w:r>
+              <w:rPr>
+                <w:noProof/>
+              </w:rPr>
+              <w:t>18</w:t>
+            </w:r>
+            <w:r>
+              <w:rPr>
+                <w:noProof/>
+              </w:rPr>
+              <w:fldChar w:fldCharType="end"/>
+            </w:r>
+          </w:hyperlink>
+        </w:p>
+        <w:p>
+          <w:pPr>
+            <w:pStyle w:val="TOC2"/>
+            <w:tabs>
+              <w:tab w:val="right" w:leader="dot" w:pos="9350"/>
+            </w:tabs>
+            <w:rPr>
+              <w:noProof/>
+            </w:rPr>
+          </w:pPr>
+          <w:hyperlink w:anchor="_Toc240886205" w:history="1">
+            <w:r>
+              <w:rPr>
+                <w:rStyle w:val="Hyperlink"/>
+                <w:b/>
+                <w:bCs/>
+                <w:noProof/>
+              </w:rPr>
+              <w:t>C.4 dax/README.md</w:t>
+            </w:r>
+            <w:r>
+              <w:rPr>
+                <w:noProof/>
+              </w:rPr>
+              <w:tab/>
+            </w:r>
+            <w:r>
+              <w:rPr>
+                <w:noProof/>
+              </w:rPr>
+              <w:fldChar w:fldCharType="begin"/>
+            </w:r>
+            <w:r>
+              <w:rPr>
+                <w:noProof/>
+              </w:rPr>
+              <w:instrText xml:space="preserve"> PAGEREF _Toc240886205 \h </w:instrText>
+            </w:r>
+            <w:r>
+              <w:rPr>
+                <w:noProof/>
+              </w:rPr>
+            </w:r>
+            <w:r>
+              <w:rPr>
+                <w:noProof/>
+              </w:rPr>
+              <w:fldChar w:fldCharType="separate"/>
+            </w:r>
+            <w:r>
+              <w:rPr>
+                <w:noProof/>
+              </w:rPr>
+              <w:t>18</w:t>
+            </w:r>
+            <w:r>
+              <w:rPr>
+                <w:noProof/>
+              </w:rPr>
+              <w:fldChar w:fldCharType="end"/>
+            </w:r>
+          </w:hyperlink>
+        </w:p>
+        <w:p>
+          <w:pPr>
+            <w:pStyle w:val="TOC2"/>
+            <w:tabs>
+              <w:tab w:val="right" w:leader="dot" w:pos="9350"/>
+            </w:tabs>
+            <w:rPr>
+              <w:noProof/>
+            </w:rPr>
+          </w:pPr>
+          <w:hyperlink w:anchor="_Toc240886206" w:history="1">
+            <w:r>
+              <w:rPr>
+                <w:rStyle w:val="Hyperlink"/>
+                <w:b/>
+                <w:bCs/>
+                <w:noProof/>
+              </w:rPr>
+              <w:t>C.5 pbip/README.md</w:t>
+            </w:r>
+            <w:r>
+              <w:rPr>
+                <w:noProof/>
+              </w:rPr>
+              <w:tab/>
+            </w:r>
+            <w:r>
+              <w:rPr>
+                <w:noProof/>
+              </w:rPr>
+              <w:fldChar w:fldCharType="begin"/>
+            </w:r>
+            <w:r>
+              <w:rPr>
+                <w:noProof/>
+              </w:rPr>
+              <w:instrText xml:space="preserve"> PAGEREF _Toc240886206 \h </w:instrText>
+            </w:r>
+            <w:r>
+              <w:rPr>
+                <w:noProof/>
+              </w:rPr>
+            </w:r>
+            <w:r>
+              <w:rPr>
+                <w:noProof/>
+              </w:rPr>
+              <w:fldChar w:fldCharType="separate"/>
+            </w:r>
+            <w:r>
+              <w:rPr>
+                <w:noProof/>
+              </w:rPr>
+              <w:t>19</w:t>
+            </w:r>
+            <w:r>
+              <w:rPr>
+                <w:noProof/>
+              </w:rPr>
+              <w:fldChar w:fldCharType="end"/>
+            </w:r>
+          </w:hyperlink>
+        </w:p>
+        <w:p>
+          <w:pPr>
+            <w:pStyle w:val="TOC2"/>
+            <w:tabs>
+              <w:tab w:val="right" w:leader="dot" w:pos="9350"/>
+            </w:tabs>
+            <w:rPr>
+              <w:noProof/>
+            </w:rPr>
+          </w:pPr>
+          <w:hyperlink w:anchor="_Toc240886207" w:history="1">
+            <w:r>
+              <w:rPr>
+                <w:rStyle w:val="Hyperlink"/>
+                <w:b/>
+                <w:bCs/>
+                <w:noProof/>
+              </w:rPr>
+              <w:t>C.6 pbix/README.md</w:t>
+            </w:r>
+            <w:r>
+              <w:rPr>
+                <w:noProof/>
+              </w:rPr>
+              <w:tab/>
+            </w:r>
+            <w:r>
+              <w:rPr>
+                <w:noProof/>
+              </w:rPr>
+              <w:fldChar w:fldCharType="begin"/>
+            </w:r>
+            <w:r>
+              <w:rPr>
+                <w:noProof/>
+              </w:rPr>
+              <w:instrText xml:space="preserve"> PAGEREF _Toc240886207 \h </w:instrText>
+            </w:r>
+            <w:r>
+              <w:rPr>
+                <w:noProof/>
+              </w:rPr>
+            </w:r>
+            <w:r>
+              <w:rPr>
+                <w:noProof/>
+              </w:rPr>
+              <w:fldChar w:fldCharType="separate"/>
+            </w:r>
+            <w:r>
+              <w:rPr>
+                <w:noProof/>
+              </w:rPr>
+              <w:t>19</w:t>
+            </w:r>
+            <w:r>
+              <w:rPr>
+                <w:noProof/>
+              </w:rPr>
+              <w:fldChar w:fldCharType="end"/>
+            </w:r>
+          </w:hyperlink>
+        </w:p>
+        <w:p>
+          <w:pPr>
+            <w:pStyle w:val="TOC2"/>
+            <w:tabs>
+              <w:tab w:val="right" w:leader="dot" w:pos="9350"/>
+            </w:tabs>
+            <w:rPr>
+              <w:noProof/>
+            </w:rPr>
+          </w:pPr>
+          <w:hyperlink w:anchor="_Toc240886208" w:history="1">
+            <w:r>
+              <w:rPr>
+                <w:rStyle w:val="Hyperlink"/>
+                <w:b/>
+                <w:bCs/>
+                <w:noProof/>
+              </w:rPr>
+              <w:t>C.7 reference/README.md</w:t>
+            </w:r>
+            <w:r>
+              <w:rPr>
+                <w:noProof/>
+              </w:rPr>
+              <w:tab/>
+            </w:r>
+            <w:r>
+              <w:rPr>
+                <w:noProof/>
+              </w:rPr>
+              <w:fldChar w:fldCharType="begin"/>
+            </w:r>
+            <w:r>
+              <w:rPr>
+                <w:noProof/>
+              </w:rPr>
+              <w:instrText xml:space="preserve"> PAGEREF _Toc240886208 \h </w:instrText>
+            </w:r>
+            <w:r>
+              <w:rPr>
+                <w:noProof/>
+              </w:rPr>
+            </w:r>
+            <w:r>
+              <w:rPr>
+                <w:noProof/>
+              </w:rPr>
+              <w:fldChar w:fldCharType="separate"/>
+            </w:r>
+            <w:r>
+              <w:rPr>
+                <w:noProof/>
+              </w:rPr>
+              <w:t>20</w:t>
+            </w:r>
+            <w:r>
+              <w:rPr>
+                <w:noProof/>
+              </w:rPr>
+              <w:fldChar w:fldCharType="end"/>
+            </w:r>
+          </w:hyperlink>
+        </w:p>
+        <w:p>
+          <w:pPr>
+            <w:pStyle w:val="TOC2"/>
+            <w:tabs>
+              <w:tab w:val="right" w:leader="dot" w:pos="9350"/>
+            </w:tabs>
+            <w:rPr>
+              <w:noProof/>
+            </w:rPr>
+          </w:pPr>
+          <w:hyperlink w:anchor="_Toc240886209" w:history="1">
+            <w:r>
+              <w:rPr>
+                <w:rStyle w:val="Hyperlink"/>
+                <w:b/>
+                <w:bCs/>
+                <w:noProof/>
+              </w:rPr>
+              <w:t>C.8 theme/README.md</w:t>
+            </w:r>
+            <w:r>
+              <w:rPr>
+                <w:noProof/>
+              </w:rPr>
+              <w:tab/>
+            </w:r>
+            <w:r>
+              <w:rPr>
+                <w:noProof/>
+              </w:rPr>
+              <w:fldChar w:fldCharType="begin"/>
+            </w:r>
+            <w:r>
+              <w:rPr>
+                <w:noProof/>
+              </w:rPr>
+              <w:instrText xml:space="preserve"> PAGEREF _Toc240886209 \h </w:instrText>
+            </w:r>
+            <w:r>
+              <w:rPr>
+                <w:noProof/>
+              </w:rPr>
+            </w:r>
+            <w:r>
+              <w:rPr>
+                <w:noProof/>
+              </w:rPr>
+              <w:fldChar w:fldCharType="separate"/>
+            </w:r>
+            <w:r>
+              <w:rPr>
+                <w:noProof/>
+              </w:rPr>
+              <w:t>20</w:t>
+            </w:r>
+            <w:r>
+              <w:rPr>
+                <w:noProof/>
+              </w:rPr>
+              <w:fldChar w:fldCharType="end"/>
+            </w:r>
+          </w:hyperlink>
+        </w:p>
+        <w:p>
+          <w:pPr>
+            <w:pStyle w:val="TOC2"/>
+            <w:tabs>
+              <w:tab w:val="right" w:leader="dot" w:pos="9350"/>
+            </w:tabs>
+            <w:rPr>
+              <w:noProof/>
+            </w:rPr>
+          </w:pPr>
+          <w:hyperlink w:anchor="_Toc240886210" w:history="1">
+            <w:r>
+              <w:rPr>
+                <w:rStyle w:val="Hyperlink"/>
+                <w:b/>
+                <w:bCs/>
+                <w:noProof/>
+              </w:rPr>
+              <w:t>C.9 assets/README.md</w:t>
+            </w:r>
+            <w:r>
+              <w:rPr>
+                <w:noProof/>
+              </w:rPr>
+              <w:tab/>
+            </w:r>
+            <w:r>
+              <w:rPr>
+                <w:noProof/>
+              </w:rPr>
+              <w:fldChar w:fldCharType="begin"/>
+            </w:r>
+            <w:r>
+              <w:rPr>
+                <w:noProof/>
+              </w:rPr>
+              <w:instrText xml:space="preserve"> PAGEREF _Toc240886210 \h </w:instrText>
+            </w:r>
+            <w:r>
+              <w:rPr>
+                <w:noProof/>
+              </w:rPr>
+            </w:r>
+            <w:r>
+              <w:rPr>
+                <w:noProof/>
+              </w:rPr>
+              <w:fldChar w:fldCharType="separate"/>
+            </w:r>
+            <w:r>
+              <w:rPr>
+                <w:noProof/>
+              </w:rPr>
+              <w:t>21</w:t>
+            </w:r>
+            <w:r>
+              <w:rPr>
+                <w:noProof/>
+              </w:rPr>
+              <w:fldChar w:fldCharType="end"/>
+            </w:r>
+          </w:hyperlink>
+        </w:p>
+        <w:p>
+          <w:pPr>
+            <w:pStyle w:val="TOC1"/>
+            <w:tabs>
+              <w:tab w:val="right" w:leader="dot" w:pos="9350"/>
+            </w:tabs>
+            <w:rPr>
+              <w:noProof/>
+            </w:rPr>
+          </w:pPr>
+          <w:hyperlink w:anchor="_Toc240886211" w:history="1">
+            <w:r>
+              <w:rPr>
+                <w:rStyle w:val="Hyperlink"/>
+                <w:b/>
+                <w:bCs/>
+                <w:noProof/>
+              </w:rPr>
+              <w:t>AI Assistance Disclosure</w:t>
+            </w:r>
+            <w:r>
+              <w:rPr>
+                <w:noProof/>
+              </w:rPr>
+              <w:tab/>
+            </w:r>
+            <w:r>
+              <w:rPr>
+                <w:noProof/>
+              </w:rPr>
+              <w:fldChar w:fldCharType="begin"/>
+            </w:r>
+            <w:r>
+              <w:rPr>
+                <w:noProof/>
+              </w:rPr>
+              <w:instrText xml:space="preserve"> PAGEREF _Toc240886211 \h </w:instrText>
+            </w:r>
+            <w:r>
+              <w:rPr>
+                <w:noProof/>
+              </w:rPr>
+            </w:r>
+            <w:r>
+              <w:rPr>
+                <w:noProof/>
+              </w:rPr>
+              <w:fldChar w:fldCharType="separate"/>
+            </w:r>
+            <w:r>
+              <w:rPr>
+                <w:noProof/>
+              </w:rPr>
+              <w:t>22</w:t>
+            </w:r>
+            <w:r>
+              <w:rPr>
+                <w:noProof/>
+              </w:rPr>
+              <w:fldChar w:fldCharType="end"/>
+            </w:r>
+          </w:hyperlink>
         </w:p>
         <w:p>
           <w:r>
@@ -214,6 +3110,7 @@
         <w:pStyle w:val="Heading1"/>
         <w:spacing w:before="360" w:after="160"/>
       </w:pPr>
+      <w:bookmarkStart w:id="0" w:name="_Toc240886166"/>
       <w:r>
         <w:rPr>
           <w:b/>
@@ -225,6 +3122,7 @@
         <w:lastRenderedPageBreak/>
         <w:t>1. Purpose</w:t>
       </w:r>
+      <w:bookmarkEnd w:id="0"/>
     </w:p>
     <w:p>
       <w:pPr>
@@ -294,12 +3192,6 @@
         <w:gridCol w:w="9360"/>
       </w:tblGrid>
       <w:tr>
-        <w:tblPrEx>
-          <w:tblCellMar>
-            <w:top w:w="0" w:type="dxa"/>
-            <w:bottom w:w="0" w:type="dxa"/>
-          </w:tblCellMar>
-        </w:tblPrEx>
         <w:tc>
           <w:tcPr>
             <w:tcW w:w="9360" w:type="dxa"/>
@@ -372,6 +3264,7 @@
         <w:pStyle w:val="Heading1"/>
         <w:spacing w:before="360" w:after="160"/>
       </w:pPr>
+      <w:bookmarkStart w:id="1" w:name="_Toc240886167"/>
       <w:r>
         <w:rPr>
           <w:b/>
@@ -382,6 +3275,7 @@
         </w:rPr>
         <w:t>2. Concepts in Plain Language</w:t>
       </w:r>
+      <w:bookmarkEnd w:id="1"/>
     </w:p>
     <w:p>
       <w:pPr>
@@ -413,12 +3307,6 @@
         <w:gridCol w:w="7114"/>
       </w:tblGrid>
       <w:tr>
-        <w:tblPrEx>
-          <w:tblCellMar>
-            <w:top w:w="0" w:type="dxa"/>
-            <w:bottom w:w="0" w:type="dxa"/>
-          </w:tblCellMar>
-        </w:tblPrEx>
         <w:trPr>
           <w:tblHeader/>
         </w:trPr>
@@ -470,12 +3358,6 @@
         </w:tc>
       </w:tr>
       <w:tr>
-        <w:tblPrEx>
-          <w:tblCellMar>
-            <w:top w:w="0" w:type="dxa"/>
-            <w:bottom w:w="0" w:type="dxa"/>
-          </w:tblCellMar>
-        </w:tblPrEx>
         <w:trPr>
           <w:cantSplit/>
         </w:trPr>
@@ -521,12 +3403,6 @@
         </w:tc>
       </w:tr>
       <w:tr>
-        <w:tblPrEx>
-          <w:tblCellMar>
-            <w:top w:w="0" w:type="dxa"/>
-            <w:bottom w:w="0" w:type="dxa"/>
-          </w:tblCellMar>
-        </w:tblPrEx>
         <w:trPr>
           <w:cantSplit/>
         </w:trPr>
@@ -572,12 +3448,6 @@
         </w:tc>
       </w:tr>
       <w:tr>
-        <w:tblPrEx>
-          <w:tblCellMar>
-            <w:top w:w="0" w:type="dxa"/>
-            <w:bottom w:w="0" w:type="dxa"/>
-          </w:tblCellMar>
-        </w:tblPrEx>
         <w:trPr>
           <w:cantSplit/>
         </w:trPr>
@@ -623,12 +3493,6 @@
         </w:tc>
       </w:tr>
       <w:tr>
-        <w:tblPrEx>
-          <w:tblCellMar>
-            <w:top w:w="0" w:type="dxa"/>
-            <w:bottom w:w="0" w:type="dxa"/>
-          </w:tblCellMar>
-        </w:tblPrEx>
         <w:trPr>
           <w:cantSplit/>
         </w:trPr>
@@ -674,12 +3538,6 @@
         </w:tc>
       </w:tr>
       <w:tr>
-        <w:tblPrEx>
-          <w:tblCellMar>
-            <w:top w:w="0" w:type="dxa"/>
-            <w:bottom w:w="0" w:type="dxa"/>
-          </w:tblCellMar>
-        </w:tblPrEx>
         <w:trPr>
           <w:cantSplit/>
         </w:trPr>
@@ -725,12 +3583,6 @@
         </w:tc>
       </w:tr>
       <w:tr>
-        <w:tblPrEx>
-          <w:tblCellMar>
-            <w:top w:w="0" w:type="dxa"/>
-            <w:bottom w:w="0" w:type="dxa"/>
-          </w:tblCellMar>
-        </w:tblPrEx>
         <w:trPr>
           <w:cantSplit/>
         </w:trPr>
@@ -776,12 +3628,6 @@
         </w:tc>
       </w:tr>
       <w:tr>
-        <w:tblPrEx>
-          <w:tblCellMar>
-            <w:top w:w="0" w:type="dxa"/>
-            <w:bottom w:w="0" w:type="dxa"/>
-          </w:tblCellMar>
-        </w:tblPrEx>
         <w:trPr>
           <w:cantSplit/>
         </w:trPr>
@@ -827,12 +3673,6 @@
         </w:tc>
       </w:tr>
       <w:tr>
-        <w:tblPrEx>
-          <w:tblCellMar>
-            <w:top w:w="0" w:type="dxa"/>
-            <w:bottom w:w="0" w:type="dxa"/>
-          </w:tblCellMar>
-        </w:tblPrEx>
         <w:trPr>
           <w:cantSplit/>
         </w:trPr>
@@ -878,12 +3718,6 @@
         </w:tc>
       </w:tr>
       <w:tr>
-        <w:tblPrEx>
-          <w:tblCellMar>
-            <w:top w:w="0" w:type="dxa"/>
-            <w:bottom w:w="0" w:type="dxa"/>
-          </w:tblCellMar>
-        </w:tblPrEx>
         <w:trPr>
           <w:cantSplit/>
         </w:trPr>
@@ -929,12 +3763,6 @@
         </w:tc>
       </w:tr>
       <w:tr>
-        <w:tblPrEx>
-          <w:tblCellMar>
-            <w:top w:w="0" w:type="dxa"/>
-            <w:bottom w:w="0" w:type="dxa"/>
-          </w:tblCellMar>
-        </w:tblPrEx>
         <w:trPr>
           <w:cantSplit/>
         </w:trPr>
@@ -992,12 +3820,6 @@
         </w:tc>
       </w:tr>
       <w:tr>
-        <w:tblPrEx>
-          <w:tblCellMar>
-            <w:top w:w="0" w:type="dxa"/>
-            <w:bottom w:w="0" w:type="dxa"/>
-          </w:tblCellMar>
-        </w:tblPrEx>
         <w:trPr>
           <w:cantSplit/>
         </w:trPr>
@@ -1043,12 +3865,6 @@
         </w:tc>
       </w:tr>
       <w:tr>
-        <w:tblPrEx>
-          <w:tblCellMar>
-            <w:top w:w="0" w:type="dxa"/>
-            <w:bottom w:w="0" w:type="dxa"/>
-          </w:tblCellMar>
-        </w:tblPrEx>
         <w:trPr>
           <w:cantSplit/>
         </w:trPr>
@@ -1115,6 +3931,7 @@
         <w:pStyle w:val="Heading1"/>
         <w:spacing w:before="360" w:after="160"/>
       </w:pPr>
+      <w:bookmarkStart w:id="2" w:name="_Toc240886168"/>
       <w:r>
         <w:rPr>
           <w:b/>
@@ -1125,12 +3942,14 @@
         </w:rPr>
         <w:t>3. Repository Design</w:t>
       </w:r>
+      <w:bookmarkEnd w:id="2"/>
     </w:p>
     <w:p>
       <w:pPr>
         <w:pStyle w:val="Heading2"/>
         <w:spacing w:before="280" w:after="120"/>
       </w:pPr>
+      <w:bookmarkStart w:id="3" w:name="_Toc240886169"/>
       <w:r>
         <w:rPr>
           <w:b/>
@@ -1141,6 +3960,7 @@
         </w:rPr>
         <w:t>3.1 Structure (single repository)</w:t>
       </w:r>
+      <w:bookmarkEnd w:id="3"/>
     </w:p>
     <w:p>
       <w:pPr>
@@ -2149,6 +4969,7 @@
         <w:pStyle w:val="Heading2"/>
         <w:spacing w:before="280" w:after="120"/>
       </w:pPr>
+      <w:bookmarkStart w:id="4" w:name="_Toc240886170"/>
       <w:r>
         <w:rPr>
           <w:b/>
@@ -2160,6 +4981,7 @@
         <w:lastRenderedPageBreak/>
         <w:t>3.2 Visibility: public</w:t>
       </w:r>
+      <w:bookmarkEnd w:id="4"/>
     </w:p>
     <w:p>
       <w:pPr>
@@ -2174,6 +4996,7 @@
         <w:pStyle w:val="Heading2"/>
         <w:spacing w:before="280" w:after="120"/>
       </w:pPr>
+      <w:bookmarkStart w:id="5" w:name="_Toc240886171"/>
       <w:r>
         <w:rPr>
           <w:b/>
@@ -2184,6 +5007,7 @@
         </w:rPr>
         <w:t>3.3 Four Power BI Files, Two Serializations</w:t>
       </w:r>
+      <w:bookmarkEnd w:id="5"/>
     </w:p>
     <w:p>
       <w:pPr>
@@ -2224,12 +5048,6 @@
         <w:gridCol w:w="4680"/>
       </w:tblGrid>
       <w:tr>
-        <w:tblPrEx>
-          <w:tblCellMar>
-            <w:top w:w="0" w:type="dxa"/>
-            <w:bottom w:w="0" w:type="dxa"/>
-          </w:tblCellMar>
-        </w:tblPrEx>
         <w:trPr>
           <w:tblHeader/>
         </w:trPr>
@@ -2304,12 +5122,6 @@
         </w:tc>
       </w:tr>
       <w:tr>
-        <w:tblPrEx>
-          <w:tblCellMar>
-            <w:top w:w="0" w:type="dxa"/>
-            <w:bottom w:w="0" w:type="dxa"/>
-          </w:tblCellMar>
-        </w:tblPrEx>
         <w:trPr>
           <w:cantSplit/>
         </w:trPr>
@@ -2411,12 +5223,6 @@
         </w:tc>
       </w:tr>
       <w:tr>
-        <w:tblPrEx>
-          <w:tblCellMar>
-            <w:top w:w="0" w:type="dxa"/>
-            <w:bottom w:w="0" w:type="dxa"/>
-          </w:tblCellMar>
-        </w:tblPrEx>
         <w:trPr>
           <w:cantSplit/>
         </w:trPr>
@@ -2491,12 +5297,6 @@
         </w:tc>
       </w:tr>
       <w:tr>
-        <w:tblPrEx>
-          <w:tblCellMar>
-            <w:top w:w="0" w:type="dxa"/>
-            <w:bottom w:w="0" w:type="dxa"/>
-          </w:tblCellMar>
-        </w:tblPrEx>
         <w:trPr>
           <w:cantSplit/>
         </w:trPr>
@@ -2571,12 +5371,6 @@
         </w:tc>
       </w:tr>
       <w:tr>
-        <w:tblPrEx>
-          <w:tblCellMar>
-            <w:top w:w="0" w:type="dxa"/>
-            <w:bottom w:w="0" w:type="dxa"/>
-          </w:tblCellMar>
-        </w:tblPrEx>
         <w:trPr>
           <w:cantSplit/>
         </w:trPr>
@@ -2730,6 +5524,7 @@
         <w:pStyle w:val="Heading1"/>
         <w:spacing w:before="360" w:after="160"/>
       </w:pPr>
+      <w:bookmarkStart w:id="6" w:name="_Toc240886172"/>
       <w:r>
         <w:rPr>
           <w:b/>
@@ -2740,12 +5535,14 @@
         </w:rPr>
         <w:t>4. Create the GitHub Account and Repository</w:t>
       </w:r>
+      <w:bookmarkEnd w:id="6"/>
     </w:p>
     <w:p>
       <w:pPr>
         <w:pStyle w:val="Heading2"/>
         <w:spacing w:before="280" w:after="120"/>
       </w:pPr>
+      <w:bookmarkStart w:id="7" w:name="_Toc240886173"/>
       <w:r>
         <w:rPr>
           <w:b/>
@@ -2756,6 +5553,7 @@
         </w:rPr>
         <w:t>4.1 Account</w:t>
       </w:r>
+      <w:bookmarkEnd w:id="7"/>
     </w:p>
     <w:p>
       <w:pPr>
@@ -2809,6 +5607,7 @@
         <w:pStyle w:val="Heading2"/>
         <w:spacing w:before="280" w:after="120"/>
       </w:pPr>
+      <w:bookmarkStart w:id="8" w:name="_Toc240886174"/>
       <w:r>
         <w:rPr>
           <w:b/>
@@ -2819,6 +5618,7 @@
         </w:rPr>
         <w:t>4.2 Create the repository</w:t>
       </w:r>
+      <w:bookmarkEnd w:id="8"/>
     </w:p>
     <w:p>
       <w:pPr>
@@ -2912,6 +5712,7 @@
         <w:pStyle w:val="Heading2"/>
         <w:spacing w:before="280" w:after="120"/>
       </w:pPr>
+      <w:bookmarkStart w:id="9" w:name="_Toc240886175"/>
       <w:r>
         <w:rPr>
           <w:b/>
@@ -2956,6 +5757,7 @@
         </w:rPr>
         <w:t xml:space="preserve"> before anything else</w:t>
       </w:r>
+      <w:bookmarkEnd w:id="9"/>
     </w:p>
     <w:p>
       <w:pPr>
@@ -3686,12 +6488,6 @@
         <w:gridCol w:w="9360"/>
       </w:tblGrid>
       <w:tr>
-        <w:tblPrEx>
-          <w:tblCellMar>
-            <w:top w:w="0" w:type="dxa"/>
-            <w:bottom w:w="0" w:type="dxa"/>
-          </w:tblCellMar>
-        </w:tblPrEx>
         <w:tc>
           <w:tcPr>
             <w:tcW w:w="9360" w:type="dxa"/>
@@ -3818,6 +6614,7 @@
         <w:pStyle w:val="Heading2"/>
         <w:spacing w:before="280" w:after="120"/>
       </w:pPr>
+      <w:bookmarkStart w:id="10" w:name="_Toc240886176"/>
       <w:r>
         <w:rPr>
           <w:b/>
@@ -3829,6 +6626,7 @@
         <w:lastRenderedPageBreak/>
         <w:t>4.4 Create the folder skeleton</w:t>
       </w:r>
+      <w:bookmarkEnd w:id="10"/>
     </w:p>
     <w:p>
       <w:pPr>
@@ -3899,6 +6697,7 @@
         <w:pStyle w:val="Heading1"/>
         <w:spacing w:before="360" w:after="160"/>
       </w:pPr>
+      <w:bookmarkStart w:id="11" w:name="_Toc240886177"/>
       <w:r>
         <w:rPr>
           <w:b/>
@@ -3909,6 +6708,7 @@
         </w:rPr>
         <w:t>5. Clone the Repository — Before Any Other Work</w:t>
       </w:r>
+      <w:bookmarkEnd w:id="11"/>
     </w:p>
     <w:p>
       <w:pPr>
@@ -4046,6 +6846,7 @@
         <w:pStyle w:val="Heading1"/>
         <w:spacing w:before="360" w:after="160"/>
       </w:pPr>
+      <w:bookmarkStart w:id="12" w:name="_Toc240886178"/>
       <w:r>
         <w:rPr>
           <w:b/>
@@ -4056,6 +6857,7 @@
         </w:rPr>
         <w:t>6. Local Development Environment</w:t>
       </w:r>
+      <w:bookmarkEnd w:id="12"/>
     </w:p>
     <w:p>
       <w:pPr>
@@ -4070,6 +6872,7 @@
         <w:pStyle w:val="Heading2"/>
         <w:spacing w:before="280" w:after="120"/>
       </w:pPr>
+      <w:bookmarkStart w:id="13" w:name="_Toc240886179"/>
       <w:r>
         <w:rPr>
           <w:b/>
@@ -4081,6 +6884,7 @@
         <w:lastRenderedPageBreak/>
         <w:t>6.1 Install order</w:t>
       </w:r>
+      <w:bookmarkEnd w:id="13"/>
     </w:p>
     <w:tbl>
       <w:tblPr>
@@ -4105,12 +6909,6 @@
         <w:gridCol w:w="5054"/>
       </w:tblGrid>
       <w:tr>
-        <w:tblPrEx>
-          <w:tblCellMar>
-            <w:top w:w="0" w:type="dxa"/>
-            <w:bottom w:w="0" w:type="dxa"/>
-          </w:tblCellMar>
-        </w:tblPrEx>
         <w:trPr>
           <w:tblHeader/>
         </w:trPr>
@@ -4185,12 +6983,6 @@
         </w:tc>
       </w:tr>
       <w:tr>
-        <w:tblPrEx>
-          <w:tblCellMar>
-            <w:top w:w="0" w:type="dxa"/>
-            <w:bottom w:w="0" w:type="dxa"/>
-          </w:tblCellMar>
-        </w:tblPrEx>
         <w:trPr>
           <w:cantSplit/>
         </w:trPr>
@@ -4272,12 +7064,6 @@
         </w:tc>
       </w:tr>
       <w:tr>
-        <w:tblPrEx>
-          <w:tblCellMar>
-            <w:top w:w="0" w:type="dxa"/>
-            <w:bottom w:w="0" w:type="dxa"/>
-          </w:tblCellMar>
-        </w:tblPrEx>
         <w:trPr>
           <w:cantSplit/>
         </w:trPr>
@@ -4352,12 +7138,6 @@
         </w:tc>
       </w:tr>
       <w:tr>
-        <w:tblPrEx>
-          <w:tblCellMar>
-            <w:top w:w="0" w:type="dxa"/>
-            <w:bottom w:w="0" w:type="dxa"/>
-          </w:tblCellMar>
-        </w:tblPrEx>
         <w:trPr>
           <w:cantSplit/>
         </w:trPr>
@@ -4423,12 +7203,6 @@
         </w:tc>
       </w:tr>
       <w:tr>
-        <w:tblPrEx>
-          <w:tblCellMar>
-            <w:top w:w="0" w:type="dxa"/>
-            <w:bottom w:w="0" w:type="dxa"/>
-          </w:tblCellMar>
-        </w:tblPrEx>
         <w:trPr>
           <w:cantSplit/>
         </w:trPr>
@@ -4494,12 +7268,6 @@
         </w:tc>
       </w:tr>
       <w:tr>
-        <w:tblPrEx>
-          <w:tblCellMar>
-            <w:top w:w="0" w:type="dxa"/>
-            <w:bottom w:w="0" w:type="dxa"/>
-          </w:tblCellMar>
-        </w:tblPrEx>
         <w:trPr>
           <w:cantSplit/>
         </w:trPr>
@@ -4570,6 +7338,7 @@
         <w:pStyle w:val="Heading2"/>
         <w:spacing w:before="280" w:after="120"/>
       </w:pPr>
+      <w:bookmarkStart w:id="14" w:name="_Toc240886180"/>
       <w:r>
         <w:rPr>
           <w:b/>
@@ -4580,6 +7349,7 @@
         </w:rPr>
         <w:t>6.2 The local folder layout</w:t>
       </w:r>
+      <w:bookmarkEnd w:id="14"/>
     </w:p>
     <w:p>
       <w:pPr>
@@ -4769,6 +7539,7 @@
         <w:pStyle w:val="Heading2"/>
         <w:spacing w:before="280" w:after="120"/>
       </w:pPr>
+      <w:bookmarkStart w:id="15" w:name="_Toc240886181"/>
       <w:r>
         <w:rPr>
           <w:b/>
@@ -4779,6 +7550,7 @@
         </w:rPr>
         <w:t>6.3 Build the warehouse locally</w:t>
       </w:r>
+      <w:bookmarkEnd w:id="15"/>
     </w:p>
     <w:p>
       <w:pPr>
@@ -4881,6 +7653,7 @@
         <w:pStyle w:val="Heading1"/>
         <w:spacing w:before="360" w:after="160"/>
       </w:pPr>
+      <w:bookmarkStart w:id="16" w:name="_Toc240886182"/>
       <w:r>
         <w:rPr>
           <w:b/>
@@ -4891,6 +7664,7 @@
         </w:rPr>
         <w:t>7. Three Everyday Workflows at a Glance</w:t>
       </w:r>
+      <w:bookmarkEnd w:id="16"/>
     </w:p>
     <w:tbl>
       <w:tblPr>
@@ -4915,12 +7689,6 @@
         <w:gridCol w:w="3744"/>
       </w:tblGrid>
       <w:tr>
-        <w:tblPrEx>
-          <w:tblCellMar>
-            <w:top w:w="0" w:type="dxa"/>
-            <w:bottom w:w="0" w:type="dxa"/>
-          </w:tblCellMar>
-        </w:tblPrEx>
         <w:trPr>
           <w:tblHeader/>
         </w:trPr>
@@ -4996,12 +7764,6 @@
         </w:tc>
       </w:tr>
       <w:tr>
-        <w:tblPrEx>
-          <w:tblCellMar>
-            <w:top w:w="0" w:type="dxa"/>
-            <w:bottom w:w="0" w:type="dxa"/>
-          </w:tblCellMar>
-        </w:tblPrEx>
         <w:trPr>
           <w:cantSplit/>
         </w:trPr>
@@ -5108,12 +7870,6 @@
         </w:tc>
       </w:tr>
       <w:tr>
-        <w:tblPrEx>
-          <w:tblCellMar>
-            <w:top w:w="0" w:type="dxa"/>
-            <w:bottom w:w="0" w:type="dxa"/>
-          </w:tblCellMar>
-        </w:tblPrEx>
         <w:trPr>
           <w:cantSplit/>
         </w:trPr>
@@ -5229,12 +7985,6 @@
         </w:tc>
       </w:tr>
       <w:tr>
-        <w:tblPrEx>
-          <w:tblCellMar>
-            <w:top w:w="0" w:type="dxa"/>
-            <w:bottom w:w="0" w:type="dxa"/>
-          </w:tblCellMar>
-        </w:tblPrEx>
         <w:trPr>
           <w:cantSplit/>
         </w:trPr>
@@ -5362,6 +8112,7 @@
         <w:pStyle w:val="Heading1"/>
         <w:spacing w:before="360" w:after="160"/>
       </w:pPr>
+      <w:bookmarkStart w:id="17" w:name="_Toc240886183"/>
       <w:r>
         <w:rPr>
           <w:b/>
@@ -5372,6 +8123,7 @@
         </w:rPr>
         <w:t>8. Fallback — Uploading Documents via the GitHub Website</w:t>
       </w:r>
+      <w:bookmarkEnd w:id="17"/>
     </w:p>
     <w:p>
       <w:pPr>
@@ -5396,7 +8148,7 @@
         <w:spacing w:after="60" w:line="276" w:lineRule="auto"/>
       </w:pPr>
       <w:r>
-        <w:t>Add file → Upload files → drag the documents from your PC onto the page (00, 01, 02, 12, 13, 14, 15, 20, 21, 22).</w:t>
+        <w:t>Add file → Upload files → drag the documents from your PC onto the page (00, 01, 02, 12, 13, 14, 15, 20, 21, 22, 23).</w:t>
       </w:r>
     </w:p>
     <w:p>
@@ -5409,7 +8161,7 @@
         <w:spacing w:after="60" w:line="276" w:lineRule="auto"/>
       </w:pPr>
       <w:r>
-        <w:t>Commit message, short and specific: “Add document set v1.0 (00, 01, 02, 12, 13, 14, 15, 20, 21, 22)”. Click Commit changes.</w:t>
+        <w:t>Commit message, short and specific: “Add document set v1.0 (00, 01, 02, 12, 13, 14, 15, 20, 21, 22, 23)”. Click Commit changes.</w:t>
       </w:r>
     </w:p>
     <w:p>
@@ -5464,6 +8216,7 @@
         <w:pStyle w:val="Heading1"/>
         <w:spacing w:before="360" w:after="160"/>
       </w:pPr>
+      <w:bookmarkStart w:id="18" w:name="_Toc240886184"/>
       <w:r>
         <w:rPr>
           <w:b/>
@@ -5474,6 +8227,7 @@
         </w:rPr>
         <w:t>9. Power BI Git Workflow — PBIP Format</w:t>
       </w:r>
+      <w:bookmarkEnd w:id="18"/>
     </w:p>
     <w:p>
       <w:pPr>
@@ -5488,6 +8242,7 @@
         <w:pStyle w:val="Heading2"/>
         <w:spacing w:before="280" w:after="120"/>
       </w:pPr>
+      <w:bookmarkStart w:id="19" w:name="_Toc240886185"/>
       <w:r>
         <w:rPr>
           <w:b/>
@@ -5498,6 +8253,7 @@
         </w:rPr>
         <w:t>9.1 Enable and understand PBIP</w:t>
       </w:r>
+      <w:bookmarkEnd w:id="19"/>
     </w:p>
     <w:p>
       <w:pPr>
@@ -5609,12 +8365,6 @@
         <w:gridCol w:w="9360"/>
       </w:tblGrid>
       <w:tr>
-        <w:tblPrEx>
-          <w:tblCellMar>
-            <w:top w:w="0" w:type="dxa"/>
-            <w:bottom w:w="0" w:type="dxa"/>
-          </w:tblCellMar>
-        </w:tblPrEx>
         <w:tc>
           <w:tcPr>
             <w:tcW w:w="9360" w:type="dxa"/>
@@ -5745,6 +8495,7 @@
         <w:pStyle w:val="Heading2"/>
         <w:spacing w:before="280" w:after="120"/>
       </w:pPr>
+      <w:bookmarkStart w:id="20" w:name="_Toc240886186"/>
       <w:r>
         <w:rPr>
           <w:b/>
@@ -5755,6 +8506,7 @@
         </w:rPr>
         <w:t>9.2 The semantic model file</w:t>
       </w:r>
+      <w:bookmarkEnd w:id="20"/>
     </w:p>
     <w:p>
       <w:pPr>
@@ -5850,6 +8602,7 @@
         <w:pStyle w:val="Heading2"/>
         <w:spacing w:before="280" w:after="120"/>
       </w:pPr>
+      <w:bookmarkStart w:id="21" w:name="_Toc240886187"/>
       <w:r>
         <w:rPr>
           <w:b/>
@@ -5860,6 +8613,7 @@
         </w:rPr>
         <w:t>9.3 The three thin reports</w:t>
       </w:r>
+      <w:bookmarkEnd w:id="21"/>
     </w:p>
     <w:p>
       <w:pPr>
@@ -5966,6 +8720,7 @@
         <w:pStyle w:val="Heading2"/>
         <w:spacing w:before="280" w:after="120"/>
       </w:pPr>
+      <w:bookmarkStart w:id="22" w:name="_Toc240886188"/>
       <w:r>
         <w:rPr>
           <w:b/>
@@ -5976,6 +8731,7 @@
         </w:rPr>
         <w:t>9.4 The daily loop: save → review diff → commit → push</w:t>
       </w:r>
+      <w:bookmarkEnd w:id="22"/>
     </w:p>
     <w:p>
       <w:pPr>
@@ -6068,6 +8824,7 @@
         <w:pStyle w:val="Heading2"/>
         <w:spacing w:before="280" w:after="120"/>
       </w:pPr>
+      <w:bookmarkStart w:id="23" w:name="_Toc240886189"/>
       <w:r>
         <w:rPr>
           <w:b/>
@@ -6079,6 +8836,7 @@
         <w:lastRenderedPageBreak/>
         <w:t>9.5 Branching once, so you have done it</w:t>
       </w:r>
+      <w:bookmarkEnd w:id="23"/>
     </w:p>
     <w:p>
       <w:pPr>
@@ -6150,6 +8908,7 @@
         <w:pStyle w:val="Heading1"/>
         <w:spacing w:before="360" w:after="160"/>
       </w:pPr>
+      <w:bookmarkStart w:id="24" w:name="_Toc240886190"/>
       <w:r>
         <w:rPr>
           <w:b/>
@@ -6160,6 +8919,7 @@
         </w:rPr>
         <w:t>10. Syncing Power BI to GitHub Directly — Fabric Git Integration</w:t>
       </w:r>
+      <w:bookmarkEnd w:id="24"/>
     </w:p>
     <w:p>
       <w:pPr>
@@ -6174,6 +8934,7 @@
         <w:pStyle w:val="Heading2"/>
         <w:spacing w:before="280" w:after="120"/>
       </w:pPr>
+      <w:bookmarkStart w:id="25" w:name="_Toc240886191"/>
       <w:r>
         <w:rPr>
           <w:b/>
@@ -6184,6 +8945,7 @@
         </w:rPr>
         <w:t>10.1 What it does and what it needs</w:t>
       </w:r>
+      <w:bookmarkEnd w:id="25"/>
     </w:p>
     <w:tbl>
       <w:tblPr>
@@ -6207,12 +8969,6 @@
         <w:gridCol w:w="6739"/>
       </w:tblGrid>
       <w:tr>
-        <w:tblPrEx>
-          <w:tblCellMar>
-            <w:top w:w="0" w:type="dxa"/>
-            <w:bottom w:w="0" w:type="dxa"/>
-          </w:tblCellMar>
-        </w:tblPrEx>
         <w:trPr>
           <w:tblHeader/>
         </w:trPr>
@@ -6264,12 +9020,6 @@
         </w:tc>
       </w:tr>
       <w:tr>
-        <w:tblPrEx>
-          <w:tblCellMar>
-            <w:top w:w="0" w:type="dxa"/>
-            <w:bottom w:w="0" w:type="dxa"/>
-          </w:tblCellMar>
-        </w:tblPrEx>
         <w:trPr>
           <w:cantSplit/>
         </w:trPr>
@@ -6315,12 +9065,6 @@
         </w:tc>
       </w:tr>
       <w:tr>
-        <w:tblPrEx>
-          <w:tblCellMar>
-            <w:top w:w="0" w:type="dxa"/>
-            <w:bottom w:w="0" w:type="dxa"/>
-          </w:tblCellMar>
-        </w:tblPrEx>
         <w:trPr>
           <w:cantSplit/>
         </w:trPr>
@@ -6373,12 +9117,6 @@
         </w:tc>
       </w:tr>
       <w:tr>
-        <w:tblPrEx>
-          <w:tblCellMar>
-            <w:top w:w="0" w:type="dxa"/>
-            <w:bottom w:w="0" w:type="dxa"/>
-          </w:tblCellMar>
-        </w:tblPrEx>
         <w:trPr>
           <w:cantSplit/>
         </w:trPr>
@@ -6440,12 +9178,6 @@
         </w:tc>
       </w:tr>
       <w:tr>
-        <w:tblPrEx>
-          <w:tblCellMar>
-            <w:top w:w="0" w:type="dxa"/>
-            <w:bottom w:w="0" w:type="dxa"/>
-          </w:tblCellMar>
-        </w:tblPrEx>
         <w:trPr>
           <w:cantSplit/>
         </w:trPr>
@@ -6491,12 +9223,6 @@
         </w:tc>
       </w:tr>
       <w:tr>
-        <w:tblPrEx>
-          <w:tblCellMar>
-            <w:top w:w="0" w:type="dxa"/>
-            <w:bottom w:w="0" w:type="dxa"/>
-          </w:tblCellMar>
-        </w:tblPrEx>
         <w:trPr>
           <w:cantSplit/>
         </w:trPr>
@@ -6542,12 +9268,6 @@
         </w:tc>
       </w:tr>
       <w:tr>
-        <w:tblPrEx>
-          <w:tblCellMar>
-            <w:top w:w="0" w:type="dxa"/>
-            <w:bottom w:w="0" w:type="dxa"/>
-          </w:tblCellMar>
-        </w:tblPrEx>
         <w:trPr>
           <w:cantSplit/>
         </w:trPr>
@@ -6613,6 +9333,7 @@
         <w:pStyle w:val="Heading2"/>
         <w:spacing w:before="280" w:after="120"/>
       </w:pPr>
+      <w:bookmarkStart w:id="26" w:name="_Toc240886192"/>
       <w:r>
         <w:rPr>
           <w:b/>
@@ -6623,6 +9344,7 @@
         </w:rPr>
         <w:t>10.2 How to connect a workspace</w:t>
       </w:r>
+      <w:bookmarkEnd w:id="26"/>
     </w:p>
     <w:p>
       <w:pPr>
@@ -6713,6 +9435,7 @@
         <w:pStyle w:val="Heading2"/>
         <w:spacing w:before="280" w:after="120"/>
       </w:pPr>
+      <w:bookmarkStart w:id="27" w:name="_Toc240886193"/>
       <w:r>
         <w:rPr>
           <w:b/>
@@ -6723,6 +9446,7 @@
         </w:rPr>
         <w:t>10.3 Why this guide does not use it</w:t>
       </w:r>
+      <w:bookmarkEnd w:id="27"/>
     </w:p>
     <w:p>
       <w:pPr>
@@ -6846,6 +9570,7 @@
         <w:pStyle w:val="Heading1"/>
         <w:spacing w:before="360" w:after="160"/>
       </w:pPr>
+      <w:bookmarkStart w:id="28" w:name="_Toc240886194"/>
       <w:r>
         <w:rPr>
           <w:b/>
@@ -6856,6 +9581,7 @@
         </w:rPr>
         <w:t>11. Versioning the Binaries, SQL and Screenshots</w:t>
       </w:r>
+      <w:bookmarkEnd w:id="28"/>
     </w:p>
     <w:p>
       <w:pPr>
@@ -6978,6 +9704,7 @@
         <w:pStyle w:val="Heading1"/>
         <w:spacing w:before="360" w:after="160"/>
       </w:pPr>
+      <w:bookmarkStart w:id="29" w:name="_Toc240886195"/>
       <w:r>
         <w:rPr>
           <w:b/>
@@ -6989,6 +9716,7 @@
         <w:lastRenderedPageBreak/>
         <w:t>12. The Census API Key</w:t>
       </w:r>
+      <w:bookmarkEnd w:id="29"/>
     </w:p>
     <w:p>
       <w:pPr>
@@ -7119,6 +9847,7 @@
         <w:pStyle w:val="Heading1"/>
         <w:spacing w:before="360" w:after="160"/>
       </w:pPr>
+      <w:bookmarkStart w:id="30" w:name="_Toc240886196"/>
       <w:r>
         <w:rPr>
           <w:b/>
@@ -7129,6 +9858,7 @@
         </w:rPr>
         <w:t>13. README.md — the Portfolio Landing Page</w:t>
       </w:r>
+      <w:bookmarkEnd w:id="30"/>
     </w:p>
     <w:p>
       <w:pPr>
@@ -8130,6 +10860,7 @@
         <w:pStyle w:val="Heading1"/>
         <w:spacing w:before="360" w:after="160"/>
       </w:pPr>
+      <w:bookmarkStart w:id="31" w:name="_Toc240886197"/>
       <w:r>
         <w:rPr>
           <w:b/>
@@ -8140,6 +10871,7 @@
         </w:rPr>
         <w:t>14. Verification Checklist</w:t>
       </w:r>
+      <w:bookmarkEnd w:id="31"/>
     </w:p>
     <w:p>
       <w:pPr>
@@ -8336,6 +11068,7 @@
         <w:pStyle w:val="Heading1"/>
         <w:spacing w:before="360" w:after="160"/>
       </w:pPr>
+      <w:bookmarkStart w:id="32" w:name="_Toc240886198"/>
       <w:r>
         <w:rPr>
           <w:b/>
@@ -8346,6 +11079,7 @@
         </w:rPr>
         <w:t>15. References</w:t>
       </w:r>
+      <w:bookmarkEnd w:id="32"/>
     </w:p>
     <w:p>
       <w:pPr>
@@ -8590,6 +11324,7 @@
         <w:pStyle w:val="Heading1"/>
         <w:spacing w:before="360" w:after="160"/>
       </w:pPr>
+      <w:bookmarkStart w:id="33" w:name="_Toc240886199"/>
       <w:r>
         <w:rPr>
           <w:b/>
@@ -8600,6 +11335,7 @@
         </w:rPr>
         <w:t>Appendix A — CONTRIBUTING.md</w:t>
       </w:r>
+      <w:bookmarkEnd w:id="33"/>
     </w:p>
     <w:p>
       <w:pPr>
@@ -9149,6 +11885,7 @@
         <w:pStyle w:val="Heading1"/>
         <w:spacing w:before="360" w:after="160"/>
       </w:pPr>
+      <w:bookmarkStart w:id="34" w:name="_Toc240886200"/>
       <w:r>
         <w:rPr>
           <w:b/>
@@ -9159,6 +11896,7 @@
         </w:rPr>
         <w:t>Appendix B — Artifact Placement Inventory</w:t>
       </w:r>
+      <w:bookmarkEnd w:id="34"/>
     </w:p>
     <w:tbl>
       <w:tblPr>
@@ -9184,12 +11922,6 @@
         <w:gridCol w:w="2195"/>
       </w:tblGrid>
       <w:tr>
-        <w:tblPrEx>
-          <w:tblCellMar>
-            <w:top w:w="0" w:type="dxa"/>
-            <w:bottom w:w="0" w:type="dxa"/>
-          </w:tblCellMar>
-        </w:tblPrEx>
         <w:trPr>
           <w:tblHeader/>
         </w:trPr>
@@ -9288,12 +12020,6 @@
         </w:tc>
       </w:tr>
       <w:tr>
-        <w:tblPrEx>
-          <w:tblCellMar>
-            <w:top w:w="0" w:type="dxa"/>
-            <w:bottom w:w="0" w:type="dxa"/>
-          </w:tblCellMar>
-        </w:tblPrEx>
         <w:trPr>
           <w:cantSplit/>
         </w:trPr>
@@ -9379,12 +12105,6 @@
         </w:tc>
       </w:tr>
       <w:tr>
-        <w:tblPrEx>
-          <w:tblCellMar>
-            <w:top w:w="0" w:type="dxa"/>
-            <w:bottom w:w="0" w:type="dxa"/>
-          </w:tblCellMar>
-        </w:tblPrEx>
         <w:trPr>
           <w:cantSplit/>
         </w:trPr>
@@ -9470,12 +12190,6 @@
         </w:tc>
       </w:tr>
       <w:tr>
-        <w:tblPrEx>
-          <w:tblCellMar>
-            <w:top w:w="0" w:type="dxa"/>
-            <w:bottom w:w="0" w:type="dxa"/>
-          </w:tblCellMar>
-        </w:tblPrEx>
         <w:trPr>
           <w:cantSplit/>
         </w:trPr>
@@ -9561,12 +12275,6 @@
         </w:tc>
       </w:tr>
       <w:tr>
-        <w:tblPrEx>
-          <w:tblCellMar>
-            <w:top w:w="0" w:type="dxa"/>
-            <w:bottom w:w="0" w:type="dxa"/>
-          </w:tblCellMar>
-        </w:tblPrEx>
         <w:trPr>
           <w:cantSplit/>
         </w:trPr>
@@ -9652,12 +12360,6 @@
         </w:tc>
       </w:tr>
       <w:tr>
-        <w:tblPrEx>
-          <w:tblCellMar>
-            <w:top w:w="0" w:type="dxa"/>
-            <w:bottom w:w="0" w:type="dxa"/>
-          </w:tblCellMar>
-        </w:tblPrEx>
         <w:trPr>
           <w:cantSplit/>
         </w:trPr>
@@ -9743,12 +12445,6 @@
         </w:tc>
       </w:tr>
       <w:tr>
-        <w:tblPrEx>
-          <w:tblCellMar>
-            <w:top w:w="0" w:type="dxa"/>
-            <w:bottom w:w="0" w:type="dxa"/>
-          </w:tblCellMar>
-        </w:tblPrEx>
         <w:trPr>
           <w:cantSplit/>
         </w:trPr>
@@ -9834,12 +12530,6 @@
         </w:tc>
       </w:tr>
       <w:tr>
-        <w:tblPrEx>
-          <w:tblCellMar>
-            <w:top w:w="0" w:type="dxa"/>
-            <w:bottom w:w="0" w:type="dxa"/>
-          </w:tblCellMar>
-        </w:tblPrEx>
         <w:trPr>
           <w:cantSplit/>
         </w:trPr>
@@ -9925,12 +12615,6 @@
         </w:tc>
       </w:tr>
       <w:tr>
-        <w:tblPrEx>
-          <w:tblCellMar>
-            <w:top w:w="0" w:type="dxa"/>
-            <w:bottom w:w="0" w:type="dxa"/>
-          </w:tblCellMar>
-        </w:tblPrEx>
         <w:trPr>
           <w:cantSplit/>
         </w:trPr>
@@ -10016,12 +12700,6 @@
         </w:tc>
       </w:tr>
       <w:tr>
-        <w:tblPrEx>
-          <w:tblCellMar>
-            <w:top w:w="0" w:type="dxa"/>
-            <w:bottom w:w="0" w:type="dxa"/>
-          </w:tblCellMar>
-        </w:tblPrEx>
         <w:trPr>
           <w:cantSplit/>
         </w:trPr>
@@ -10041,6 +12719,91 @@
                 <w:sz w:val="19"/>
                 <w:szCs w:val="19"/>
               </w:rPr>
+              <w:t>23_Glossary.docx</w:t>
+            </w:r>
+          </w:p>
+        </w:tc>
+        <w:tc>
+          <w:tcPr>
+            <w:tcW w:w="1310" w:type="dxa"/>
+            <w:tcMar>
+              <w:top w:w="60" w:type="dxa"/>
+              <w:left w:w="100" w:type="dxa"/>
+              <w:bottom w:w="60" w:type="dxa"/>
+              <w:right w:w="100" w:type="dxa"/>
+            </w:tcMar>
+          </w:tcPr>
+          <w:p>
+            <w:r>
+              <w:rPr>
+                <w:sz w:val="19"/>
+                <w:szCs w:val="19"/>
+              </w:rPr>
+              <w:t>docs/</w:t>
+            </w:r>
+          </w:p>
+        </w:tc>
+        <w:tc>
+          <w:tcPr>
+            <w:tcW w:w="1872" w:type="dxa"/>
+            <w:tcMar>
+              <w:top w:w="60" w:type="dxa"/>
+              <w:left w:w="100" w:type="dxa"/>
+              <w:bottom w:w="60" w:type="dxa"/>
+              <w:right w:w="100" w:type="dxa"/>
+            </w:tcMar>
+          </w:tcPr>
+          <w:p>
+            <w:r>
+              <w:rPr>
+                <w:sz w:val="19"/>
+                <w:szCs w:val="19"/>
+              </w:rPr>
+              <w:t>Website</w:t>
+            </w:r>
+          </w:p>
+        </w:tc>
+        <w:tc>
+          <w:tcPr>
+            <w:tcW w:w="3370" w:type="dxa"/>
+            <w:tcMar>
+              <w:top w:w="60" w:type="dxa"/>
+              <w:left w:w="100" w:type="dxa"/>
+              <w:bottom w:w="60" w:type="dxa"/>
+              <w:right w:w="100" w:type="dxa"/>
+            </w:tcMar>
+          </w:tcPr>
+          <w:p>
+            <w:r>
+              <w:rPr>
+                <w:sz w:val="19"/>
+                <w:szCs w:val="19"/>
+              </w:rPr>
+              <w:t>Every term the document set uses, with where it is used</w:t>
+            </w:r>
+          </w:p>
+        </w:tc>
+      </w:tr>
+      <w:tr>
+        <w:trPr>
+          <w:cantSplit/>
+        </w:trPr>
+        <w:tc>
+          <w:tcPr>
+            <w:tcW w:w="2808" w:type="dxa"/>
+            <w:tcMar>
+              <w:top w:w="60" w:type="dxa"/>
+              <w:left w:w="100" w:type="dxa"/>
+              <w:bottom w:w="60" w:type="dxa"/>
+              <w:right w:w="100" w:type="dxa"/>
+            </w:tcMar>
+          </w:tcPr>
+          <w:p>
+            <w:r>
+              <w:rPr>
+                <w:sz w:val="19"/>
+                <w:szCs w:val="19"/>
+              </w:rPr>
               <w:t>01–08 warehouse scripts (.</w:t>
             </w:r>
             <w:proofErr w:type="spellStart"/>
@@ -10132,12 +12895,6 @@
         </w:tc>
       </w:tr>
       <w:tr>
-        <w:tblPrEx>
-          <w:tblCellMar>
-            <w:top w:w="0" w:type="dxa"/>
-            <w:bottom w:w="0" w:type="dxa"/>
-          </w:tblCellMar>
-        </w:tblPrEx>
         <w:trPr>
           <w:cantSplit/>
         </w:trPr>
@@ -10241,12 +12998,6 @@
         </w:tc>
       </w:tr>
       <w:tr>
-        <w:tblPrEx>
-          <w:tblCellMar>
-            <w:top w:w="0" w:type="dxa"/>
-            <w:bottom w:w="0" w:type="dxa"/>
-          </w:tblCellMar>
-        </w:tblPrEx>
         <w:trPr>
           <w:cantSplit/>
         </w:trPr>
@@ -10357,12 +13108,6 @@
         </w:tc>
       </w:tr>
       <w:tr>
-        <w:tblPrEx>
-          <w:tblCellMar>
-            <w:top w:w="0" w:type="dxa"/>
-            <w:bottom w:w="0" w:type="dxa"/>
-          </w:tblCellMar>
-        </w:tblPrEx>
         <w:trPr>
           <w:cantSplit/>
         </w:trPr>
@@ -10466,12 +13211,6 @@
         </w:tc>
       </w:tr>
       <w:tr>
-        <w:tblPrEx>
-          <w:tblCellMar>
-            <w:top w:w="0" w:type="dxa"/>
-            <w:bottom w:w="0" w:type="dxa"/>
-          </w:tblCellMar>
-        </w:tblPrEx>
         <w:trPr>
           <w:cantSplit/>
         </w:trPr>
@@ -10566,12 +13305,6 @@
         </w:tc>
       </w:tr>
       <w:tr>
-        <w:tblPrEx>
-          <w:tblCellMar>
-            <w:top w:w="0" w:type="dxa"/>
-            <w:bottom w:w="0" w:type="dxa"/>
-          </w:tblCellMar>
-        </w:tblPrEx>
         <w:trPr>
           <w:cantSplit/>
         </w:trPr>
@@ -10682,12 +13415,6 @@
         </w:tc>
       </w:tr>
       <w:tr>
-        <w:tblPrEx>
-          <w:tblCellMar>
-            <w:top w:w="0" w:type="dxa"/>
-            <w:bottom w:w="0" w:type="dxa"/>
-          </w:tblCellMar>
-        </w:tblPrEx>
         <w:trPr>
           <w:cantSplit/>
         </w:trPr>
@@ -10773,12 +13500,6 @@
         </w:tc>
       </w:tr>
       <w:tr>
-        <w:tblPrEx>
-          <w:tblCellMar>
-            <w:top w:w="0" w:type="dxa"/>
-            <w:bottom w:w="0" w:type="dxa"/>
-          </w:tblCellMar>
-        </w:tblPrEx>
         <w:trPr>
           <w:cantSplit/>
         </w:trPr>
@@ -10882,12 +13603,6 @@
         </w:tc>
       </w:tr>
       <w:tr>
-        <w:tblPrEx>
-          <w:tblCellMar>
-            <w:top w:w="0" w:type="dxa"/>
-            <w:bottom w:w="0" w:type="dxa"/>
-          </w:tblCellMar>
-        </w:tblPrEx>
         <w:trPr>
           <w:cantSplit/>
         </w:trPr>
@@ -10989,12 +13704,6 @@
         </w:tc>
       </w:tr>
       <w:tr>
-        <w:tblPrEx>
-          <w:tblCellMar>
-            <w:top w:w="0" w:type="dxa"/>
-            <w:bottom w:w="0" w:type="dxa"/>
-          </w:tblCellMar>
-        </w:tblPrEx>
         <w:trPr>
           <w:cantSplit/>
         </w:trPr>
@@ -11080,12 +13789,6 @@
         </w:tc>
       </w:tr>
       <w:tr>
-        <w:tblPrEx>
-          <w:tblCellMar>
-            <w:top w:w="0" w:type="dxa"/>
-            <w:bottom w:w="0" w:type="dxa"/>
-          </w:tblCellMar>
-        </w:tblPrEx>
         <w:trPr>
           <w:cantSplit/>
         </w:trPr>
@@ -11176,6 +13879,7 @@
         <w:pStyle w:val="Heading1"/>
         <w:spacing w:before="360" w:after="160"/>
       </w:pPr>
+      <w:bookmarkStart w:id="35" w:name="_Toc240886201"/>
       <w:r>
         <w:rPr>
           <w:b/>
@@ -11187,6 +13891,7 @@
         <w:lastRenderedPageBreak/>
         <w:t>Appendix C — Folder README Files</w:t>
       </w:r>
+      <w:bookmarkEnd w:id="35"/>
     </w:p>
     <w:p>
       <w:pPr>
@@ -11236,6 +13941,7 @@
         <w:pStyle w:val="Heading2"/>
         <w:spacing w:before="280" w:after="120"/>
       </w:pPr>
+      <w:bookmarkStart w:id="36" w:name="_Toc240886202"/>
       <w:r>
         <w:rPr>
           <w:b/>
@@ -11246,6 +13952,7 @@
         </w:rPr>
         <w:t>C.1 docs/README.md</w:t>
       </w:r>
+      <w:bookmarkEnd w:id="36"/>
     </w:p>
     <w:p>
       <w:pPr>
@@ -11561,6 +14268,23 @@
           <w:szCs w:val="16"/>
         </w:rPr>
         <w:t>| 22 | 22_Validation_Results.xlsx | Did the seventeen checks pass, on what date, with what numbers? |</w:t>
+      </w:r>
+    </w:p>
+    <w:p>
+      <w:pPr>
+        <w:pBdr>
+          <w:left w:val="single" w:sz="12" w:space="6" w:color="A6A6A6"/>
+        </w:pBdr>
+        <w:shd w:val="clear" w:color="auto" w:fill="F2F2F2"/>
+        <w:ind w:left="180"/>
+      </w:pPr>
+      <w:r>
+        <w:rPr>
+          <w:rFonts w:ascii="Consolas" w:eastAsia="Consolas" w:hAnsi="Consolas" w:cs="Consolas"/>
+          <w:sz w:val="16"/>
+          <w:szCs w:val="16"/>
+        </w:rPr>
+        <w:t>| 23 | 23_Glossary.docx | What does this term mean here? |</w:t>
       </w:r>
     </w:p>
     <w:p>
@@ -11807,6 +14531,7 @@
         <w:pStyle w:val="Heading2"/>
         <w:spacing w:before="280" w:after="120"/>
       </w:pPr>
+      <w:bookmarkStart w:id="37" w:name="_Toc240886203"/>
       <w:r>
         <w:rPr>
           <w:b/>
@@ -11817,6 +14542,7 @@
         </w:rPr>
         <w:t>C.2 sql/README.md</w:t>
       </w:r>
+      <w:bookmarkEnd w:id="37"/>
     </w:p>
     <w:p>
       <w:pPr>
@@ -12632,6 +15358,7 @@
         <w:pStyle w:val="Heading2"/>
         <w:spacing w:before="280" w:after="120"/>
       </w:pPr>
+      <w:bookmarkStart w:id="38" w:name="_Toc240886204"/>
       <w:r>
         <w:rPr>
           <w:b/>
@@ -12642,6 +15369,7 @@
         </w:rPr>
         <w:t>C.3 powerquery/README.md</w:t>
       </w:r>
+      <w:bookmarkEnd w:id="38"/>
     </w:p>
     <w:p>
       <w:pPr>
@@ -13248,6 +15976,7 @@
         <w:pStyle w:val="Heading2"/>
         <w:spacing w:before="280" w:after="120"/>
       </w:pPr>
+      <w:bookmarkStart w:id="39" w:name="_Toc240886205"/>
       <w:r>
         <w:rPr>
           <w:b/>
@@ -13258,6 +15987,7 @@
         </w:rPr>
         <w:t>C.4 dax/README.md</w:t>
       </w:r>
+      <w:bookmarkEnd w:id="39"/>
     </w:p>
     <w:p>
       <w:pPr>
@@ -13794,6 +16524,7 @@
         <w:pStyle w:val="Heading2"/>
         <w:spacing w:before="280" w:after="120"/>
       </w:pPr>
+      <w:bookmarkStart w:id="40" w:name="_Toc240886206"/>
       <w:r>
         <w:rPr>
           <w:b/>
@@ -13804,6 +16535,7 @@
         </w:rPr>
         <w:t>C.5 pbip/README.md</w:t>
       </w:r>
+      <w:bookmarkEnd w:id="40"/>
     </w:p>
     <w:p>
       <w:pPr>
@@ -14381,6 +17113,7 @@
         <w:pStyle w:val="Heading2"/>
         <w:spacing w:before="280" w:after="120"/>
       </w:pPr>
+      <w:bookmarkStart w:id="41" w:name="_Toc240886207"/>
       <w:r>
         <w:rPr>
           <w:b/>
@@ -14391,6 +17124,7 @@
         </w:rPr>
         <w:t>C.6 pbix/README.md</w:t>
       </w:r>
+      <w:bookmarkEnd w:id="41"/>
     </w:p>
     <w:p>
       <w:pPr>
@@ -14802,6 +17536,7 @@
         <w:pStyle w:val="Heading2"/>
         <w:spacing w:before="280" w:after="120"/>
       </w:pPr>
+      <w:bookmarkStart w:id="42" w:name="_Toc240886208"/>
       <w:r>
         <w:rPr>
           <w:b/>
@@ -14812,6 +17547,7 @@
         </w:rPr>
         <w:t>C.7 reference/README.md</w:t>
       </w:r>
+      <w:bookmarkEnd w:id="42"/>
     </w:p>
     <w:p>
       <w:pPr>
@@ -15461,6 +18197,7 @@
         <w:pStyle w:val="Heading2"/>
         <w:spacing w:before="280" w:after="120"/>
       </w:pPr>
+      <w:bookmarkStart w:id="43" w:name="_Toc240886209"/>
       <w:r>
         <w:rPr>
           <w:b/>
@@ -15471,6 +18208,7 @@
         </w:rPr>
         <w:t>C.8 theme/README.md</w:t>
       </w:r>
+      <w:bookmarkEnd w:id="43"/>
     </w:p>
     <w:p>
       <w:pPr>
@@ -16498,6 +19236,7 @@
         <w:pStyle w:val="Heading2"/>
         <w:spacing w:before="280" w:after="120"/>
       </w:pPr>
+      <w:bookmarkStart w:id="44" w:name="_Toc240886210"/>
       <w:r>
         <w:rPr>
           <w:b/>
@@ -16508,6 +19247,7 @@
         </w:rPr>
         <w:t>C.9 assets/README.md</w:t>
       </w:r>
+      <w:bookmarkEnd w:id="44"/>
     </w:p>
     <w:p>
       <w:pPr>
@@ -16865,6 +19605,7 @@
         <w:pStyle w:val="Heading1"/>
         <w:spacing w:before="360" w:after="160"/>
       </w:pPr>
+      <w:bookmarkStart w:id="45" w:name="_Toc240886211"/>
       <w:r>
         <w:rPr>
           <w:b/>
@@ -16875,6 +19616,7 @@
         </w:rPr>
         <w:t>AI Assistance Disclosure</w:t>
       </w:r>
+      <w:bookmarkEnd w:id="45"/>
     </w:p>
     <w:p>
       <w:pPr>
@@ -17819,6 +20561,31 @@
       <w:szCs w:val="20"/>
     </w:rPr>
   </w:style>
+  <w:style w:type="paragraph" w:styleId="TOC1">
+    <w:name w:val="toc 1"/>
+    <w:basedOn w:val="Normal"/>
+    <w:next w:val="Normal"/>
+    <w:autoRedefine/>
+    <w:uiPriority w:val="39"/>
+    <w:unhideWhenUsed/>
+    <w:rsid w:val="00175328"/>
+    <w:pPr>
+      <w:spacing w:after="100"/>
+    </w:pPr>
+  </w:style>
+  <w:style w:type="paragraph" w:styleId="TOC2">
+    <w:name w:val="toc 2"/>
+    <w:basedOn w:val="Normal"/>
+    <w:next w:val="Normal"/>
+    <w:autoRedefine/>
+    <w:uiPriority w:val="39"/>
+    <w:unhideWhenUsed/>
+    <w:rsid w:val="00175328"/>
+    <w:pPr>
+      <w:spacing w:after="100"/>
+      <w:ind w:left="220"/>
+    </w:pPr>
+  </w:style>
 </w:styles>
 </file>
 

</xml_diff>

<commit_message>
fixing vulnerability in .gitignore
</commit_message>
<xml_diff>
--- a/docs/00_Development_Environment_and_Source_Control_Setup_Guide.docx
+++ b/docs/00_Development_Environment_and_Source_Control_Setup_Guide.docx
@@ -8148,7 +8148,7 @@
         <w:spacing w:after="60" w:line="276" w:lineRule="auto"/>
       </w:pPr>
       <w:r>
-        <w:t>Add file → Upload files → drag the documents from your PC onto the page (00, 01, 02, 12, 13, 14, 15, 20, 21, 22, 23).</w:t>
+        <w:t>Add file → Upload files → drag the documents from your PC onto the page (00, 01, 02, 12, 13, 14, 15, 20, 21, 22, 23, 25).</w:t>
       </w:r>
     </w:p>
     <w:p>
@@ -8161,7 +8161,7 @@
         <w:spacing w:after="60" w:line="276" w:lineRule="auto"/>
       </w:pPr>
       <w:r>
-        <w:t>Commit message, short and specific: “Add document set v1.0 (00, 01, 02, 12, 13, 14, 15, 20, 21, 22, 23)”. Click Commit changes.</w:t>
+        <w:t>Commit message, short and specific: “Add document set v1.0 (00, 01, 02, 12, 13, 14, 15, 20, 21, 22, 23, 25)”. Click Commit changes.</w:t>
       </w:r>
     </w:p>
     <w:p>
@@ -10514,7 +10514,7 @@
           <w:sz w:val="16"/>
           <w:szCs w:val="16"/>
         </w:rPr>
-        <w:t>| docs/ | Numbered document set (00, 01, 02, 12, 13, 14, 15, 20) |</w:t>
+        <w:t>| docs/ | Numbered document set (00, 01, 02, 12, 13, 14, 15, 20, 21, 22, 23, 25) |</w:t>
       </w:r>
     </w:p>
     <w:p>
@@ -10917,7 +10917,7 @@
         <w:spacing w:after="60" w:line="276" w:lineRule="auto"/>
       </w:pPr>
       <w:r>
-        <w:t>docs/ contains the numbered set (00, 01, 02, 12, 13, 14, 15, 20) with meaningful commit messages.</w:t>
+        <w:t>docs/ contains the numbered set (00, 01, 02, 12, 13, 14, 15, 20, 21, 22, 23, 25) with meaningful commit messages.</w:t>
       </w:r>
     </w:p>
     <w:p>
@@ -12804,6 +12804,91 @@
                 <w:sz w:val="19"/>
                 <w:szCs w:val="19"/>
               </w:rPr>
+              <w:t xml:space="preserve">25_Validation_Timing_Guide.docx</w:t>
+            </w:r>
+          </w:p>
+        </w:tc>
+        <w:tc>
+          <w:tcPr>
+            <w:tcW w:w="1310" w:type="dxa"/>
+            <w:tcMar>
+              <w:top w:w="60" w:type="dxa"/>
+              <w:left w:w="100" w:type="dxa"/>
+              <w:bottom w:w="60" w:type="dxa"/>
+              <w:right w:w="100" w:type="dxa"/>
+            </w:tcMar>
+          </w:tcPr>
+          <w:p>
+            <w:r>
+              <w:rPr>
+                <w:sz w:val="19"/>
+                <w:szCs w:val="19"/>
+              </w:rPr>
+              <w:t xml:space="preserve">docs/</w:t>
+            </w:r>
+          </w:p>
+        </w:tc>
+        <w:tc>
+          <w:tcPr>
+            <w:tcW w:w="1872" w:type="dxa"/>
+            <w:tcMar>
+              <w:top w:w="60" w:type="dxa"/>
+              <w:left w:w="100" w:type="dxa"/>
+              <w:bottom w:w="60" w:type="dxa"/>
+              <w:right w:w="100" w:type="dxa"/>
+            </w:tcMar>
+          </w:tcPr>
+          <w:p>
+            <w:r>
+              <w:rPr>
+                <w:sz w:val="19"/>
+                <w:szCs w:val="19"/>
+              </w:rPr>
+              <w:t xml:space="preserve">Website</w:t>
+            </w:r>
+          </w:p>
+        </w:tc>
+        <w:tc>
+          <w:tcPr>
+            <w:tcW w:w="3370" w:type="dxa"/>
+            <w:tcMar>
+              <w:top w:w="60" w:type="dxa"/>
+              <w:left w:w="100" w:type="dxa"/>
+              <w:bottom w:w="60" w:type="dxa"/>
+              <w:right w:w="100" w:type="dxa"/>
+            </w:tcMar>
+          </w:tcPr>
+          <w:p>
+            <w:r>
+              <w:rPr>
+                <w:sz w:val="19"/>
+                <w:szCs w:val="19"/>
+              </w:rPr>
+              <w:t xml:space="preserve">When to validate, gate by gate, and when to validate again</w:t>
+            </w:r>
+          </w:p>
+        </w:tc>
+      </w:tr>
+      <w:tr>
+        <w:trPr>
+          <w:cantSplit/>
+        </w:trPr>
+        <w:tc>
+          <w:tcPr>
+            <w:tcW w:w="2808" w:type="dxa"/>
+            <w:tcMar>
+              <w:top w:w="60" w:type="dxa"/>
+              <w:left w:w="100" w:type="dxa"/>
+              <w:bottom w:w="60" w:type="dxa"/>
+              <w:right w:w="100" w:type="dxa"/>
+            </w:tcMar>
+          </w:tcPr>
+          <w:p>
+            <w:r>
+              <w:rPr>
+                <w:sz w:val="19"/>
+                <w:szCs w:val="19"/>
+              </w:rPr>
               <w:t>01–08 warehouse scripts (.</w:t>
             </w:r>
             <w:proofErr w:type="spellStart"/>
@@ -14285,6 +14370,23 @@
           <w:szCs w:val="16"/>
         </w:rPr>
         <w:t>| 23 | 23_Glossary.docx | What does this term mean here? |</w:t>
+      </w:r>
+    </w:p>
+    <w:p>
+      <w:pPr>
+        <w:pBdr>
+          <w:left w:val="single" w:sz="12" w:space="6" w:color="A6A6A6"/>
+        </w:pBdr>
+        <w:shd w:val="clear" w:color="auto" w:fill="F2F2F2"/>
+        <w:ind w:left="180"/>
+      </w:pPr>
+      <w:r>
+        <w:rPr>
+          <w:rFonts w:ascii="Consolas" w:eastAsia="Consolas" w:hAnsi="Consolas" w:cs="Consolas"/>
+          <w:sz w:val="16"/>
+          <w:szCs w:val="16"/>
+        </w:rPr>
+        <w:t xml:space="preserve">| 25 | 25_Validation_Timing_Guide.docx | When do I validate, and what? |</w:t>
       </w:r>
     </w:p>
     <w:p>

</xml_diff>

<commit_message>
created validation checklist Excel
</commit_message>
<xml_diff>
--- a/docs/00_Development_Environment_and_Source_Control_Setup_Guide.docx
+++ b/docs/00_Development_Environment_and_Source_Control_Setup_Guide.docx
@@ -8148,7 +8148,7 @@
         <w:spacing w:after="60" w:line="276" w:lineRule="auto"/>
       </w:pPr>
       <w:r>
-        <w:t>Add file → Upload files → drag the documents from your PC onto the page (00, 01, 02, 12, 13, 14, 15, 20, 21, 22, 23, 25).</w:t>
+        <w:t>Add file → Upload files → drag the documents from your PC onto the page (00, 01, 02, 12, 13, 14, 15, 20, 21, 22, 23, 25, 26).</w:t>
       </w:r>
     </w:p>
     <w:p>
@@ -8161,7 +8161,7 @@
         <w:spacing w:after="60" w:line="276" w:lineRule="auto"/>
       </w:pPr>
       <w:r>
-        <w:t>Commit message, short and specific: “Add document set v1.0 (00, 01, 02, 12, 13, 14, 15, 20, 21, 22, 23, 25)”. Click Commit changes.</w:t>
+        <w:t>Commit message, short and specific: “Add document set v1.0 (00, 01, 02, 12, 13, 14, 15, 20, 21, 22, 23, 25, 26)”. Click Commit changes.</w:t>
       </w:r>
     </w:p>
     <w:p>
@@ -10514,7 +10514,7 @@
           <w:sz w:val="16"/>
           <w:szCs w:val="16"/>
         </w:rPr>
-        <w:t>| docs/ | Numbered document set (00, 01, 02, 12, 13, 14, 15, 20, 21, 22, 23, 25) |</w:t>
+        <w:t>| docs/ | Numbered document set (00, 01, 02, 12, 13, 14, 15, 20, 21, 22, 23, 25, 26) |</w:t>
       </w:r>
     </w:p>
     <w:p>
@@ -10917,7 +10917,7 @@
         <w:spacing w:after="60" w:line="276" w:lineRule="auto"/>
       </w:pPr>
       <w:r>
-        <w:t>docs/ contains the numbered set (00, 01, 02, 12, 13, 14, 15, 20, 21, 22, 23, 25) with meaningful commit messages.</w:t>
+        <w:t>docs/ contains the numbered set (00, 01, 02, 12, 13, 14, 15, 20, 21, 22, 23, 25, 26) with meaningful commit messages.</w:t>
       </w:r>
     </w:p>
     <w:p>
@@ -12889,6 +12889,91 @@
                 <w:sz w:val="19"/>
                 <w:szCs w:val="19"/>
               </w:rPr>
+              <w:t xml:space="preserve">26_Validation_Timing_Checklist.xlsx</w:t>
+            </w:r>
+          </w:p>
+        </w:tc>
+        <w:tc>
+          <w:tcPr>
+            <w:tcW w:w="1310" w:type="dxa"/>
+            <w:tcMar>
+              <w:top w:w="60" w:type="dxa"/>
+              <w:left w:w="100" w:type="dxa"/>
+              <w:bottom w:w="60" w:type="dxa"/>
+              <w:right w:w="100" w:type="dxa"/>
+            </w:tcMar>
+          </w:tcPr>
+          <w:p>
+            <w:r>
+              <w:rPr>
+                <w:sz w:val="19"/>
+                <w:szCs w:val="19"/>
+              </w:rPr>
+              <w:t xml:space="preserve">docs/</w:t>
+            </w:r>
+          </w:p>
+        </w:tc>
+        <w:tc>
+          <w:tcPr>
+            <w:tcW w:w="1872" w:type="dxa"/>
+            <w:tcMar>
+              <w:top w:w="60" w:type="dxa"/>
+              <w:left w:w="100" w:type="dxa"/>
+              <w:bottom w:w="60" w:type="dxa"/>
+              <w:right w:w="100" w:type="dxa"/>
+            </w:tcMar>
+          </w:tcPr>
+          <w:p>
+            <w:r>
+              <w:rPr>
+                <w:sz w:val="19"/>
+                <w:szCs w:val="19"/>
+              </w:rPr>
+              <w:t xml:space="preserve">Website</w:t>
+            </w:r>
+          </w:p>
+        </w:tc>
+        <w:tc>
+          <w:tcPr>
+            <w:tcW w:w="3370" w:type="dxa"/>
+            <w:tcMar>
+              <w:top w:w="60" w:type="dxa"/>
+              <w:left w:w="100" w:type="dxa"/>
+              <w:bottom w:w="60" w:type="dxa"/>
+              <w:right w:w="100" w:type="dxa"/>
+            </w:tcMar>
+          </w:tcPr>
+          <w:p>
+            <w:r>
+              <w:rPr>
+                <w:sz w:val="19"/>
+                <w:szCs w:val="19"/>
+              </w:rPr>
+              <w:t xml:space="preserve">Tick-list for document 25: every gate check, gate summary, re-validation log</w:t>
+            </w:r>
+          </w:p>
+        </w:tc>
+      </w:tr>
+      <w:tr>
+        <w:trPr>
+          <w:cantSplit/>
+        </w:trPr>
+        <w:tc>
+          <w:tcPr>
+            <w:tcW w:w="2808" w:type="dxa"/>
+            <w:tcMar>
+              <w:top w:w="60" w:type="dxa"/>
+              <w:left w:w="100" w:type="dxa"/>
+              <w:bottom w:w="60" w:type="dxa"/>
+              <w:right w:w="100" w:type="dxa"/>
+            </w:tcMar>
+          </w:tcPr>
+          <w:p>
+            <w:r>
+              <w:rPr>
+                <w:sz w:val="19"/>
+                <w:szCs w:val="19"/>
+              </w:rPr>
               <w:t>01–08 warehouse scripts (.</w:t>
             </w:r>
             <w:proofErr w:type="spellStart"/>
@@ -14387,6 +14472,23 @@
           <w:szCs w:val="16"/>
         </w:rPr>
         <w:t xml:space="preserve">| 25 | 25_Validation_Timing_Guide.docx | When do I validate, and what? |</w:t>
+      </w:r>
+    </w:p>
+    <w:p>
+      <w:pPr>
+        <w:pBdr>
+          <w:left w:val="single" w:sz="12" w:space="6" w:color="A6A6A6"/>
+        </w:pBdr>
+        <w:shd w:val="clear" w:color="auto" w:fill="F2F2F2"/>
+        <w:ind w:left="180"/>
+      </w:pPr>
+      <w:r>
+        <w:rPr>
+          <w:rFonts w:ascii="Consolas" w:eastAsia="Consolas" w:hAnsi="Consolas" w:cs="Consolas"/>
+          <w:sz w:val="16"/>
+          <w:szCs w:val="16"/>
+        </w:rPr>
+        <w:t xml:space="preserve">| 26 | 26_Validation_Timing_Checklist.xlsx | Has each gate passed? What was re-validated, and when? |</w:t>
       </w:r>
     </w:p>
     <w:p>

</xml_diff>

<commit_message>
added verification steps and created folder
</commit_message>
<xml_diff>
--- a/docs/00_Development_Environment_and_Source_Control_Setup_Guide.docx
+++ b/docs/00_Development_Environment_and_Source_Control_Setup_Guide.docx
@@ -4134,133 +4134,41 @@
           <w:sz w:val="16"/>
           <w:szCs w:val="16"/>
         </w:rPr>
-        <w:t xml:space="preserve">|-- docs/                  &lt;- numbered set: </w:t>
-      </w:r>
-      <w:proofErr w:type="gramStart"/>
-      <w:r>
-        <w:rPr>
-          <w:rFonts w:ascii="Consolas" w:eastAsia="Consolas" w:hAnsi="Consolas" w:cs="Consolas"/>
-          <w:sz w:val="16"/>
-          <w:szCs w:val="16"/>
-        </w:rPr>
-        <w:t>00 .</w:t>
-      </w:r>
-      <w:proofErr w:type="gramEnd"/>
-      <w:r>
-        <w:rPr>
-          <w:rFonts w:ascii="Consolas" w:eastAsia="Consolas" w:hAnsi="Consolas" w:cs="Consolas"/>
-          <w:sz w:val="16"/>
-          <w:szCs w:val="16"/>
-        </w:rPr>
-        <w:t xml:space="preserve"> </w:t>
-      </w:r>
-      <w:proofErr w:type="gramStart"/>
-      <w:r>
-        <w:rPr>
-          <w:rFonts w:ascii="Consolas" w:eastAsia="Consolas" w:hAnsi="Consolas" w:cs="Consolas"/>
-          <w:sz w:val="16"/>
-          <w:szCs w:val="16"/>
-        </w:rPr>
-        <w:t>01 .</w:t>
-      </w:r>
-      <w:proofErr w:type="gramEnd"/>
-      <w:r>
-        <w:rPr>
-          <w:rFonts w:ascii="Consolas" w:eastAsia="Consolas" w:hAnsi="Consolas" w:cs="Consolas"/>
-          <w:sz w:val="16"/>
-          <w:szCs w:val="16"/>
-        </w:rPr>
-        <w:t xml:space="preserve"> </w:t>
-      </w:r>
-      <w:proofErr w:type="gramStart"/>
-      <w:r>
-        <w:rPr>
-          <w:rFonts w:ascii="Consolas" w:eastAsia="Consolas" w:hAnsi="Consolas" w:cs="Consolas"/>
-          <w:sz w:val="16"/>
-          <w:szCs w:val="16"/>
-        </w:rPr>
-        <w:t>02 .</w:t>
-      </w:r>
-      <w:proofErr w:type="gramEnd"/>
-      <w:r>
-        <w:rPr>
-          <w:rFonts w:ascii="Consolas" w:eastAsia="Consolas" w:hAnsi="Consolas" w:cs="Consolas"/>
-          <w:sz w:val="16"/>
-          <w:szCs w:val="16"/>
-        </w:rPr>
-        <w:t xml:space="preserve"> </w:t>
-      </w:r>
-      <w:proofErr w:type="gramStart"/>
-      <w:r>
-        <w:rPr>
-          <w:rFonts w:ascii="Consolas" w:eastAsia="Consolas" w:hAnsi="Consolas" w:cs="Consolas"/>
-          <w:sz w:val="16"/>
-          <w:szCs w:val="16"/>
-        </w:rPr>
-        <w:t>12 .</w:t>
-      </w:r>
-      <w:proofErr w:type="gramEnd"/>
-      <w:r>
-        <w:rPr>
-          <w:rFonts w:ascii="Consolas" w:eastAsia="Consolas" w:hAnsi="Consolas" w:cs="Consolas"/>
-          <w:sz w:val="16"/>
-          <w:szCs w:val="16"/>
-        </w:rPr>
-        <w:t xml:space="preserve"> </w:t>
-      </w:r>
-      <w:proofErr w:type="gramStart"/>
-      <w:r>
-        <w:rPr>
-          <w:rFonts w:ascii="Consolas" w:eastAsia="Consolas" w:hAnsi="Consolas" w:cs="Consolas"/>
-          <w:sz w:val="16"/>
-          <w:szCs w:val="16"/>
-        </w:rPr>
-        <w:t>13 .</w:t>
-      </w:r>
-      <w:proofErr w:type="gramEnd"/>
-      <w:r>
-        <w:rPr>
-          <w:rFonts w:ascii="Consolas" w:eastAsia="Consolas" w:hAnsi="Consolas" w:cs="Consolas"/>
-          <w:sz w:val="16"/>
-          <w:szCs w:val="16"/>
-        </w:rPr>
-        <w:t xml:space="preserve"> </w:t>
-      </w:r>
-      <w:proofErr w:type="gramStart"/>
-      <w:r>
-        <w:rPr>
-          <w:rFonts w:ascii="Consolas" w:eastAsia="Consolas" w:hAnsi="Consolas" w:cs="Consolas"/>
-          <w:sz w:val="16"/>
-          <w:szCs w:val="16"/>
-        </w:rPr>
-        <w:t>14 .</w:t>
-      </w:r>
-      <w:proofErr w:type="gramEnd"/>
-      <w:r>
-        <w:rPr>
-          <w:rFonts w:ascii="Consolas" w:eastAsia="Consolas" w:hAnsi="Consolas" w:cs="Consolas"/>
-          <w:sz w:val="16"/>
-          <w:szCs w:val="16"/>
-        </w:rPr>
-        <w:t xml:space="preserve"> </w:t>
-      </w:r>
-      <w:proofErr w:type="gramStart"/>
-      <w:r>
-        <w:rPr>
-          <w:rFonts w:ascii="Consolas" w:eastAsia="Consolas" w:hAnsi="Consolas" w:cs="Consolas"/>
-          <w:sz w:val="16"/>
-          <w:szCs w:val="16"/>
-        </w:rPr>
-        <w:t>15 .</w:t>
-      </w:r>
-      <w:proofErr w:type="gramEnd"/>
-      <w:r>
-        <w:rPr>
-          <w:rFonts w:ascii="Consolas" w:eastAsia="Consolas" w:hAnsi="Consolas" w:cs="Consolas"/>
-          <w:sz w:val="16"/>
-          <w:szCs w:val="16"/>
-        </w:rPr>
-        <w:t xml:space="preserve"> 20</w:t>
+        <w:t xml:space="preserve">|-- docs/                  &lt;- numbered set: 00 . 01 . 02 . 12 . 13 . 14 . 15</w:t>
+      </w:r>
+    </w:p>
+    <w:p>
+      <w:pPr>
+        <w:pBdr>
+          <w:left w:val="single" w:sz="12" w:space="6" w:color="A6A6A6"/>
+        </w:pBdr>
+        <w:shd w:val="clear" w:color="auto" w:fill="F2F2F2"/>
+        <w:ind w:left="180"/>
+      </w:pPr>
+      <w:r>
+        <w:rPr>
+          <w:rFonts w:ascii="Consolas" w:eastAsia="Consolas" w:hAnsi="Consolas" w:cs="Consolas"/>
+          <w:sz w:val="16"/>
+          <w:szCs w:val="16"/>
+        </w:rPr>
+        <w:t xml:space="preserve">|   |                         20 . 21 . 22 . 23 . 25 . 26</w:t>
+      </w:r>
+    </w:p>
+    <w:p>
+      <w:pPr>
+        <w:pBdr>
+          <w:left w:val="single" w:sz="12" w:space="6" w:color="A6A6A6"/>
+        </w:pBdr>
+        <w:shd w:val="clear" w:color="auto" w:fill="F2F2F2"/>
+        <w:ind w:left="180"/>
+      </w:pPr>
+      <w:r>
+        <w:rPr>
+          <w:rFonts w:ascii="Consolas" w:eastAsia="Consolas" w:hAnsi="Consolas" w:cs="Consolas"/>
+          <w:sz w:val="16"/>
+          <w:szCs w:val="16"/>
+        </w:rPr>
+        <w:t xml:space="preserve">|   \-- validation/        &lt;- one procedure per check, V01 . V17</w:t>
       </w:r>
     </w:p>
     <w:p>
@@ -9891,15 +9799,16 @@
           <w:sz w:val="16"/>
           <w:szCs w:val="16"/>
         </w:rPr>
-        <w:t># U.S. Retail Sector Health - Power BI</w:t>
-      </w:r>
-    </w:p>
-    <w:p>
-      <w:pPr>
-        <w:pBdr>
-          <w:left w:val="single" w:sz="12" w:space="6" w:color="A6A6A6"/>
-        </w:pBdr>
-        <w:shd w:val="clear" w:color="auto" w:fill="F2F2F2"/>
+        <w:t xml:space="preserve"># U.S. Retail Sector Health - Power BI</w:t>
+      </w:r>
+    </w:p>
+    <w:p>
+      <w:pPr>
+        <w:pBdr>
+          <w:left w:val="single" w:sz="12" w:space="6" w:color="A6A6A6"/>
+        </w:pBdr>
+        <w:shd w:val="clear" w:color="auto" w:fill="F2F2F2"/>
+        <w:spacing w:before="120"/>
         <w:ind w:left="180"/>
       </w:pPr>
       <w:r>
@@ -9917,40 +9826,43 @@
           <w:left w:val="single" w:sz="12" w:space="6" w:color="A6A6A6"/>
         </w:pBdr>
         <w:shd w:val="clear" w:color="auto" w:fill="F2F2F2"/>
-        <w:ind w:left="180"/>
-      </w:pPr>
-      <w:r>
-        <w:rPr>
-          <w:rFonts w:ascii="Consolas" w:eastAsia="Consolas" w:hAnsi="Consolas" w:cs="Consolas"/>
-          <w:sz w:val="16"/>
-          <w:szCs w:val="16"/>
-        </w:rPr>
-        <w:t>Three Power BI reports on one shared semantic model, tracing U.S. retail</w:t>
-      </w:r>
-    </w:p>
-    <w:p>
-      <w:pPr>
-        <w:pBdr>
-          <w:left w:val="single" w:sz="12" w:space="6" w:color="A6A6A6"/>
-        </w:pBdr>
-        <w:shd w:val="clear" w:color="auto" w:fill="F2F2F2"/>
-        <w:ind w:left="180"/>
-      </w:pPr>
-      <w:r>
-        <w:rPr>
-          <w:rFonts w:ascii="Consolas" w:eastAsia="Consolas" w:hAnsi="Consolas" w:cs="Consolas"/>
-          <w:sz w:val="16"/>
-          <w:szCs w:val="16"/>
-        </w:rPr>
-        <w:t>from national macro conditions to item-level physical movement.</w:t>
-      </w:r>
-    </w:p>
-    <w:p>
-      <w:pPr>
-        <w:pBdr>
-          <w:left w:val="single" w:sz="12" w:space="6" w:color="A6A6A6"/>
-        </w:pBdr>
-        <w:shd w:val="clear" w:color="auto" w:fill="F2F2F2"/>
+        <w:spacing w:before="120"/>
+        <w:ind w:left="180"/>
+      </w:pPr>
+      <w:r>
+        <w:rPr>
+          <w:rFonts w:ascii="Consolas" w:eastAsia="Consolas" w:hAnsi="Consolas" w:cs="Consolas"/>
+          <w:sz w:val="16"/>
+          <w:szCs w:val="16"/>
+        </w:rPr>
+        <w:t xml:space="preserve">Three Power BI reports on one shared semantic model, tracing U.S. retail</w:t>
+      </w:r>
+    </w:p>
+    <w:p>
+      <w:pPr>
+        <w:pBdr>
+          <w:left w:val="single" w:sz="12" w:space="6" w:color="A6A6A6"/>
+        </w:pBdr>
+        <w:shd w:val="clear" w:color="auto" w:fill="F2F2F2"/>
+        <w:spacing w:before="120"/>
+        <w:ind w:left="180"/>
+      </w:pPr>
+      <w:r>
+        <w:rPr>
+          <w:rFonts w:ascii="Consolas" w:eastAsia="Consolas" w:hAnsi="Consolas" w:cs="Consolas"/>
+          <w:sz w:val="16"/>
+          <w:szCs w:val="16"/>
+        </w:rPr>
+        <w:t xml:space="preserve">from national macro conditions to item-level physical movement.</w:t>
+      </w:r>
+    </w:p>
+    <w:p>
+      <w:pPr>
+        <w:pBdr>
+          <w:left w:val="single" w:sz="12" w:space="6" w:color="A6A6A6"/>
+        </w:pBdr>
+        <w:shd w:val="clear" w:color="auto" w:fill="F2F2F2"/>
+        <w:spacing w:before="120"/>
         <w:ind w:left="180"/>
       </w:pPr>
       <w:r>
@@ -9968,158 +9880,115 @@
           <w:left w:val="single" w:sz="12" w:space="6" w:color="A6A6A6"/>
         </w:pBdr>
         <w:shd w:val="clear" w:color="auto" w:fill="F2F2F2"/>
-        <w:ind w:left="180"/>
-      </w:pPr>
-      <w:r>
-        <w:rPr>
-          <w:rFonts w:ascii="Consolas" w:eastAsia="Consolas" w:hAnsi="Consolas" w:cs="Consolas"/>
-          <w:sz w:val="16"/>
-          <w:szCs w:val="16"/>
-        </w:rPr>
-        <w:t>## Reports</w:t>
-      </w:r>
-    </w:p>
-    <w:p>
-      <w:pPr>
-        <w:pBdr>
-          <w:left w:val="single" w:sz="12" w:space="6" w:color="A6A6A6"/>
-        </w:pBdr>
-        <w:shd w:val="clear" w:color="auto" w:fill="F2F2F2"/>
-        <w:ind w:left="180"/>
-      </w:pPr>
-      <w:proofErr w:type="gramStart"/>
-      <w:r>
-        <w:rPr>
-          <w:rFonts w:ascii="Consolas" w:eastAsia="Consolas" w:hAnsi="Consolas" w:cs="Consolas"/>
-          <w:sz w:val="16"/>
-          <w:szCs w:val="16"/>
-        </w:rPr>
-        <w:t>![</w:t>
-      </w:r>
-      <w:proofErr w:type="gramEnd"/>
-      <w:r>
-        <w:rPr>
-          <w:rFonts w:ascii="Consolas" w:eastAsia="Consolas" w:hAnsi="Consolas" w:cs="Consolas"/>
-          <w:sz w:val="16"/>
-          <w:szCs w:val="16"/>
-        </w:rPr>
-        <w:t xml:space="preserve">R1 Macro </w:t>
-      </w:r>
-      <w:proofErr w:type="gramStart"/>
-      <w:r>
-        <w:rPr>
-          <w:rFonts w:ascii="Consolas" w:eastAsia="Consolas" w:hAnsi="Consolas" w:cs="Consolas"/>
-          <w:sz w:val="16"/>
-          <w:szCs w:val="16"/>
-        </w:rPr>
-        <w:t>Environment](</w:t>
-      </w:r>
-      <w:proofErr w:type="gramEnd"/>
-      <w:r>
-        <w:rPr>
-          <w:rFonts w:ascii="Consolas" w:eastAsia="Consolas" w:hAnsi="Consolas" w:cs="Consolas"/>
-          <w:sz w:val="16"/>
-          <w:szCs w:val="16"/>
-        </w:rPr>
-        <w:t>assets/r1_p1_macro.png)</w:t>
-      </w:r>
-    </w:p>
-    <w:p>
-      <w:pPr>
-        <w:pBdr>
-          <w:left w:val="single" w:sz="12" w:space="6" w:color="A6A6A6"/>
-        </w:pBdr>
-        <w:shd w:val="clear" w:color="auto" w:fill="F2F2F2"/>
-        <w:ind w:left="180"/>
-      </w:pPr>
-      <w:proofErr w:type="gramStart"/>
-      <w:r>
-        <w:rPr>
-          <w:rFonts w:ascii="Consolas" w:eastAsia="Consolas" w:hAnsi="Consolas" w:cs="Consolas"/>
-          <w:sz w:val="16"/>
-          <w:szCs w:val="16"/>
-        </w:rPr>
-        <w:t>![</w:t>
-      </w:r>
-      <w:proofErr w:type="gramEnd"/>
-      <w:r>
-        <w:rPr>
-          <w:rFonts w:ascii="Consolas" w:eastAsia="Consolas" w:hAnsi="Consolas" w:cs="Consolas"/>
-          <w:sz w:val="16"/>
-          <w:szCs w:val="16"/>
-        </w:rPr>
-        <w:t xml:space="preserve">R2 Recession </w:t>
-      </w:r>
-      <w:proofErr w:type="gramStart"/>
-      <w:r>
-        <w:rPr>
-          <w:rFonts w:ascii="Consolas" w:eastAsia="Consolas" w:hAnsi="Consolas" w:cs="Consolas"/>
-          <w:sz w:val="16"/>
-          <w:szCs w:val="16"/>
-        </w:rPr>
-        <w:t>Resistance](</w:t>
-      </w:r>
-      <w:proofErr w:type="gramEnd"/>
-      <w:r>
-        <w:rPr>
-          <w:rFonts w:ascii="Consolas" w:eastAsia="Consolas" w:hAnsi="Consolas" w:cs="Consolas"/>
-          <w:sz w:val="16"/>
-          <w:szCs w:val="16"/>
-        </w:rPr>
-        <w:t>assets/r2_p1_stress.png)</w:t>
-      </w:r>
-    </w:p>
-    <w:p>
-      <w:pPr>
-        <w:pBdr>
-          <w:left w:val="single" w:sz="12" w:space="6" w:color="A6A6A6"/>
-        </w:pBdr>
-        <w:shd w:val="clear" w:color="auto" w:fill="F2F2F2"/>
-        <w:ind w:left="180"/>
-      </w:pPr>
-      <w:proofErr w:type="gramStart"/>
-      <w:r>
-        <w:rPr>
-          <w:rFonts w:ascii="Consolas" w:eastAsia="Consolas" w:hAnsi="Consolas" w:cs="Consolas"/>
-          <w:sz w:val="16"/>
-          <w:szCs w:val="16"/>
-        </w:rPr>
-        <w:t>![</w:t>
-      </w:r>
-      <w:proofErr w:type="gramEnd"/>
-      <w:r>
-        <w:rPr>
-          <w:rFonts w:ascii="Consolas" w:eastAsia="Consolas" w:hAnsi="Consolas" w:cs="Consolas"/>
-          <w:sz w:val="16"/>
-          <w:szCs w:val="16"/>
-        </w:rPr>
-        <w:t xml:space="preserve">R3 Assortment </w:t>
-      </w:r>
-      <w:proofErr w:type="gramStart"/>
-      <w:r>
-        <w:rPr>
-          <w:rFonts w:ascii="Consolas" w:eastAsia="Consolas" w:hAnsi="Consolas" w:cs="Consolas"/>
-          <w:sz w:val="16"/>
-          <w:szCs w:val="16"/>
-        </w:rPr>
-        <w:t>Concentration](</w:t>
-      </w:r>
-      <w:proofErr w:type="gramEnd"/>
-      <w:r>
-        <w:rPr>
-          <w:rFonts w:ascii="Consolas" w:eastAsia="Consolas" w:hAnsi="Consolas" w:cs="Consolas"/>
-          <w:sz w:val="16"/>
-          <w:szCs w:val="16"/>
-        </w:rPr>
-        <w:t>assets/r3_p1_assortment.png)</w:t>
-      </w:r>
-    </w:p>
-    <w:p>
-      <w:pPr>
-        <w:pBdr>
-          <w:left w:val="single" w:sz="12" w:space="6" w:color="A6A6A6"/>
-        </w:pBdr>
-        <w:shd w:val="clear" w:color="auto" w:fill="F2F2F2"/>
+        <w:spacing w:before="120"/>
+        <w:ind w:left="180"/>
+      </w:pPr>
+      <w:r>
+        <w:rPr>
+          <w:rFonts w:ascii="Consolas" w:eastAsia="Consolas" w:hAnsi="Consolas" w:cs="Consolas"/>
+          <w:sz w:val="16"/>
+          <w:szCs w:val="16"/>
+        </w:rPr>
+        <w:t xml:space="preserve">This project analyzes the health of the U.S. retail sector with</w:t>
+      </w:r>
+    </w:p>
+    <w:p>
+      <w:pPr>
+        <w:pBdr>
+          <w:left w:val="single" w:sz="12" w:space="6" w:color="A6A6A6"/>
+        </w:pBdr>
+        <w:shd w:val="clear" w:color="auto" w:fill="F2F2F2"/>
+        <w:spacing w:before="120"/>
+        <w:ind w:left="180"/>
+      </w:pPr>
+      <w:r>
+        <w:rPr>
+          <w:rFonts w:ascii="Consolas" w:eastAsia="Consolas" w:hAnsi="Consolas" w:cs="Consolas"/>
+          <w:sz w:val="16"/>
+          <w:szCs w:val="16"/>
+        </w:rPr>
+        <w:t xml:space="preserve">reproducible data workflows, a validated semantic model and a complete</w:t>
+      </w:r>
+    </w:p>
+    <w:p>
+      <w:pPr>
+        <w:pBdr>
+          <w:left w:val="single" w:sz="12" w:space="6" w:color="A6A6A6"/>
+        </w:pBdr>
+        <w:shd w:val="clear" w:color="auto" w:fill="F2F2F2"/>
+        <w:spacing w:before="120"/>
+        <w:ind w:left="180"/>
+      </w:pPr>
+      <w:r>
+        <w:rPr>
+          <w:rFonts w:ascii="Consolas" w:eastAsia="Consolas" w:hAnsi="Consolas" w:cs="Consolas"/>
+          <w:sz w:val="16"/>
+          <w:szCs w:val="16"/>
+        </w:rPr>
+        <w:t xml:space="preserve">documentation set. It is built by one developer, end to end - from the</w:t>
+      </w:r>
+    </w:p>
+    <w:p>
+      <w:pPr>
+        <w:pBdr>
+          <w:left w:val="single" w:sz="12" w:space="6" w:color="A6A6A6"/>
+        </w:pBdr>
+        <w:shd w:val="clear" w:color="auto" w:fill="F2F2F2"/>
+        <w:spacing w:before="120"/>
+        <w:ind w:left="180"/>
+      </w:pPr>
+      <w:r>
+        <w:rPr>
+          <w:rFonts w:ascii="Consolas" w:eastAsia="Consolas" w:hAnsi="Consolas" w:cs="Consolas"/>
+          <w:sz w:val="16"/>
+          <w:szCs w:val="16"/>
+        </w:rPr>
+        <w:t xml:space="preserve">SQL Server warehouse to the published reports - and it is designed to</w:t>
+      </w:r>
+    </w:p>
+    <w:p>
+      <w:pPr>
+        <w:pBdr>
+          <w:left w:val="single" w:sz="12" w:space="6" w:color="A6A6A6"/>
+        </w:pBdr>
+        <w:shd w:val="clear" w:color="auto" w:fill="F2F2F2"/>
+        <w:spacing w:before="120"/>
+        <w:ind w:left="180"/>
+      </w:pPr>
+      <w:r>
+        <w:rPr>
+          <w:rFonts w:ascii="Consolas" w:eastAsia="Consolas" w:hAnsi="Consolas" w:cs="Consolas"/>
+          <w:sz w:val="16"/>
+          <w:szCs w:val="16"/>
+        </w:rPr>
+        <w:t xml:space="preserve">show that working independently does not mean working without QA,</w:t>
+      </w:r>
+    </w:p>
+    <w:p>
+      <w:pPr>
+        <w:pBdr>
+          <w:left w:val="single" w:sz="12" w:space="6" w:color="A6A6A6"/>
+        </w:pBdr>
+        <w:shd w:val="clear" w:color="auto" w:fill="F2F2F2"/>
+        <w:spacing w:before="120"/>
+        <w:ind w:left="180"/>
+      </w:pPr>
+      <w:r>
+        <w:rPr>
+          <w:rFonts w:ascii="Consolas" w:eastAsia="Consolas" w:hAnsi="Consolas" w:cs="Consolas"/>
+          <w:sz w:val="16"/>
+          <w:szCs w:val="16"/>
+        </w:rPr>
+        <w:t xml:space="preserve">review or documentation.</w:t>
+      </w:r>
+    </w:p>
+    <w:p>
+      <w:pPr>
+        <w:pBdr>
+          <w:left w:val="single" w:sz="12" w:space="6" w:color="A6A6A6"/>
+        </w:pBdr>
+        <w:shd w:val="clear" w:color="auto" w:fill="F2F2F2"/>
+        <w:spacing w:before="120"/>
         <w:ind w:left="180"/>
       </w:pPr>
       <w:r>
@@ -10137,68 +10006,79 @@
           <w:left w:val="single" w:sz="12" w:space="6" w:color="A6A6A6"/>
         </w:pBdr>
         <w:shd w:val="clear" w:color="auto" w:fill="F2F2F2"/>
-        <w:ind w:left="180"/>
-      </w:pPr>
-      <w:r>
-        <w:rPr>
-          <w:rFonts w:ascii="Consolas" w:eastAsia="Consolas" w:hAnsi="Consolas" w:cs="Consolas"/>
-          <w:sz w:val="16"/>
-          <w:szCs w:val="16"/>
-        </w:rPr>
-        <w:t>## Data model</w:t>
-      </w:r>
-    </w:p>
-    <w:p>
-      <w:pPr>
-        <w:pBdr>
-          <w:left w:val="single" w:sz="12" w:space="6" w:color="A6A6A6"/>
-        </w:pBdr>
-        <w:shd w:val="clear" w:color="auto" w:fill="F2F2F2"/>
-        <w:ind w:left="180"/>
-      </w:pPr>
-      <w:proofErr w:type="gramStart"/>
-      <w:r>
-        <w:rPr>
-          <w:rFonts w:ascii="Consolas" w:eastAsia="Consolas" w:hAnsi="Consolas" w:cs="Consolas"/>
-          <w:sz w:val="16"/>
-          <w:szCs w:val="16"/>
-        </w:rPr>
-        <w:t>![</w:t>
-      </w:r>
-      <w:proofErr w:type="gramEnd"/>
-      <w:r>
-        <w:rPr>
-          <w:rFonts w:ascii="Consolas" w:eastAsia="Consolas" w:hAnsi="Consolas" w:cs="Consolas"/>
-          <w:sz w:val="16"/>
-          <w:szCs w:val="16"/>
-        </w:rPr>
-        <w:t xml:space="preserve">Star </w:t>
-      </w:r>
-      <w:proofErr w:type="gramStart"/>
-      <w:r>
-        <w:rPr>
-          <w:rFonts w:ascii="Consolas" w:eastAsia="Consolas" w:hAnsi="Consolas" w:cs="Consolas"/>
-          <w:sz w:val="16"/>
-          <w:szCs w:val="16"/>
-        </w:rPr>
-        <w:t>schema](</w:t>
-      </w:r>
-      <w:proofErr w:type="gramEnd"/>
-      <w:r>
-        <w:rPr>
-          <w:rFonts w:ascii="Consolas" w:eastAsia="Consolas" w:hAnsi="Consolas" w:cs="Consolas"/>
-          <w:sz w:val="16"/>
-          <w:szCs w:val="16"/>
-        </w:rPr>
-        <w:t>assets/model_view.png)</w:t>
-      </w:r>
-    </w:p>
-    <w:p>
-      <w:pPr>
-        <w:pBdr>
-          <w:left w:val="single" w:sz="12" w:space="6" w:color="A6A6A6"/>
-        </w:pBdr>
-        <w:shd w:val="clear" w:color="auto" w:fill="F2F2F2"/>
+        <w:spacing w:before="120"/>
+        <w:ind w:left="180"/>
+      </w:pPr>
+      <w:r>
+        <w:rPr>
+          <w:rFonts w:ascii="Consolas" w:eastAsia="Consolas" w:hAnsi="Consolas" w:cs="Consolas"/>
+          <w:sz w:val="16"/>
+          <w:szCs w:val="16"/>
+        </w:rPr>
+        <w:t xml:space="preserve">## Reports</w:t>
+      </w:r>
+    </w:p>
+    <w:p>
+      <w:pPr>
+        <w:pBdr>
+          <w:left w:val="single" w:sz="12" w:space="6" w:color="A6A6A6"/>
+        </w:pBdr>
+        <w:shd w:val="clear" w:color="auto" w:fill="F2F2F2"/>
+        <w:spacing w:before="120"/>
+        <w:ind w:left="180"/>
+      </w:pPr>
+      <w:r>
+        <w:rPr>
+          <w:rFonts w:ascii="Consolas" w:eastAsia="Consolas" w:hAnsi="Consolas" w:cs="Consolas"/>
+          <w:sz w:val="16"/>
+          <w:szCs w:val="16"/>
+        </w:rPr>
+        <w:t xml:space="preserve">![R1 Macro Environment](assets/r1_p1_macro.png)</w:t>
+      </w:r>
+    </w:p>
+    <w:p>
+      <w:pPr>
+        <w:pBdr>
+          <w:left w:val="single" w:sz="12" w:space="6" w:color="A6A6A6"/>
+        </w:pBdr>
+        <w:shd w:val="clear" w:color="auto" w:fill="F2F2F2"/>
+        <w:spacing w:before="120"/>
+        <w:ind w:left="180"/>
+      </w:pPr>
+      <w:r>
+        <w:rPr>
+          <w:rFonts w:ascii="Consolas" w:eastAsia="Consolas" w:hAnsi="Consolas" w:cs="Consolas"/>
+          <w:sz w:val="16"/>
+          <w:szCs w:val="16"/>
+        </w:rPr>
+        <w:t xml:space="preserve">![R2 Recession Resistance](assets/r2_p1_stress.png)</w:t>
+      </w:r>
+    </w:p>
+    <w:p>
+      <w:pPr>
+        <w:pBdr>
+          <w:left w:val="single" w:sz="12" w:space="6" w:color="A6A6A6"/>
+        </w:pBdr>
+        <w:shd w:val="clear" w:color="auto" w:fill="F2F2F2"/>
+        <w:spacing w:before="120"/>
+        <w:ind w:left="180"/>
+      </w:pPr>
+      <w:r>
+        <w:rPr>
+          <w:rFonts w:ascii="Consolas" w:eastAsia="Consolas" w:hAnsi="Consolas" w:cs="Consolas"/>
+          <w:sz w:val="16"/>
+          <w:szCs w:val="16"/>
+        </w:rPr>
+        <w:t xml:space="preserve">![R3 Assortment Concentration](assets/r3_p1_assortment.png)</w:t>
+      </w:r>
+    </w:p>
+    <w:p>
+      <w:pPr>
+        <w:pBdr>
+          <w:left w:val="single" w:sz="12" w:space="6" w:color="A6A6A6"/>
+        </w:pBdr>
+        <w:shd w:val="clear" w:color="auto" w:fill="F2F2F2"/>
+        <w:spacing w:before="120"/>
         <w:ind w:left="180"/>
       </w:pPr>
       <w:r>
@@ -10216,40 +10096,259 @@
           <w:left w:val="single" w:sz="12" w:space="6" w:color="A6A6A6"/>
         </w:pBdr>
         <w:shd w:val="clear" w:color="auto" w:fill="F2F2F2"/>
-        <w:ind w:left="180"/>
-      </w:pPr>
-      <w:r>
-        <w:rPr>
-          <w:rFonts w:ascii="Consolas" w:eastAsia="Consolas" w:hAnsi="Consolas" w:cs="Consolas"/>
-          <w:sz w:val="16"/>
-          <w:szCs w:val="16"/>
-        </w:rPr>
-        <w:t>## Highlights</w:t>
-      </w:r>
-    </w:p>
-    <w:p>
-      <w:pPr>
-        <w:pBdr>
-          <w:left w:val="single" w:sz="12" w:space="6" w:color="A6A6A6"/>
-        </w:pBdr>
-        <w:shd w:val="clear" w:color="auto" w:fill="F2F2F2"/>
-        <w:ind w:left="180"/>
-      </w:pPr>
-      <w:r>
-        <w:rPr>
-          <w:rFonts w:ascii="Consolas" w:eastAsia="Consolas" w:hAnsi="Consolas" w:cs="Consolas"/>
-          <w:sz w:val="16"/>
-          <w:szCs w:val="16"/>
-        </w:rPr>
-        <w:t>- Three ingestion patterns in one model: keyed REST API (Census MARTS),</w:t>
-      </w:r>
-    </w:p>
-    <w:p>
-      <w:pPr>
-        <w:pBdr>
-          <w:left w:val="single" w:sz="12" w:space="6" w:color="A6A6A6"/>
-        </w:pBdr>
-        <w:shd w:val="clear" w:color="auto" w:fill="F2F2F2"/>
+        <w:spacing w:before="120"/>
+        <w:ind w:left="180"/>
+      </w:pPr>
+      <w:r>
+        <w:rPr>
+          <w:rFonts w:ascii="Consolas" w:eastAsia="Consolas" w:hAnsi="Consolas" w:cs="Consolas"/>
+          <w:sz w:val="16"/>
+          <w:szCs w:val="16"/>
+        </w:rPr>
+        <w:t xml:space="preserve">## Power BI Files structure</w:t>
+      </w:r>
+    </w:p>
+    <w:p>
+      <w:pPr>
+        <w:pBdr>
+          <w:left w:val="single" w:sz="12" w:space="6" w:color="A6A6A6"/>
+        </w:pBdr>
+        <w:shd w:val="clear" w:color="auto" w:fill="F2F2F2"/>
+        <w:spacing w:before="120"/>
+        <w:ind w:left="180"/>
+      </w:pPr>
+      <w:r>
+        <w:rPr>
+          <w:rFonts w:ascii="Consolas" w:eastAsia="Consolas" w:hAnsi="Consolas" w:cs="Consolas"/>
+          <w:sz w:val="16"/>
+          <w:szCs w:val="16"/>
+        </w:rPr>
+        <w:t xml:space="preserve">![Star schema](assets/fig_filesplit.png)</w:t>
+      </w:r>
+    </w:p>
+    <w:p>
+      <w:pPr>
+        <w:pBdr>
+          <w:left w:val="single" w:sz="12" w:space="6" w:color="A6A6A6"/>
+        </w:pBdr>
+        <w:shd w:val="clear" w:color="auto" w:fill="F2F2F2"/>
+        <w:spacing w:before="120"/>
+        <w:ind w:left="180"/>
+      </w:pPr>
+      <w:r>
+        <w:rPr>
+          <w:rFonts w:ascii="Consolas" w:eastAsia="Consolas" w:hAnsi="Consolas" w:cs="Consolas"/>
+          <w:sz w:val="16"/>
+          <w:szCs w:val="16"/>
+        </w:rPr>
+        <w:t xml:space="preserve"> </w:t>
+      </w:r>
+    </w:p>
+    <w:p>
+      <w:pPr>
+        <w:pBdr>
+          <w:left w:val="single" w:sz="12" w:space="6" w:color="A6A6A6"/>
+        </w:pBdr>
+        <w:shd w:val="clear" w:color="auto" w:fill="F2F2F2"/>
+        <w:spacing w:before="120"/>
+        <w:ind w:left="180"/>
+      </w:pPr>
+      <w:r>
+        <w:rPr>
+          <w:rFonts w:ascii="Consolas" w:eastAsia="Consolas" w:hAnsi="Consolas" w:cs="Consolas"/>
+          <w:sz w:val="16"/>
+          <w:szCs w:val="16"/>
+        </w:rPr>
+        <w:t xml:space="preserve">## Data model</w:t>
+      </w:r>
+    </w:p>
+    <w:p>
+      <w:pPr>
+        <w:pBdr>
+          <w:left w:val="single" w:sz="12" w:space="6" w:color="A6A6A6"/>
+        </w:pBdr>
+        <w:shd w:val="clear" w:color="auto" w:fill="F2F2F2"/>
+        <w:spacing w:before="120"/>
+        <w:ind w:left="180"/>
+      </w:pPr>
+      <w:r>
+        <w:rPr>
+          <w:rFonts w:ascii="Consolas" w:eastAsia="Consolas" w:hAnsi="Consolas" w:cs="Consolas"/>
+          <w:sz w:val="16"/>
+          <w:szCs w:val="16"/>
+        </w:rPr>
+        <w:t xml:space="preserve">![Star schema](assets/model_view.png)</w:t>
+      </w:r>
+    </w:p>
+    <w:p>
+      <w:pPr>
+        <w:pBdr>
+          <w:left w:val="single" w:sz="12" w:space="6" w:color="A6A6A6"/>
+        </w:pBdr>
+        <w:shd w:val="clear" w:color="auto" w:fill="F2F2F2"/>
+        <w:spacing w:before="120"/>
+        <w:ind w:left="180"/>
+      </w:pPr>
+      <w:r>
+        <w:rPr>
+          <w:rFonts w:ascii="Consolas" w:eastAsia="Consolas" w:hAnsi="Consolas" w:cs="Consolas"/>
+          <w:sz w:val="16"/>
+          <w:szCs w:val="16"/>
+        </w:rPr>
+        <w:t xml:space="preserve"> </w:t>
+      </w:r>
+    </w:p>
+    <w:p>
+      <w:pPr>
+        <w:pBdr>
+          <w:left w:val="single" w:sz="12" w:space="6" w:color="A6A6A6"/>
+        </w:pBdr>
+        <w:shd w:val="clear" w:color="auto" w:fill="F2F2F2"/>
+        <w:spacing w:before="120"/>
+        <w:ind w:left="180"/>
+      </w:pPr>
+      <w:r>
+        <w:rPr>
+          <w:rFonts w:ascii="Consolas" w:eastAsia="Consolas" w:hAnsi="Consolas" w:cs="Consolas"/>
+          <w:sz w:val="16"/>
+          <w:szCs w:val="16"/>
+        </w:rPr>
+        <w:t xml:space="preserve">## Semantic model</w:t>
+      </w:r>
+    </w:p>
+    <w:p>
+      <w:pPr>
+        <w:pBdr>
+          <w:left w:val="single" w:sz="12" w:space="6" w:color="A6A6A6"/>
+        </w:pBdr>
+        <w:shd w:val="clear" w:color="auto" w:fill="F2F2F2"/>
+        <w:spacing w:before="120"/>
+        <w:ind w:left="180"/>
+      </w:pPr>
+      <w:r>
+        <w:rPr>
+          <w:rFonts w:ascii="Consolas" w:eastAsia="Consolas" w:hAnsi="Consolas" w:cs="Consolas"/>
+          <w:sz w:val="16"/>
+          <w:szCs w:val="16"/>
+        </w:rPr>
+        <w:t xml:space="preserve">![PBI Semantic schema](assets/fig_modelview.png)</w:t>
+      </w:r>
+    </w:p>
+    <w:p>
+      <w:pPr>
+        <w:pBdr>
+          <w:left w:val="single" w:sz="12" w:space="6" w:color="A6A6A6"/>
+        </w:pBdr>
+        <w:shd w:val="clear" w:color="auto" w:fill="F2F2F2"/>
+        <w:spacing w:before="120"/>
+        <w:ind w:left="180"/>
+      </w:pPr>
+      <w:r>
+        <w:rPr>
+          <w:rFonts w:ascii="Consolas" w:eastAsia="Consolas" w:hAnsi="Consolas" w:cs="Consolas"/>
+          <w:sz w:val="16"/>
+          <w:szCs w:val="16"/>
+        </w:rPr>
+        <w:t xml:space="preserve"> </w:t>
+      </w:r>
+    </w:p>
+    <w:p>
+      <w:pPr>
+        <w:pBdr>
+          <w:left w:val="single" w:sz="12" w:space="6" w:color="A6A6A6"/>
+        </w:pBdr>
+        <w:shd w:val="clear" w:color="auto" w:fill="F2F2F2"/>
+        <w:spacing w:before="120"/>
+        <w:ind w:left="180"/>
+      </w:pPr>
+      <w:r>
+        <w:rPr>
+          <w:rFonts w:ascii="Consolas" w:eastAsia="Consolas" w:hAnsi="Consolas" w:cs="Consolas"/>
+          <w:sz w:val="16"/>
+          <w:szCs w:val="16"/>
+        </w:rPr>
+        <w:t xml:space="preserve">## Pipeline diagram</w:t>
+      </w:r>
+    </w:p>
+    <w:p>
+      <w:pPr>
+        <w:pBdr>
+          <w:left w:val="single" w:sz="12" w:space="6" w:color="A6A6A6"/>
+        </w:pBdr>
+        <w:shd w:val="clear" w:color="auto" w:fill="F2F2F2"/>
+        <w:spacing w:before="120"/>
+        <w:ind w:left="180"/>
+      </w:pPr>
+      <w:r>
+        <w:rPr>
+          <w:rFonts w:ascii="Consolas" w:eastAsia="Consolas" w:hAnsi="Consolas" w:cs="Consolas"/>
+          <w:sz w:val="16"/>
+          <w:szCs w:val="16"/>
+        </w:rPr>
+        <w:t xml:space="preserve">![Pipeline diagram](assets/fig_pipeline.png)</w:t>
+      </w:r>
+    </w:p>
+    <w:p>
+      <w:pPr>
+        <w:pBdr>
+          <w:left w:val="single" w:sz="12" w:space="6" w:color="A6A6A6"/>
+        </w:pBdr>
+        <w:shd w:val="clear" w:color="auto" w:fill="F2F2F2"/>
+        <w:spacing w:before="120"/>
+        <w:ind w:left="180"/>
+      </w:pPr>
+      <w:r>
+        <w:rPr>
+          <w:rFonts w:ascii="Consolas" w:eastAsia="Consolas" w:hAnsi="Consolas" w:cs="Consolas"/>
+          <w:sz w:val="16"/>
+          <w:szCs w:val="16"/>
+        </w:rPr>
+        <w:t xml:space="preserve"> </w:t>
+      </w:r>
+    </w:p>
+    <w:p>
+      <w:pPr>
+        <w:pBdr>
+          <w:left w:val="single" w:sz="12" w:space="6" w:color="A6A6A6"/>
+        </w:pBdr>
+        <w:shd w:val="clear" w:color="auto" w:fill="F2F2F2"/>
+        <w:spacing w:before="120"/>
+        <w:ind w:left="180"/>
+      </w:pPr>
+      <w:r>
+        <w:rPr>
+          <w:rFonts w:ascii="Consolas" w:eastAsia="Consolas" w:hAnsi="Consolas" w:cs="Consolas"/>
+          <w:sz w:val="16"/>
+          <w:szCs w:val="16"/>
+        </w:rPr>
+        <w:t xml:space="preserve">## Highlights</w:t>
+      </w:r>
+    </w:p>
+    <w:p>
+      <w:pPr>
+        <w:pBdr>
+          <w:left w:val="single" w:sz="12" w:space="6" w:color="A6A6A6"/>
+        </w:pBdr>
+        <w:shd w:val="clear" w:color="auto" w:fill="F2F2F2"/>
+        <w:spacing w:before="120"/>
+        <w:ind w:left="180"/>
+      </w:pPr>
+      <w:r>
+        <w:rPr>
+          <w:rFonts w:ascii="Consolas" w:eastAsia="Consolas" w:hAnsi="Consolas" w:cs="Consolas"/>
+          <w:sz w:val="16"/>
+          <w:szCs w:val="16"/>
+        </w:rPr>
+        <w:t xml:space="preserve">- Three ingestion patterns in one model: keyed REST API (Census MARTS),</w:t>
+      </w:r>
+    </w:p>
+    <w:p>
+      <w:pPr>
+        <w:pBdr>
+          <w:left w:val="single" w:sz="12" w:space="6" w:color="A6A6A6"/>
+        </w:pBdr>
+        <w:shd w:val="clear" w:color="auto" w:fill="F2F2F2"/>
+        <w:spacing w:before="120"/>
         <w:ind w:left="180"/>
       </w:pPr>
       <w:r>
@@ -10267,40 +10366,43 @@
           <w:left w:val="single" w:sz="12" w:space="6" w:color="A6A6A6"/>
         </w:pBdr>
         <w:shd w:val="clear" w:color="auto" w:fill="F2F2F2"/>
-        <w:ind w:left="180"/>
-      </w:pPr>
-      <w:r>
-        <w:rPr>
-          <w:rFonts w:ascii="Consolas" w:eastAsia="Consolas" w:hAnsi="Consolas" w:cs="Consolas"/>
-          <w:sz w:val="16"/>
-          <w:szCs w:val="16"/>
-        </w:rPr>
-        <w:t>- One published semantic model, three live-connected thin reports</w:t>
-      </w:r>
-    </w:p>
-    <w:p>
-      <w:pPr>
-        <w:pBdr>
-          <w:left w:val="single" w:sz="12" w:space="6" w:color="A6A6A6"/>
-        </w:pBdr>
-        <w:shd w:val="clear" w:color="auto" w:fill="F2F2F2"/>
-        <w:ind w:left="180"/>
-      </w:pPr>
-      <w:r>
-        <w:rPr>
-          <w:rFonts w:ascii="Consolas" w:eastAsia="Consolas" w:hAnsi="Consolas" w:cs="Consolas"/>
-          <w:sz w:val="16"/>
-          <w:szCs w:val="16"/>
-        </w:rPr>
-        <w:t>- Physical case volume reconciled against nominal dollar sales by</w:t>
-      </w:r>
-    </w:p>
-    <w:p>
-      <w:pPr>
-        <w:pBdr>
-          <w:left w:val="single" w:sz="12" w:space="6" w:color="A6A6A6"/>
-        </w:pBdr>
-        <w:shd w:val="clear" w:color="auto" w:fill="F2F2F2"/>
+        <w:spacing w:before="120"/>
+        <w:ind w:left="180"/>
+      </w:pPr>
+      <w:r>
+        <w:rPr>
+          <w:rFonts w:ascii="Consolas" w:eastAsia="Consolas" w:hAnsi="Consolas" w:cs="Consolas"/>
+          <w:sz w:val="16"/>
+          <w:szCs w:val="16"/>
+        </w:rPr>
+        <w:t xml:space="preserve">- One published semantic model, three live-connected thin reports</w:t>
+      </w:r>
+    </w:p>
+    <w:p>
+      <w:pPr>
+        <w:pBdr>
+          <w:left w:val="single" w:sz="12" w:space="6" w:color="A6A6A6"/>
+        </w:pBdr>
+        <w:shd w:val="clear" w:color="auto" w:fill="F2F2F2"/>
+        <w:spacing w:before="120"/>
+        <w:ind w:left="180"/>
+      </w:pPr>
+      <w:r>
+        <w:rPr>
+          <w:rFonts w:ascii="Consolas" w:eastAsia="Consolas" w:hAnsi="Consolas" w:cs="Consolas"/>
+          <w:sz w:val="16"/>
+          <w:szCs w:val="16"/>
+        </w:rPr>
+        <w:t xml:space="preserve">- Physical case volume reconciled against nominal dollar sales by</w:t>
+      </w:r>
+    </w:p>
+    <w:p>
+      <w:pPr>
+        <w:pBdr>
+          <w:left w:val="single" w:sz="12" w:space="6" w:color="A6A6A6"/>
+        </w:pBdr>
+        <w:shd w:val="clear" w:color="auto" w:fill="F2F2F2"/>
+        <w:spacing w:before="120"/>
         <w:ind w:left="180"/>
       </w:pPr>
       <w:r>
@@ -10318,23 +10420,25 @@
           <w:left w:val="single" w:sz="12" w:space="6" w:color="A6A6A6"/>
         </w:pBdr>
         <w:shd w:val="clear" w:color="auto" w:fill="F2F2F2"/>
-        <w:ind w:left="180"/>
-      </w:pPr>
-      <w:r>
-        <w:rPr>
-          <w:rFonts w:ascii="Consolas" w:eastAsia="Consolas" w:hAnsi="Consolas" w:cs="Consolas"/>
-          <w:sz w:val="16"/>
-          <w:szCs w:val="16"/>
-        </w:rPr>
-        <w:t>- PBIP source control: every DAX change is a readable line diff</w:t>
-      </w:r>
-    </w:p>
-    <w:p>
-      <w:pPr>
-        <w:pBdr>
-          <w:left w:val="single" w:sz="12" w:space="6" w:color="A6A6A6"/>
-        </w:pBdr>
-        <w:shd w:val="clear" w:color="auto" w:fill="F2F2F2"/>
+        <w:spacing w:before="120"/>
+        <w:ind w:left="180"/>
+      </w:pPr>
+      <w:r>
+        <w:rPr>
+          <w:rFonts w:ascii="Consolas" w:eastAsia="Consolas" w:hAnsi="Consolas" w:cs="Consolas"/>
+          <w:sz w:val="16"/>
+          <w:szCs w:val="16"/>
+        </w:rPr>
+        <w:t xml:space="preserve">- PBIP source control: every DAX change is a readable line diff</w:t>
+      </w:r>
+    </w:p>
+    <w:p>
+      <w:pPr>
+        <w:pBdr>
+          <w:left w:val="single" w:sz="12" w:space="6" w:color="A6A6A6"/>
+        </w:pBdr>
+        <w:shd w:val="clear" w:color="auto" w:fill="F2F2F2"/>
+        <w:spacing w:before="120"/>
         <w:ind w:left="180"/>
       </w:pPr>
       <w:r>
@@ -10352,83 +10456,1365 @@
           <w:left w:val="single" w:sz="12" w:space="6" w:color="A6A6A6"/>
         </w:pBdr>
         <w:shd w:val="clear" w:color="auto" w:fill="F2F2F2"/>
-        <w:ind w:left="180"/>
-      </w:pPr>
-      <w:r>
-        <w:rPr>
-          <w:rFonts w:ascii="Consolas" w:eastAsia="Consolas" w:hAnsi="Consolas" w:cs="Consolas"/>
-          <w:sz w:val="16"/>
-          <w:szCs w:val="16"/>
-        </w:rPr>
-        <w:t>## Data sources (not redistributed here)</w:t>
-      </w:r>
-    </w:p>
-    <w:p>
-      <w:pPr>
-        <w:pBdr>
-          <w:left w:val="single" w:sz="12" w:space="6" w:color="A6A6A6"/>
-        </w:pBdr>
-        <w:shd w:val="clear" w:color="auto" w:fill="F2F2F2"/>
-        <w:ind w:left="180"/>
-      </w:pPr>
-      <w:r>
-        <w:rPr>
-          <w:rFonts w:ascii="Consolas" w:eastAsia="Consolas" w:hAnsi="Consolas" w:cs="Consolas"/>
-          <w:sz w:val="16"/>
-          <w:szCs w:val="16"/>
-        </w:rPr>
-        <w:t>- Census MARTS API: https://api.census.gov/data/timeseries/eits/marts</w:t>
-      </w:r>
-    </w:p>
-    <w:p>
-      <w:pPr>
-        <w:pBdr>
-          <w:left w:val="single" w:sz="12" w:space="6" w:color="A6A6A6"/>
-        </w:pBdr>
-        <w:shd w:val="clear" w:color="auto" w:fill="F2F2F2"/>
-        <w:ind w:left="180"/>
-      </w:pPr>
-      <w:r>
-        <w:rPr>
-          <w:rFonts w:ascii="Consolas" w:eastAsia="Consolas" w:hAnsi="Consolas" w:cs="Consolas"/>
-          <w:sz w:val="16"/>
-          <w:szCs w:val="16"/>
-        </w:rPr>
-        <w:t>- FRED: https://fred.stlouisfed.org/</w:t>
-      </w:r>
-    </w:p>
-    <w:p>
-      <w:pPr>
-        <w:pBdr>
-          <w:left w:val="single" w:sz="12" w:space="6" w:color="A6A6A6"/>
-        </w:pBdr>
-        <w:shd w:val="clear" w:color="auto" w:fill="F2F2F2"/>
-        <w:ind w:left="180"/>
-      </w:pPr>
-      <w:r>
-        <w:rPr>
-          <w:rFonts w:ascii="Consolas" w:eastAsia="Consolas" w:hAnsi="Consolas" w:cs="Consolas"/>
-          <w:sz w:val="16"/>
-          <w:szCs w:val="16"/>
-        </w:rPr>
-        <w:t>- Montgomery County item movement:</w:t>
-      </w:r>
-    </w:p>
-    <w:p>
-      <w:pPr>
-        <w:pBdr>
-          <w:left w:val="single" w:sz="12" w:space="6" w:color="A6A6A6"/>
-        </w:pBdr>
-        <w:shd w:val="clear" w:color="auto" w:fill="F2F2F2"/>
-        <w:ind w:left="180"/>
-      </w:pPr>
-      <w:r>
-        <w:rPr>
-          <w:rFonts w:ascii="Consolas" w:eastAsia="Consolas" w:hAnsi="Consolas" w:cs="Consolas"/>
-          <w:sz w:val="16"/>
-          <w:szCs w:val="16"/>
-        </w:rPr>
-        <w:lastRenderedPageBreak/>
+        <w:spacing w:before="120"/>
+        <w:ind w:left="180"/>
+      </w:pPr>
+      <w:r>
+        <w:rPr>
+          <w:rFonts w:ascii="Consolas" w:eastAsia="Consolas" w:hAnsi="Consolas" w:cs="Consolas"/>
+          <w:sz w:val="16"/>
+          <w:szCs w:val="16"/>
+        </w:rPr>
+        <w:t xml:space="preserve">## Working as an independent developer</w:t>
+      </w:r>
+    </w:p>
+    <w:p>
+      <w:pPr>
+        <w:pBdr>
+          <w:left w:val="single" w:sz="12" w:space="6" w:color="A6A6A6"/>
+        </w:pBdr>
+        <w:shd w:val="clear" w:color="auto" w:fill="F2F2F2"/>
+        <w:spacing w:before="120"/>
+        <w:ind w:left="180"/>
+      </w:pPr>
+      <w:r>
+        <w:rPr>
+          <w:rFonts w:ascii="Consolas" w:eastAsia="Consolas" w:hAnsi="Consolas" w:cs="Consolas"/>
+          <w:sz w:val="16"/>
+          <w:szCs w:val="16"/>
+        </w:rPr>
+        <w:t xml:space="preserve">Solo projects and lean teams rarely have a separate QA function or a</w:t>
+      </w:r>
+    </w:p>
+    <w:p>
+      <w:pPr>
+        <w:pBdr>
+          <w:left w:val="single" w:sz="12" w:space="6" w:color="A6A6A6"/>
+        </w:pBdr>
+        <w:shd w:val="clear" w:color="auto" w:fill="F2F2F2"/>
+        <w:spacing w:before="120"/>
+        <w:ind w:left="180"/>
+      </w:pPr>
+      <w:r>
+        <w:rPr>
+          <w:rFonts w:ascii="Consolas" w:eastAsia="Consolas" w:hAnsi="Consolas" w:cs="Consolas"/>
+          <w:sz w:val="16"/>
+          <w:szCs w:val="16"/>
+        </w:rPr>
+        <w:t xml:space="preserve">reviewer waiting on every change. The developer has to:</w:t>
+      </w:r>
+    </w:p>
+    <w:p>
+      <w:pPr>
+        <w:pBdr>
+          <w:left w:val="single" w:sz="12" w:space="6" w:color="A6A6A6"/>
+        </w:pBdr>
+        <w:shd w:val="clear" w:color="auto" w:fill="F2F2F2"/>
+        <w:spacing w:before="120"/>
+        <w:ind w:left="180"/>
+      </w:pPr>
+      <w:r>
+        <w:rPr>
+          <w:rFonts w:ascii="Consolas" w:eastAsia="Consolas" w:hAnsi="Consolas" w:cs="Consolas"/>
+          <w:sz w:val="16"/>
+          <w:szCs w:val="16"/>
+        </w:rPr>
+        <w:t xml:space="preserve">- test their own work, at the point where each defect is cheapest to find</w:t>
+      </w:r>
+    </w:p>
+    <w:p>
+      <w:pPr>
+        <w:pBdr>
+          <w:left w:val="single" w:sz="12" w:space="6" w:color="A6A6A6"/>
+        </w:pBdr>
+        <w:shd w:val="clear" w:color="auto" w:fill="F2F2F2"/>
+        <w:spacing w:before="120"/>
+        <w:ind w:left="180"/>
+      </w:pPr>
+      <w:r>
+        <w:rPr>
+          <w:rFonts w:ascii="Consolas" w:eastAsia="Consolas" w:hAnsi="Consolas" w:cs="Consolas"/>
+          <w:sz w:val="16"/>
+          <w:szCs w:val="16"/>
+        </w:rPr>
+        <w:t xml:space="preserve">- make assumptions explicit and check them against the source</w:t>
+      </w:r>
+    </w:p>
+    <w:p>
+      <w:pPr>
+        <w:pBdr>
+          <w:left w:val="single" w:sz="12" w:space="6" w:color="A6A6A6"/>
+        </w:pBdr>
+        <w:shd w:val="clear" w:color="auto" w:fill="F2F2F2"/>
+        <w:spacing w:before="120"/>
+        <w:ind w:left="180"/>
+      </w:pPr>
+      <w:r>
+        <w:rPr>
+          <w:rFonts w:ascii="Consolas" w:eastAsia="Consolas" w:hAnsi="Consolas" w:cs="Consolas"/>
+          <w:sz w:val="16"/>
+          <w:szCs w:val="16"/>
+        </w:rPr>
+        <w:t xml:space="preserve">- document the work for people who were not there when it was built</w:t>
+      </w:r>
+    </w:p>
+    <w:p>
+      <w:pPr>
+        <w:pBdr>
+          <w:left w:val="single" w:sz="12" w:space="6" w:color="A6A6A6"/>
+        </w:pBdr>
+        <w:shd w:val="clear" w:color="auto" w:fill="F2F2F2"/>
+        <w:spacing w:before="120"/>
+        <w:ind w:left="180"/>
+      </w:pPr>
+      <w:r>
+        <w:rPr>
+          <w:rFonts w:ascii="Consolas" w:eastAsia="Consolas" w:hAnsi="Consolas" w:cs="Consolas"/>
+          <w:sz w:val="16"/>
+          <w:szCs w:val="16"/>
+        </w:rPr>
+        <w:t xml:space="preserve">- ship without waiting for a peer review that is not coming</w:t>
+      </w:r>
+    </w:p>
+    <w:p>
+      <w:pPr>
+        <w:pBdr>
+          <w:left w:val="single" w:sz="12" w:space="6" w:color="A6A6A6"/>
+        </w:pBdr>
+        <w:shd w:val="clear" w:color="auto" w:fill="F2F2F2"/>
+        <w:spacing w:before="120"/>
+        <w:ind w:left="180"/>
+      </w:pPr>
+      <w:r>
+        <w:rPr>
+          <w:rFonts w:ascii="Consolas" w:eastAsia="Consolas" w:hAnsi="Consolas" w:cs="Consolas"/>
+          <w:sz w:val="16"/>
+          <w:szCs w:val="16"/>
+        </w:rPr>
+        <w:t xml:space="preserve"> </w:t>
+      </w:r>
+    </w:p>
+    <w:p>
+      <w:pPr>
+        <w:pBdr>
+          <w:left w:val="single" w:sz="12" w:space="6" w:color="A6A6A6"/>
+        </w:pBdr>
+        <w:shd w:val="clear" w:color="auto" w:fill="F2F2F2"/>
+        <w:spacing w:before="120"/>
+        <w:ind w:left="180"/>
+      </w:pPr>
+      <w:r>
+        <w:rPr>
+          <w:rFonts w:ascii="Consolas" w:eastAsia="Consolas" w:hAnsi="Consolas" w:cs="Consolas"/>
+          <w:sz w:val="16"/>
+          <w:szCs w:val="16"/>
+        </w:rPr>
+        <w:t xml:space="preserve">This project is built for that reality. Its QA is planned, written down</w:t>
+      </w:r>
+    </w:p>
+    <w:p>
+      <w:pPr>
+        <w:pBdr>
+          <w:left w:val="single" w:sz="12" w:space="6" w:color="A6A6A6"/>
+        </w:pBdr>
+        <w:shd w:val="clear" w:color="auto" w:fill="F2F2F2"/>
+        <w:spacing w:before="120"/>
+        <w:ind w:left="180"/>
+      </w:pPr>
+      <w:r>
+        <w:rPr>
+          <w:rFonts w:ascii="Consolas" w:eastAsia="Consolas" w:hAnsi="Consolas" w:cs="Consolas"/>
+          <w:sz w:val="16"/>
+          <w:szCs w:val="16"/>
+        </w:rPr>
+        <w:t xml:space="preserve">and recorded rather than assumed.</w:t>
+      </w:r>
+    </w:p>
+    <w:p>
+      <w:pPr>
+        <w:pBdr>
+          <w:left w:val="single" w:sz="12" w:space="6" w:color="A6A6A6"/>
+        </w:pBdr>
+        <w:shd w:val="clear" w:color="auto" w:fill="F2F2F2"/>
+        <w:spacing w:before="120"/>
+        <w:ind w:left="180"/>
+      </w:pPr>
+      <w:r>
+        <w:rPr>
+          <w:rFonts w:ascii="Consolas" w:eastAsia="Consolas" w:hAnsi="Consolas" w:cs="Consolas"/>
+          <w:sz w:val="16"/>
+          <w:szCs w:val="16"/>
+        </w:rPr>
+        <w:t xml:space="preserve"> </w:t>
+      </w:r>
+    </w:p>
+    <w:p>
+      <w:pPr>
+        <w:pBdr>
+          <w:left w:val="single" w:sz="12" w:space="6" w:color="A6A6A6"/>
+        </w:pBdr>
+        <w:shd w:val="clear" w:color="auto" w:fill="F2F2F2"/>
+        <w:spacing w:before="120"/>
+        <w:ind w:left="180"/>
+      </w:pPr>
+      <w:r>
+        <w:rPr>
+          <w:rFonts w:ascii="Consolas" w:eastAsia="Consolas" w:hAnsi="Consolas" w:cs="Consolas"/>
+          <w:sz w:val="16"/>
+          <w:szCs w:val="16"/>
+        </w:rPr>
+        <w:t xml:space="preserve">### How the work is checked</w:t>
+      </w:r>
+    </w:p>
+    <w:p>
+      <w:pPr>
+        <w:pBdr>
+          <w:left w:val="single" w:sz="12" w:space="6" w:color="A6A6A6"/>
+        </w:pBdr>
+        <w:shd w:val="clear" w:color="auto" w:fill="F2F2F2"/>
+        <w:spacing w:before="120"/>
+        <w:ind w:left="180"/>
+      </w:pPr>
+      <w:r>
+        <w:rPr>
+          <w:rFonts w:ascii="Consolas" w:eastAsia="Consolas" w:hAnsi="Consolas" w:cs="Consolas"/>
+          <w:sz w:val="16"/>
+          <w:szCs w:val="16"/>
+        </w:rPr>
+        <w:t xml:space="preserve">- **Validation gates, not a final test.** Ten gates run from repository</w:t>
+      </w:r>
+    </w:p>
+    <w:p>
+      <w:pPr>
+        <w:pBdr>
+          <w:left w:val="single" w:sz="12" w:space="6" w:color="A6A6A6"/>
+        </w:pBdr>
+        <w:shd w:val="clear" w:color="auto" w:fill="F2F2F2"/>
+        <w:spacing w:before="120"/>
+        <w:ind w:left="180"/>
+      </w:pPr>
+      <w:r>
+        <w:rPr>
+          <w:rFonts w:ascii="Consolas" w:eastAsia="Consolas" w:hAnsi="Consolas" w:cs="Consolas"/>
+          <w:sz w:val="16"/>
+          <w:szCs w:val="16"/>
+        </w:rPr>
+        <w:t xml:space="preserve">  setup to packaging. Each names the checks that must pass before the</w:t>
+      </w:r>
+    </w:p>
+    <w:p>
+      <w:pPr>
+        <w:pBdr>
+          <w:left w:val="single" w:sz="12" w:space="6" w:color="A6A6A6"/>
+        </w:pBdr>
+        <w:shd w:val="clear" w:color="auto" w:fill="F2F2F2"/>
+        <w:spacing w:before="120"/>
+        <w:ind w:left="180"/>
+      </w:pPr>
+      <w:r>
+        <w:rPr>
+          <w:rFonts w:ascii="Consolas" w:eastAsia="Consolas" w:hAnsi="Consolas" w:cs="Consolas"/>
+          <w:sz w:val="16"/>
+          <w:szCs w:val="16"/>
+        </w:rPr>
+        <w:t xml:space="preserve">  next phase starts - a SQL script's row count, a measure folder's</w:t>
+      </w:r>
+    </w:p>
+    <w:p>
+      <w:pPr>
+        <w:pBdr>
+          <w:left w:val="single" w:sz="12" w:space="6" w:color="A6A6A6"/>
+        </w:pBdr>
+        <w:shd w:val="clear" w:color="auto" w:fill="F2F2F2"/>
+        <w:spacing w:before="120"/>
+        <w:ind w:left="180"/>
+      </w:pPr>
+      <w:r>
+        <w:rPr>
+          <w:rFonts w:ascii="Consolas" w:eastAsia="Consolas" w:hAnsi="Consolas" w:cs="Consolas"/>
+          <w:sz w:val="16"/>
+          <w:szCs w:val="16"/>
+        </w:rPr>
+        <w:t xml:space="preserve">  closing check, a report page's review.</w:t>
+      </w:r>
+    </w:p>
+    <w:p>
+      <w:pPr>
+        <w:pBdr>
+          <w:left w:val="single" w:sz="12" w:space="6" w:color="A6A6A6"/>
+        </w:pBdr>
+        <w:shd w:val="clear" w:color="auto" w:fill="F2F2F2"/>
+        <w:spacing w:before="120"/>
+        <w:ind w:left="180"/>
+      </w:pPr>
+      <w:r>
+        <w:rPr>
+          <w:rFonts w:ascii="Consolas" w:eastAsia="Consolas" w:hAnsi="Consolas" w:cs="Consolas"/>
+          <w:sz w:val="16"/>
+          <w:szCs w:val="16"/>
+        </w:rPr>
+        <w:t xml:space="preserve">  See [document 25](docs/25_Validation_Timing_Guide.docx) and its</w:t>
+      </w:r>
+    </w:p>
+    <w:p>
+      <w:pPr>
+        <w:pBdr>
+          <w:left w:val="single" w:sz="12" w:space="6" w:color="A6A6A6"/>
+        </w:pBdr>
+        <w:shd w:val="clear" w:color="auto" w:fill="F2F2F2"/>
+        <w:spacing w:before="120"/>
+        <w:ind w:left="180"/>
+      </w:pPr>
+      <w:r>
+        <w:rPr>
+          <w:rFonts w:ascii="Consolas" w:eastAsia="Consolas" w:hAnsi="Consolas" w:cs="Consolas"/>
+          <w:sz w:val="16"/>
+          <w:szCs w:val="16"/>
+        </w:rPr>
+        <w:t xml:space="preserve">  checklist, [document 26](docs/26_Validation_Timing_Checklist.xlsx).</w:t>
+      </w:r>
+    </w:p>
+    <w:p>
+      <w:pPr>
+        <w:pBdr>
+          <w:left w:val="single" w:sz="12" w:space="6" w:color="A6A6A6"/>
+        </w:pBdr>
+        <w:shd w:val="clear" w:color="auto" w:fill="F2F2F2"/>
+        <w:spacing w:before="120"/>
+        <w:ind w:left="180"/>
+      </w:pPr>
+      <w:r>
+        <w:rPr>
+          <w:rFonts w:ascii="Consolas" w:eastAsia="Consolas" w:hAnsi="Consolas" w:cs="Consolas"/>
+          <w:sz w:val="16"/>
+          <w:szCs w:val="16"/>
+        </w:rPr>
+        <w:t xml:space="preserve">- **Seventeen pre-publication checks, in two passes.** Twelve test the</w:t>
+      </w:r>
+    </w:p>
+    <w:p>
+      <w:pPr>
+        <w:pBdr>
+          <w:left w:val="single" w:sz="12" w:space="6" w:color="A6A6A6"/>
+        </w:pBdr>
+        <w:shd w:val="clear" w:color="auto" w:fill="F2F2F2"/>
+        <w:spacing w:before="120"/>
+        <w:ind w:left="180"/>
+      </w:pPr>
+      <w:r>
+        <w:rPr>
+          <w:rFonts w:ascii="Consolas" w:eastAsia="Consolas" w:hAnsi="Consolas" w:cs="Consolas"/>
+          <w:sz w:val="16"/>
+          <w:szCs w:val="16"/>
+        </w:rPr>
+        <w:t xml:space="preserve">  data and measures before the model is published; five test the report</w:t>
+      </w:r>
+    </w:p>
+    <w:p>
+      <w:pPr>
+        <w:pBdr>
+          <w:left w:val="single" w:sz="12" w:space="6" w:color="A6A6A6"/>
+        </w:pBdr>
+        <w:shd w:val="clear" w:color="auto" w:fill="F2F2F2"/>
+        <w:spacing w:before="120"/>
+        <w:ind w:left="180"/>
+      </w:pPr>
+      <w:r>
+        <w:rPr>
+          <w:rFonts w:ascii="Consolas" w:eastAsia="Consolas" w:hAnsi="Consolas" w:cs="Consolas"/>
+          <w:sz w:val="16"/>
+          <w:szCs w:val="16"/>
+        </w:rPr>
+        <w:t xml:space="preserve">  pages before each report is published. Every run is recorded with its</w:t>
+      </w:r>
+    </w:p>
+    <w:p>
+      <w:pPr>
+        <w:pBdr>
+          <w:left w:val="single" w:sz="12" w:space="6" w:color="A6A6A6"/>
+        </w:pBdr>
+        <w:shd w:val="clear" w:color="auto" w:fill="F2F2F2"/>
+        <w:spacing w:before="120"/>
+        <w:ind w:left="180"/>
+      </w:pPr>
+      <w:r>
+        <w:rPr>
+          <w:rFonts w:ascii="Consolas" w:eastAsia="Consolas" w:hAnsi="Consolas" w:cs="Consolas"/>
+          <w:sz w:val="16"/>
+          <w:szCs w:val="16"/>
+        </w:rPr>
+        <w:t xml:space="preserve">  date and observed values in</w:t>
+      </w:r>
+    </w:p>
+    <w:p>
+      <w:pPr>
+        <w:pBdr>
+          <w:left w:val="single" w:sz="12" w:space="6" w:color="A6A6A6"/>
+        </w:pBdr>
+        <w:shd w:val="clear" w:color="auto" w:fill="F2F2F2"/>
+        <w:spacing w:before="120"/>
+        <w:ind w:left="180"/>
+      </w:pPr>
+      <w:r>
+        <w:rPr>
+          <w:rFonts w:ascii="Consolas" w:eastAsia="Consolas" w:hAnsi="Consolas" w:cs="Consolas"/>
+          <w:sz w:val="16"/>
+          <w:szCs w:val="16"/>
+        </w:rPr>
+        <w:t xml:space="preserve">  [document 22](docs/22_Validation_Results.xlsx), and a failure stays</w:t>
+      </w:r>
+    </w:p>
+    <w:p>
+      <w:pPr>
+        <w:pBdr>
+          <w:left w:val="single" w:sz="12" w:space="6" w:color="A6A6A6"/>
+        </w:pBdr>
+        <w:shd w:val="clear" w:color="auto" w:fill="F2F2F2"/>
+        <w:spacing w:before="120"/>
+        <w:ind w:left="180"/>
+      </w:pPr>
+      <w:r>
+        <w:rPr>
+          <w:rFonts w:ascii="Consolas" w:eastAsia="Consolas" w:hAnsi="Consolas" w:cs="Consolas"/>
+          <w:sz w:val="16"/>
+          <w:szCs w:val="16"/>
+        </w:rPr>
+        <w:t xml:space="preserve">  open until a later run re-verifies it.</w:t>
+      </w:r>
+    </w:p>
+    <w:p>
+      <w:pPr>
+        <w:pBdr>
+          <w:left w:val="single" w:sz="12" w:space="6" w:color="A6A6A6"/>
+        </w:pBdr>
+        <w:shd w:val="clear" w:color="auto" w:fill="F2F2F2"/>
+        <w:spacing w:before="120"/>
+        <w:ind w:left="180"/>
+      </w:pPr>
+      <w:r>
+        <w:rPr>
+          <w:rFonts w:ascii="Consolas" w:eastAsia="Consolas" w:hAnsi="Consolas" w:cs="Consolas"/>
+          <w:sz w:val="16"/>
+          <w:szCs w:val="16"/>
+        </w:rPr>
+        <w:t xml:space="preserve">- **Re-validation after the build.** A data reload, an edited measure or</w:t>
+      </w:r>
+    </w:p>
+    <w:p>
+      <w:pPr>
+        <w:pBdr>
+          <w:left w:val="single" w:sz="12" w:space="6" w:color="A6A6A6"/>
+        </w:pBdr>
+        <w:shd w:val="clear" w:color="auto" w:fill="F2F2F2"/>
+        <w:spacing w:before="120"/>
+        <w:ind w:left="180"/>
+      </w:pPr>
+      <w:r>
+        <w:rPr>
+          <w:rFonts w:ascii="Consolas" w:eastAsia="Consolas" w:hAnsi="Consolas" w:cs="Consolas"/>
+          <w:sz w:val="16"/>
+          <w:szCs w:val="16"/>
+        </w:rPr>
+        <w:t xml:space="preserve">  a changed visual each has a defined set of checks to re-run, so the</w:t>
+      </w:r>
+    </w:p>
+    <w:p>
+      <w:pPr>
+        <w:pBdr>
+          <w:left w:val="single" w:sz="12" w:space="6" w:color="A6A6A6"/>
+        </w:pBdr>
+        <w:shd w:val="clear" w:color="auto" w:fill="F2F2F2"/>
+        <w:spacing w:before="120"/>
+        <w:ind w:left="180"/>
+      </w:pPr>
+      <w:r>
+        <w:rPr>
+          <w:rFonts w:ascii="Consolas" w:eastAsia="Consolas" w:hAnsi="Consolas" w:cs="Consolas"/>
+          <w:sz w:val="16"/>
+          <w:szCs w:val="16"/>
+        </w:rPr>
+        <w:t xml:space="preserve">  reports stay correct after the day they were finished.</w:t>
+      </w:r>
+    </w:p>
+    <w:p>
+      <w:pPr>
+        <w:pBdr>
+          <w:left w:val="single" w:sz="12" w:space="6" w:color="A6A6A6"/>
+        </w:pBdr>
+        <w:shd w:val="clear" w:color="auto" w:fill="F2F2F2"/>
+        <w:spacing w:before="120"/>
+        <w:ind w:left="180"/>
+      </w:pPr>
+      <w:r>
+        <w:rPr>
+          <w:rFonts w:ascii="Consolas" w:eastAsia="Consolas" w:hAnsi="Consolas" w:cs="Consolas"/>
+          <w:sz w:val="16"/>
+          <w:szCs w:val="16"/>
+        </w:rPr>
+        <w:t xml:space="preserve">- **A written procedure per check.** Each of the seventeen checks has</w:t>
+      </w:r>
+    </w:p>
+    <w:p>
+      <w:pPr>
+        <w:pBdr>
+          <w:left w:val="single" w:sz="12" w:space="6" w:color="A6A6A6"/>
+        </w:pBdr>
+        <w:shd w:val="clear" w:color="auto" w:fill="F2F2F2"/>
+        <w:spacing w:before="120"/>
+        <w:ind w:left="180"/>
+      </w:pPr>
+      <w:r>
+        <w:rPr>
+          <w:rFonts w:ascii="Consolas" w:eastAsia="Consolas" w:hAnsi="Consolas" w:cs="Consolas"/>
+          <w:sz w:val="16"/>
+          <w:szCs w:val="16"/>
+        </w:rPr>
+        <w:t xml:space="preserve">  its own step-by-step document in [docs/validation/](docs/validation/),</w:t>
+      </w:r>
+    </w:p>
+    <w:p>
+      <w:pPr>
+        <w:pBdr>
+          <w:left w:val="single" w:sz="12" w:space="6" w:color="A6A6A6"/>
+        </w:pBdr>
+        <w:shd w:val="clear" w:color="auto" w:fill="F2F2F2"/>
+        <w:spacing w:before="120"/>
+        <w:ind w:left="180"/>
+      </w:pPr>
+      <w:r>
+        <w:rPr>
+          <w:rFonts w:ascii="Consolas" w:eastAsia="Consolas" w:hAnsi="Consolas" w:cs="Consolas"/>
+          <w:sz w:val="16"/>
+          <w:szCs w:val="16"/>
+        </w:rPr>
+        <w:t xml:space="preserve">  V01 through V17, written for someone who has never run it: every</w:t>
+      </w:r>
+    </w:p>
+    <w:p>
+      <w:pPr>
+        <w:pBdr>
+          <w:left w:val="single" w:sz="12" w:space="6" w:color="A6A6A6"/>
+        </w:pBdr>
+        <w:shd w:val="clear" w:color="auto" w:fill="F2F2F2"/>
+        <w:spacing w:before="120"/>
+        <w:ind w:left="180"/>
+      </w:pPr>
+      <w:r>
+        <w:rPr>
+          <w:rFonts w:ascii="Consolas" w:eastAsia="Consolas" w:hAnsi="Consolas" w:cs="Consolas"/>
+          <w:sz w:val="16"/>
+          <w:szCs w:val="16"/>
+        </w:rPr>
+        <w:t xml:space="preserve">  click, the query to paste, how to decide pass or fail, and what to do</w:t>
+      </w:r>
+    </w:p>
+    <w:p>
+      <w:pPr>
+        <w:pBdr>
+          <w:left w:val="single" w:sz="12" w:space="6" w:color="A6A6A6"/>
+        </w:pBdr>
+        <w:shd w:val="clear" w:color="auto" w:fill="F2F2F2"/>
+        <w:spacing w:before="120"/>
+        <w:ind w:left="180"/>
+      </w:pPr>
+      <w:r>
+        <w:rPr>
+          <w:rFonts w:ascii="Consolas" w:eastAsia="Consolas" w:hAnsi="Consolas" w:cs="Consolas"/>
+          <w:sz w:val="16"/>
+          <w:szCs w:val="16"/>
+        </w:rPr>
+        <w:t xml:space="preserve">  when it fails. Each exists as a .docx to read and an .xlsx with a</w:t>
+      </w:r>
+    </w:p>
+    <w:p>
+      <w:pPr>
+        <w:pBdr>
+          <w:left w:val="single" w:sz="12" w:space="6" w:color="A6A6A6"/>
+        </w:pBdr>
+        <w:shd w:val="clear" w:color="auto" w:fill="F2F2F2"/>
+        <w:spacing w:before="120"/>
+        <w:ind w:left="180"/>
+      </w:pPr>
+      <w:r>
+        <w:rPr>
+          <w:rFonts w:ascii="Consolas" w:eastAsia="Consolas" w:hAnsi="Consolas" w:cs="Consolas"/>
+          <w:sz w:val="16"/>
+          <w:szCs w:val="16"/>
+        </w:rPr>
+        <w:t xml:space="preserve">  Pass/Fail drop-down on every step.</w:t>
+      </w:r>
+    </w:p>
+    <w:p>
+      <w:pPr>
+        <w:pBdr>
+          <w:left w:val="single" w:sz="12" w:space="6" w:color="A6A6A6"/>
+        </w:pBdr>
+        <w:shd w:val="clear" w:color="auto" w:fill="F2F2F2"/>
+        <w:spacing w:before="120"/>
+        <w:ind w:left="180"/>
+      </w:pPr>
+      <w:r>
+        <w:rPr>
+          <w:rFonts w:ascii="Consolas" w:eastAsia="Consolas" w:hAnsi="Consolas" w:cs="Consolas"/>
+          <w:sz w:val="16"/>
+          <w:szCs w:val="16"/>
+        </w:rPr>
+        <w:t xml:space="preserve">- **Checks anyone can repeat.** The SQL and DAX checks are written out</w:t>
+      </w:r>
+    </w:p>
+    <w:p>
+      <w:pPr>
+        <w:pBdr>
+          <w:left w:val="single" w:sz="12" w:space="6" w:color="A6A6A6"/>
+        </w:pBdr>
+        <w:shd w:val="clear" w:color="auto" w:fill="F2F2F2"/>
+        <w:spacing w:before="120"/>
+        <w:ind w:left="180"/>
+      </w:pPr>
+      <w:r>
+        <w:rPr>
+          <w:rFonts w:ascii="Consolas" w:eastAsia="Consolas" w:hAnsi="Consolas" w:cs="Consolas"/>
+          <w:sz w:val="16"/>
+          <w:szCs w:val="16"/>
+        </w:rPr>
+        <w:t xml:space="preserve">  ready to paste, so a reviewer can re-run them and get the same answer.</w:t>
+      </w:r>
+    </w:p>
+    <w:p>
+      <w:pPr>
+        <w:pBdr>
+          <w:left w:val="single" w:sz="12" w:space="6" w:color="A6A6A6"/>
+        </w:pBdr>
+        <w:shd w:val="clear" w:color="auto" w:fill="F2F2F2"/>
+        <w:spacing w:before="120"/>
+        <w:ind w:left="180"/>
+      </w:pPr>
+      <w:r>
+        <w:rPr>
+          <w:rFonts w:ascii="Consolas" w:eastAsia="Consolas" w:hAnsi="Consolas" w:cs="Consolas"/>
+          <w:sz w:val="16"/>
+          <w:szCs w:val="16"/>
+        </w:rPr>
+        <w:t xml:space="preserve"> </w:t>
+      </w:r>
+    </w:p>
+    <w:p>
+      <w:pPr>
+        <w:pBdr>
+          <w:left w:val="single" w:sz="12" w:space="6" w:color="A6A6A6"/>
+        </w:pBdr>
+        <w:shd w:val="clear" w:color="auto" w:fill="F2F2F2"/>
+        <w:spacing w:before="120"/>
+        <w:ind w:left="180"/>
+      </w:pPr>
+      <w:r>
+        <w:rPr>
+          <w:rFonts w:ascii="Consolas" w:eastAsia="Consolas" w:hAnsi="Consolas" w:cs="Consolas"/>
+          <w:sz w:val="16"/>
+          <w:szCs w:val="16"/>
+        </w:rPr>
+        <w:t xml:space="preserve">### How the work is made reproducible</w:t>
+      </w:r>
+    </w:p>
+    <w:p>
+      <w:pPr>
+        <w:pBdr>
+          <w:left w:val="single" w:sz="12" w:space="6" w:color="A6A6A6"/>
+        </w:pBdr>
+        <w:shd w:val="clear" w:color="auto" w:fill="F2F2F2"/>
+        <w:spacing w:before="120"/>
+        <w:ind w:left="180"/>
+      </w:pPr>
+      <w:r>
+        <w:rPr>
+          <w:rFonts w:ascii="Consolas" w:eastAsia="Consolas" w:hAnsi="Consolas" w:cs="Consolas"/>
+          <w:sz w:val="16"/>
+          <w:szCs w:val="16"/>
+        </w:rPr>
+        <w:t xml:space="preserve">- The eight scripts in sql/ rebuild the warehouse from the public CSV,</w:t>
+      </w:r>
+    </w:p>
+    <w:p>
+      <w:pPr>
+        <w:pBdr>
+          <w:left w:val="single" w:sz="12" w:space="6" w:color="A6A6A6"/>
+        </w:pBdr>
+        <w:shd w:val="clear" w:color="auto" w:fill="F2F2F2"/>
+        <w:spacing w:before="120"/>
+        <w:ind w:left="180"/>
+      </w:pPr>
+      <w:r>
+        <w:rPr>
+          <w:rFonts w:ascii="Consolas" w:eastAsia="Consolas" w:hAnsi="Consolas" w:cs="Consolas"/>
+          <w:sz w:val="16"/>
+          <w:szCs w:val="16"/>
+        </w:rPr>
+        <w:t xml:space="preserve">  in order, with no manual step.</w:t>
+      </w:r>
+    </w:p>
+    <w:p>
+      <w:pPr>
+        <w:pBdr>
+          <w:left w:val="single" w:sz="12" w:space="6" w:color="A6A6A6"/>
+        </w:pBdr>
+        <w:shd w:val="clear" w:color="auto" w:fill="F2F2F2"/>
+        <w:spacing w:before="120"/>
+        <w:ind w:left="180"/>
+      </w:pPr>
+      <w:r>
+        <w:rPr>
+          <w:rFonts w:ascii="Consolas" w:eastAsia="Consolas" w:hAnsi="Consolas" w:cs="Consolas"/>
+          <w:sz w:val="16"/>
+          <w:szCs w:val="16"/>
+        </w:rPr>
+        <w:t xml:space="preserve">- Everything machine-specific is isolated: the SQL Server name, and</w:t>
+      </w:r>
+    </w:p>
+    <w:p>
+      <w:pPr>
+        <w:pBdr>
+          <w:left w:val="single" w:sz="12" w:space="6" w:color="A6A6A6"/>
+        </w:pBdr>
+        <w:shd w:val="clear" w:color="auto" w:fill="F2F2F2"/>
+        <w:spacing w:before="120"/>
+        <w:ind w:left="180"/>
+      </w:pPr>
+      <w:r>
+        <w:rPr>
+          <w:rFonts w:ascii="Consolas" w:eastAsia="Consolas" w:hAnsi="Consolas" w:cs="Consolas"/>
+          <w:sz w:val="16"/>
+          <w:szCs w:val="16"/>
+        </w:rPr>
+        <w:t xml:space="preserve">  Power Query parameters for the Census API key and the location of</w:t>
+      </w:r>
+    </w:p>
+    <w:p>
+      <w:pPr>
+        <w:pBdr>
+          <w:left w:val="single" w:sz="12" w:space="6" w:color="A6A6A6"/>
+        </w:pBdr>
+        <w:shd w:val="clear" w:color="auto" w:fill="F2F2F2"/>
+        <w:spacing w:before="120"/>
+        <w:ind w:left="180"/>
+      </w:pPr>
+      <w:r>
+        <w:rPr>
+          <w:rFonts w:ascii="Consolas" w:eastAsia="Consolas" w:hAnsi="Consolas" w:cs="Consolas"/>
+          <w:sz w:val="16"/>
+          <w:szCs w:val="16"/>
+        </w:rPr>
+        <w:t xml:space="preserve">  RefMappings.xlsx. The key is never committed.</w:t>
+      </w:r>
+    </w:p>
+    <w:p>
+      <w:pPr>
+        <w:pBdr>
+          <w:left w:val="single" w:sz="12" w:space="6" w:color="A6A6A6"/>
+        </w:pBdr>
+        <w:shd w:val="clear" w:color="auto" w:fill="F2F2F2"/>
+        <w:spacing w:before="120"/>
+        <w:ind w:left="180"/>
+      </w:pPr>
+      <w:r>
+        <w:rPr>
+          <w:rFonts w:ascii="Consolas" w:eastAsia="Consolas" w:hAnsi="Consolas" w:cs="Consolas"/>
+          <w:sz w:val="16"/>
+          <w:szCs w:val="16"/>
+        </w:rPr>
+        <w:t xml:space="preserve">- The model and reports are saved as PBIP, so every measure change is a</w:t>
+      </w:r>
+    </w:p>
+    <w:p>
+      <w:pPr>
+        <w:pBdr>
+          <w:left w:val="single" w:sz="12" w:space="6" w:color="A6A6A6"/>
+        </w:pBdr>
+        <w:shd w:val="clear" w:color="auto" w:fill="F2F2F2"/>
+        <w:spacing w:before="120"/>
+        <w:ind w:left="180"/>
+      </w:pPr>
+      <w:r>
+        <w:rPr>
+          <w:rFonts w:ascii="Consolas" w:eastAsia="Consolas" w:hAnsi="Consolas" w:cs="Consolas"/>
+          <w:sz w:val="16"/>
+          <w:szCs w:val="16"/>
+        </w:rPr>
+        <w:t xml:space="preserve">  readable diff in the commit history.</w:t>
+      </w:r>
+    </w:p>
+    <w:p>
+      <w:pPr>
+        <w:pBdr>
+          <w:left w:val="single" w:sz="12" w:space="6" w:color="A6A6A6"/>
+        </w:pBdr>
+        <w:shd w:val="clear" w:color="auto" w:fill="F2F2F2"/>
+        <w:spacing w:before="120"/>
+        <w:ind w:left="180"/>
+      </w:pPr>
+      <w:r>
+        <w:rPr>
+          <w:rFonts w:ascii="Consolas" w:eastAsia="Consolas" w:hAnsi="Consolas" w:cs="Consolas"/>
+          <w:sz w:val="16"/>
+          <w:szCs w:val="16"/>
+        </w:rPr>
+        <w:t xml:space="preserve">- One shared semantic model means one definition of every number: a</w:t>
+      </w:r>
+    </w:p>
+    <w:p>
+      <w:pPr>
+        <w:pBdr>
+          <w:left w:val="single" w:sz="12" w:space="6" w:color="A6A6A6"/>
+        </w:pBdr>
+        <w:shd w:val="clear" w:color="auto" w:fill="F2F2F2"/>
+        <w:spacing w:before="120"/>
+        <w:ind w:left="180"/>
+      </w:pPr>
+      <w:r>
+        <w:rPr>
+          <w:rFonts w:ascii="Consolas" w:eastAsia="Consolas" w:hAnsi="Consolas" w:cs="Consolas"/>
+          <w:sz w:val="16"/>
+          <w:szCs w:val="16"/>
+        </w:rPr>
+        <w:t xml:space="preserve">  measure changes in one place and all three reports follow.</w:t>
+      </w:r>
+    </w:p>
+    <w:p>
+      <w:pPr>
+        <w:pBdr>
+          <w:left w:val="single" w:sz="12" w:space="6" w:color="A6A6A6"/>
+        </w:pBdr>
+        <w:shd w:val="clear" w:color="auto" w:fill="F2F2F2"/>
+        <w:spacing w:before="120"/>
+        <w:ind w:left="180"/>
+      </w:pPr>
+      <w:r>
+        <w:rPr>
+          <w:rFonts w:ascii="Consolas" w:eastAsia="Consolas" w:hAnsi="Consolas" w:cs="Consolas"/>
+          <w:sz w:val="16"/>
+          <w:szCs w:val="16"/>
+        </w:rPr>
+        <w:t xml:space="preserve"> </w:t>
+      </w:r>
+    </w:p>
+    <w:p>
+      <w:pPr>
+        <w:pBdr>
+          <w:left w:val="single" w:sz="12" w:space="6" w:color="A6A6A6"/>
+        </w:pBdr>
+        <w:shd w:val="clear" w:color="auto" w:fill="F2F2F2"/>
+        <w:spacing w:before="120"/>
+        <w:ind w:left="180"/>
+      </w:pPr>
+      <w:r>
+        <w:rPr>
+          <w:rFonts w:ascii="Consolas" w:eastAsia="Consolas" w:hAnsi="Consolas" w:cs="Consolas"/>
+          <w:sz w:val="16"/>
+          <w:szCs w:val="16"/>
+        </w:rPr>
+        <w:t xml:space="preserve">### How the work is documented</w:t>
+      </w:r>
+    </w:p>
+    <w:p>
+      <w:pPr>
+        <w:pBdr>
+          <w:left w:val="single" w:sz="12" w:space="6" w:color="A6A6A6"/>
+        </w:pBdr>
+        <w:shd w:val="clear" w:color="auto" w:fill="F2F2F2"/>
+        <w:spacing w:before="120"/>
+        <w:ind w:left="180"/>
+      </w:pPr>
+      <w:r>
+        <w:rPr>
+          <w:rFonts w:ascii="Consolas" w:eastAsia="Consolas" w:hAnsi="Consolas" w:cs="Consolas"/>
+          <w:sz w:val="16"/>
+          <w:szCs w:val="16"/>
+        </w:rPr>
+        <w:t xml:space="preserve">- A numbered document set in docs/ runs from the project plan (01)</w:t>
+      </w:r>
+    </w:p>
+    <w:p>
+      <w:pPr>
+        <w:pBdr>
+          <w:left w:val="single" w:sz="12" w:space="6" w:color="A6A6A6"/>
+        </w:pBdr>
+        <w:shd w:val="clear" w:color="auto" w:fill="F2F2F2"/>
+        <w:spacing w:before="120"/>
+        <w:ind w:left="180"/>
+      </w:pPr>
+      <w:r>
+        <w:rPr>
+          <w:rFonts w:ascii="Consolas" w:eastAsia="Consolas" w:hAnsi="Consolas" w:cs="Consolas"/>
+          <w:sz w:val="16"/>
+          <w:szCs w:val="16"/>
+        </w:rPr>
+        <w:t xml:space="preserve">  through data setup (02), report specifications (15), the data</w:t>
+      </w:r>
+    </w:p>
+    <w:p>
+      <w:pPr>
+        <w:pBdr>
+          <w:left w:val="single" w:sz="12" w:space="6" w:color="A6A6A6"/>
+        </w:pBdr>
+        <w:shd w:val="clear" w:color="auto" w:fill="F2F2F2"/>
+        <w:spacing w:before="120"/>
+        <w:ind w:left="180"/>
+      </w:pPr>
+      <w:r>
+        <w:rPr>
+          <w:rFonts w:ascii="Consolas" w:eastAsia="Consolas" w:hAnsi="Consolas" w:cs="Consolas"/>
+          <w:sz w:val="16"/>
+          <w:szCs w:val="16"/>
+        </w:rPr>
+        <w:t xml:space="preserve">  dictionary (20) and glossary (23) to validation (22, 25, 26), with</w:t>
+      </w:r>
+    </w:p>
+    <w:p>
+      <w:pPr>
+        <w:pBdr>
+          <w:left w:val="single" w:sz="12" w:space="6" w:color="A6A6A6"/>
+        </w:pBdr>
+        <w:shd w:val="clear" w:color="auto" w:fill="F2F2F2"/>
+        <w:spacing w:before="120"/>
+        <w:ind w:left="180"/>
+      </w:pPr>
+      <w:r>
+        <w:rPr>
+          <w:rFonts w:ascii="Consolas" w:eastAsia="Consolas" w:hAnsi="Consolas" w:cs="Consolas"/>
+          <w:sz w:val="16"/>
+          <w:szCs w:val="16"/>
+        </w:rPr>
+        <w:t xml:space="preserve">  the per-check procedures in docs/validation/.</w:t>
+      </w:r>
+    </w:p>
+    <w:p>
+      <w:pPr>
+        <w:pBdr>
+          <w:left w:val="single" w:sz="12" w:space="6" w:color="A6A6A6"/>
+        </w:pBdr>
+        <w:shd w:val="clear" w:color="auto" w:fill="F2F2F2"/>
+        <w:spacing w:before="120"/>
+        <w:ind w:left="180"/>
+      </w:pPr>
+      <w:r>
+        <w:rPr>
+          <w:rFonts w:ascii="Consolas" w:eastAsia="Consolas" w:hAnsi="Consolas" w:cs="Consolas"/>
+          <w:sz w:val="16"/>
+          <w:szCs w:val="16"/>
+        </w:rPr>
+        <w:t xml:space="preserve">- Design decisions are recorded where they are made, with the reason -</w:t>
+      </w:r>
+    </w:p>
+    <w:p>
+      <w:pPr>
+        <w:pBdr>
+          <w:left w:val="single" w:sz="12" w:space="6" w:color="A6A6A6"/>
+        </w:pBdr>
+        <w:shd w:val="clear" w:color="auto" w:fill="F2F2F2"/>
+        <w:spacing w:before="120"/>
+        <w:ind w:left="180"/>
+      </w:pPr>
+      <w:r>
+        <w:rPr>
+          <w:rFonts w:ascii="Consolas" w:eastAsia="Consolas" w:hAnsi="Consolas" w:cs="Consolas"/>
+          <w:sz w:val="16"/>
+          <w:szCs w:val="16"/>
+        </w:rPr>
+        <w:t xml:space="preserve">  why the date dimension is monthly, why cases and dollars are never</w:t>
+      </w:r>
+    </w:p>
+    <w:p>
+      <w:pPr>
+        <w:pBdr>
+          <w:left w:val="single" w:sz="12" w:space="6" w:color="A6A6A6"/>
+        </w:pBdr>
+        <w:shd w:val="clear" w:color="auto" w:fill="F2F2F2"/>
+        <w:spacing w:before="120"/>
+        <w:ind w:left="180"/>
+      </w:pPr>
+      <w:r>
+        <w:rPr>
+          <w:rFonts w:ascii="Consolas" w:eastAsia="Consolas" w:hAnsi="Consolas" w:cs="Consolas"/>
+          <w:sz w:val="16"/>
+          <w:szCs w:val="16"/>
+        </w:rPr>
+        <w:t xml:space="preserve">  compared as levels, why the reports carry no measures of their own.</w:t>
+      </w:r>
+    </w:p>
+    <w:p>
+      <w:pPr>
+        <w:pBdr>
+          <w:left w:val="single" w:sz="12" w:space="6" w:color="A6A6A6"/>
+        </w:pBdr>
+        <w:shd w:val="clear" w:color="auto" w:fill="F2F2F2"/>
+        <w:spacing w:before="120"/>
+        <w:ind w:left="180"/>
+      </w:pPr>
+      <w:r>
+        <w:rPr>
+          <w:rFonts w:ascii="Consolas" w:eastAsia="Consolas" w:hAnsi="Consolas" w:cs="Consolas"/>
+          <w:sz w:val="16"/>
+          <w:szCs w:val="16"/>
+        </w:rPr>
+        <w:t xml:space="preserve">- Limitations are stated on this page and in document 01 section 8,</w:t>
+      </w:r>
+    </w:p>
+    <w:p>
+      <w:pPr>
+        <w:pBdr>
+          <w:left w:val="single" w:sz="12" w:space="6" w:color="A6A6A6"/>
+        </w:pBdr>
+        <w:shd w:val="clear" w:color="auto" w:fill="F2F2F2"/>
+        <w:spacing w:before="120"/>
+        <w:ind w:left="180"/>
+      </w:pPr>
+      <w:r>
+        <w:rPr>
+          <w:rFonts w:ascii="Consolas" w:eastAsia="Consolas" w:hAnsi="Consolas" w:cs="Consolas"/>
+          <w:sz w:val="16"/>
+          <w:szCs w:val="16"/>
+        </w:rPr>
+        <w:t xml:space="preserve">  not left for a reviewer to discover.</w:t>
+      </w:r>
+    </w:p>
+    <w:p>
+      <w:pPr>
+        <w:pBdr>
+          <w:left w:val="single" w:sz="12" w:space="6" w:color="A6A6A6"/>
+        </w:pBdr>
+        <w:shd w:val="clear" w:color="auto" w:fill="F2F2F2"/>
+        <w:spacing w:before="120"/>
+        <w:ind w:left="180"/>
+      </w:pPr>
+      <w:r>
+        <w:rPr>
+          <w:rFonts w:ascii="Consolas" w:eastAsia="Consolas" w:hAnsi="Consolas" w:cs="Consolas"/>
+          <w:sz w:val="16"/>
+          <w:szCs w:val="16"/>
+        </w:rPr>
+        <w:t xml:space="preserve"> </w:t>
+      </w:r>
+    </w:p>
+    <w:p>
+      <w:pPr>
+        <w:pBdr>
+          <w:left w:val="single" w:sz="12" w:space="6" w:color="A6A6A6"/>
+        </w:pBdr>
+        <w:shd w:val="clear" w:color="auto" w:fill="F2F2F2"/>
+        <w:spacing w:before="120"/>
+        <w:ind w:left="180"/>
+      </w:pPr>
+      <w:r>
+        <w:rPr>
+          <w:rFonts w:ascii="Consolas" w:eastAsia="Consolas" w:hAnsi="Consolas" w:cs="Consolas"/>
+          <w:sz w:val="16"/>
+          <w:szCs w:val="16"/>
+        </w:rPr>
+        <w:t xml:space="preserve">### AI-assisted review</w:t>
+      </w:r>
+    </w:p>
+    <w:p>
+      <w:pPr>
+        <w:pBdr>
+          <w:left w:val="single" w:sz="12" w:space="6" w:color="A6A6A6"/>
+        </w:pBdr>
+        <w:shd w:val="clear" w:color="auto" w:fill="F2F2F2"/>
+        <w:spacing w:before="120"/>
+        <w:ind w:left="180"/>
+      </w:pPr>
+      <w:r>
+        <w:rPr>
+          <w:rFonts w:ascii="Consolas" w:eastAsia="Consolas" w:hAnsi="Consolas" w:cs="Consolas"/>
+          <w:sz w:val="16"/>
+          <w:szCs w:val="16"/>
+        </w:rPr>
+        <w:t xml:space="preserve">With no second developer, an AI assistant stands in as reviewer. It is</w:t>
+      </w:r>
+    </w:p>
+    <w:p>
+      <w:pPr>
+        <w:pBdr>
+          <w:left w:val="single" w:sz="12" w:space="6" w:color="A6A6A6"/>
+        </w:pBdr>
+        <w:shd w:val="clear" w:color="auto" w:fill="F2F2F2"/>
+        <w:spacing w:before="120"/>
+        <w:ind w:left="180"/>
+      </w:pPr>
+      <w:r>
+        <w:rPr>
+          <w:rFonts w:ascii="Consolas" w:eastAsia="Consolas" w:hAnsi="Consolas" w:cs="Consolas"/>
+          <w:sz w:val="16"/>
+          <w:szCs w:val="16"/>
+        </w:rPr>
+        <w:t xml:space="preserve">used to challenge assumptions, to check claims against primary sources -</w:t>
+      </w:r>
+    </w:p>
+    <w:p>
+      <w:pPr>
+        <w:pBdr>
+          <w:left w:val="single" w:sz="12" w:space="6" w:color="A6A6A6"/>
+        </w:pBdr>
+        <w:shd w:val="clear" w:color="auto" w:fill="F2F2F2"/>
+        <w:spacing w:before="120"/>
+        <w:ind w:left="180"/>
+      </w:pPr>
+      <w:r>
+        <w:rPr>
+          <w:rFonts w:ascii="Consolas" w:eastAsia="Consolas" w:hAnsi="Consolas" w:cs="Consolas"/>
+          <w:sz w:val="16"/>
+          <w:szCs w:val="16"/>
+        </w:rPr>
+        <w:t xml:space="preserve">Microsoft Learn and the Census and FRED documentation - and to look for</w:t>
+      </w:r>
+    </w:p>
+    <w:p>
+      <w:pPr>
+        <w:pBdr>
+          <w:left w:val="single" w:sz="12" w:space="6" w:color="A6A6A6"/>
+        </w:pBdr>
+        <w:shd w:val="clear" w:color="auto" w:fill="F2F2F2"/>
+        <w:spacing w:before="120"/>
+        <w:ind w:left="180"/>
+      </w:pPr>
+      <w:r>
+        <w:rPr>
+          <w:rFonts w:ascii="Consolas" w:eastAsia="Consolas" w:hAnsi="Consolas" w:cs="Consolas"/>
+          <w:sz w:val="16"/>
+          <w:szCs w:val="16"/>
+        </w:rPr>
+        <w:t xml:space="preserve">contradictions across the document set. The developer reviews and</w:t>
+      </w:r>
+    </w:p>
+    <w:p>
+      <w:pPr>
+        <w:pBdr>
+          <w:left w:val="single" w:sz="12" w:space="6" w:color="A6A6A6"/>
+        </w:pBdr>
+        <w:shd w:val="clear" w:color="auto" w:fill="F2F2F2"/>
+        <w:spacing w:before="120"/>
+        <w:ind w:left="180"/>
+      </w:pPr>
+      <w:r>
+        <w:rPr>
+          <w:rFonts w:ascii="Consolas" w:eastAsia="Consolas" w:hAnsi="Consolas" w:cs="Consolas"/>
+          <w:sz w:val="16"/>
+          <w:szCs w:val="16"/>
+        </w:rPr>
+        <w:t xml:space="preserve">approves every change before it is committed, and every document states</w:t>
+      </w:r>
+    </w:p>
+    <w:p>
+      <w:pPr>
+        <w:pBdr>
+          <w:left w:val="single" w:sz="12" w:space="6" w:color="A6A6A6"/>
+        </w:pBdr>
+        <w:shd w:val="clear" w:color="auto" w:fill="F2F2F2"/>
+        <w:spacing w:before="120"/>
+        <w:ind w:left="180"/>
+      </w:pPr>
+      <w:r>
+        <w:rPr>
+          <w:rFonts w:ascii="Consolas" w:eastAsia="Consolas" w:hAnsi="Consolas" w:cs="Consolas"/>
+          <w:sz w:val="16"/>
+          <w:szCs w:val="16"/>
+        </w:rPr>
+        <w:t xml:space="preserve">how AI assistance was used.</w:t>
+      </w:r>
+    </w:p>
+    <w:p>
+      <w:pPr>
+        <w:pBdr>
+          <w:left w:val="single" w:sz="12" w:space="6" w:color="A6A6A6"/>
+        </w:pBdr>
+        <w:shd w:val="clear" w:color="auto" w:fill="F2F2F2"/>
+        <w:spacing w:before="120"/>
+        <w:ind w:left="180"/>
+      </w:pPr>
+      <w:r>
+        <w:rPr>
+          <w:rFonts w:ascii="Consolas" w:eastAsia="Consolas" w:hAnsi="Consolas" w:cs="Consolas"/>
+          <w:sz w:val="16"/>
+          <w:szCs w:val="16"/>
+        </w:rPr>
+        <w:t xml:space="preserve"> </w:t>
+      </w:r>
+    </w:p>
+    <w:p>
+      <w:pPr>
+        <w:pBdr>
+          <w:left w:val="single" w:sz="12" w:space="6" w:color="A6A6A6"/>
+        </w:pBdr>
+        <w:shd w:val="clear" w:color="auto" w:fill="F2F2F2"/>
+        <w:spacing w:before="120"/>
+        <w:ind w:left="180"/>
+      </w:pPr>
+      <w:r>
+        <w:rPr>
+          <w:rFonts w:ascii="Consolas" w:eastAsia="Consolas" w:hAnsi="Consolas" w:cs="Consolas"/>
+          <w:sz w:val="16"/>
+          <w:szCs w:val="16"/>
+        </w:rPr>
+        <w:t xml:space="preserve">In practice this review has caught cross-references pointing at the</w:t>
+      </w:r>
+    </w:p>
+    <w:p>
+      <w:pPr>
+        <w:pBdr>
+          <w:left w:val="single" w:sz="12" w:space="6" w:color="A6A6A6"/>
+        </w:pBdr>
+        <w:shd w:val="clear" w:color="auto" w:fill="F2F2F2"/>
+        <w:spacing w:before="120"/>
+        <w:ind w:left="180"/>
+      </w:pPr>
+      <w:r>
+        <w:rPr>
+          <w:rFonts w:ascii="Consolas" w:eastAsia="Consolas" w:hAnsi="Consolas" w:cs="Consolas"/>
+          <w:sz w:val="16"/>
+          <w:szCs w:val="16"/>
+        </w:rPr>
+        <w:t xml:space="preserve">wrong section, a diagram showing the wrong SQL script numbers and a</w:t>
+      </w:r>
+    </w:p>
+    <w:p>
+      <w:pPr>
+        <w:pBdr>
+          <w:left w:val="single" w:sz="12" w:space="6" w:color="A6A6A6"/>
+        </w:pBdr>
+        <w:shd w:val="clear" w:color="auto" w:fill="F2F2F2"/>
+        <w:spacing w:before="120"/>
+        <w:ind w:left="180"/>
+      </w:pPr>
+      <w:r>
+        <w:rPr>
+          <w:rFonts w:ascii="Consolas" w:eastAsia="Consolas" w:hAnsi="Consolas" w:cs="Consolas"/>
+          <w:sz w:val="16"/>
+          <w:szCs w:val="16"/>
+        </w:rPr>
+        <w:t xml:space="preserve">mislabelled query file - the kind of errors a second pair of eyes</w:t>
+      </w:r>
+    </w:p>
+    <w:p>
+      <w:pPr>
+        <w:pBdr>
+          <w:left w:val="single" w:sz="12" w:space="6" w:color="A6A6A6"/>
+        </w:pBdr>
+        <w:shd w:val="clear" w:color="auto" w:fill="F2F2F2"/>
+        <w:spacing w:before="120"/>
+        <w:ind w:left="180"/>
+      </w:pPr>
+      <w:r>
+        <w:rPr>
+          <w:rFonts w:ascii="Consolas" w:eastAsia="Consolas" w:hAnsi="Consolas" w:cs="Consolas"/>
+          <w:sz w:val="16"/>
+          <w:szCs w:val="16"/>
+        </w:rPr>
+        <w:t xml:space="preserve">exists to find.</w:t>
+      </w:r>
+    </w:p>
+    <w:p>
+      <w:pPr>
+        <w:pBdr>
+          <w:left w:val="single" w:sz="12" w:space="6" w:color="A6A6A6"/>
+        </w:pBdr>
+        <w:shd w:val="clear" w:color="auto" w:fill="F2F2F2"/>
+        <w:spacing w:before="120"/>
+        <w:ind w:left="180"/>
+      </w:pPr>
+      <w:r>
+        <w:rPr>
+          <w:rFonts w:ascii="Consolas" w:eastAsia="Consolas" w:hAnsi="Consolas" w:cs="Consolas"/>
+          <w:sz w:val="16"/>
+          <w:szCs w:val="16"/>
+        </w:rPr>
+        <w:t xml:space="preserve"> </w:t>
+      </w:r>
+    </w:p>
+    <w:p>
+      <w:pPr>
+        <w:pBdr>
+          <w:left w:val="single" w:sz="12" w:space="6" w:color="A6A6A6"/>
+        </w:pBdr>
+        <w:shd w:val="clear" w:color="auto" w:fill="F2F2F2"/>
+        <w:spacing w:before="120"/>
+        <w:ind w:left="180"/>
+      </w:pPr>
+      <w:r>
+        <w:rPr>
+          <w:rFonts w:ascii="Consolas" w:eastAsia="Consolas" w:hAnsi="Consolas" w:cs="Consolas"/>
+          <w:sz w:val="16"/>
+          <w:szCs w:val="16"/>
+        </w:rPr>
+        <w:t xml:space="preserve">## Data sources (not redistributed here)</w:t>
+      </w:r>
+    </w:p>
+    <w:p>
+      <w:pPr>
+        <w:pBdr>
+          <w:left w:val="single" w:sz="12" w:space="6" w:color="A6A6A6"/>
+        </w:pBdr>
+        <w:shd w:val="clear" w:color="auto" w:fill="F2F2F2"/>
+        <w:spacing w:before="120"/>
+        <w:ind w:left="180"/>
+      </w:pPr>
+      <w:r>
+        <w:rPr>
+          <w:rFonts w:ascii="Consolas" w:eastAsia="Consolas" w:hAnsi="Consolas" w:cs="Consolas"/>
+          <w:sz w:val="16"/>
+          <w:szCs w:val="16"/>
+        </w:rPr>
+        <w:t xml:space="preserve">- Census MARTS API: https://api.census.gov/data/timeseries/eits/marts</w:t>
+      </w:r>
+    </w:p>
+    <w:p>
+      <w:pPr>
+        <w:pBdr>
+          <w:left w:val="single" w:sz="12" w:space="6" w:color="A6A6A6"/>
+        </w:pBdr>
+        <w:shd w:val="clear" w:color="auto" w:fill="F2F2F2"/>
+        <w:spacing w:before="120"/>
+        <w:ind w:left="180"/>
+      </w:pPr>
+      <w:r>
+        <w:rPr>
+          <w:rFonts w:ascii="Consolas" w:eastAsia="Consolas" w:hAnsi="Consolas" w:cs="Consolas"/>
+          <w:sz w:val="16"/>
+          <w:szCs w:val="16"/>
+        </w:rPr>
+        <w:t xml:space="preserve">- FRED: https://fred.stlouisfed.org/</w:t>
+      </w:r>
+    </w:p>
+    <w:p>
+      <w:pPr>
+        <w:pBdr>
+          <w:left w:val="single" w:sz="12" w:space="6" w:color="A6A6A6"/>
+        </w:pBdr>
+        <w:shd w:val="clear" w:color="auto" w:fill="F2F2F2"/>
+        <w:spacing w:before="120"/>
+        <w:ind w:left="180"/>
+      </w:pPr>
+      <w:r>
+        <w:rPr>
+          <w:rFonts w:ascii="Consolas" w:eastAsia="Consolas" w:hAnsi="Consolas" w:cs="Consolas"/>
+          <w:sz w:val="16"/>
+          <w:szCs w:val="16"/>
+        </w:rPr>
+        <w:t xml:space="preserve">- Montgomery County item movement:</w:t>
+      </w:r>
+    </w:p>
+    <w:p>
+      <w:pPr>
+        <w:pBdr>
+          <w:left w:val="single" w:sz="12" w:space="6" w:color="A6A6A6"/>
+        </w:pBdr>
+        <w:shd w:val="clear" w:color="auto" w:fill="F2F2F2"/>
+        <w:spacing w:before="120"/>
+        <w:ind w:left="180"/>
+      </w:pPr>
+      <w:r>
+        <w:rPr>
+          <w:rFonts w:ascii="Consolas" w:eastAsia="Consolas" w:hAnsi="Consolas" w:cs="Consolas"/>
+          <w:sz w:val="16"/>
+          <w:szCs w:val="16"/>
+        </w:rPr>
         <w:t xml:space="preserve">  https://catalog.data.gov/dataset/warehouse-and-retail-sales</w:t>
       </w:r>
     </w:p>
@@ -10438,6 +11824,7 @@
           <w:left w:val="single" w:sz="12" w:space="6" w:color="A6A6A6"/>
         </w:pBdr>
         <w:shd w:val="clear" w:color="auto" w:fill="F2F2F2"/>
+        <w:spacing w:before="120"/>
         <w:ind w:left="180"/>
       </w:pPr>
       <w:r>
@@ -10455,300 +11842,241 @@
           <w:left w:val="single" w:sz="12" w:space="6" w:color="A6A6A6"/>
         </w:pBdr>
         <w:shd w:val="clear" w:color="auto" w:fill="F2F2F2"/>
-        <w:ind w:left="180"/>
-      </w:pPr>
-      <w:r>
-        <w:rPr>
-          <w:rFonts w:ascii="Consolas" w:eastAsia="Consolas" w:hAnsi="Consolas" w:cs="Consolas"/>
-          <w:sz w:val="16"/>
-          <w:szCs w:val="16"/>
-        </w:rPr>
-        <w:t>## Repository map</w:t>
-      </w:r>
-    </w:p>
-    <w:p>
-      <w:pPr>
-        <w:pBdr>
-          <w:left w:val="single" w:sz="12" w:space="6" w:color="A6A6A6"/>
-        </w:pBdr>
-        <w:shd w:val="clear" w:color="auto" w:fill="F2F2F2"/>
-        <w:ind w:left="180"/>
-      </w:pPr>
-      <w:r>
-        <w:rPr>
-          <w:rFonts w:ascii="Consolas" w:eastAsia="Consolas" w:hAnsi="Consolas" w:cs="Consolas"/>
-          <w:sz w:val="16"/>
-          <w:szCs w:val="16"/>
-        </w:rPr>
-        <w:t>| Folder | Contents |</w:t>
-      </w:r>
-    </w:p>
-    <w:p>
-      <w:pPr>
-        <w:pBdr>
-          <w:left w:val="single" w:sz="12" w:space="6" w:color="A6A6A6"/>
-        </w:pBdr>
-        <w:shd w:val="clear" w:color="auto" w:fill="F2F2F2"/>
-        <w:ind w:left="180"/>
-      </w:pPr>
-      <w:r>
-        <w:rPr>
-          <w:rFonts w:ascii="Consolas" w:eastAsia="Consolas" w:hAnsi="Consolas" w:cs="Consolas"/>
-          <w:sz w:val="16"/>
-          <w:szCs w:val="16"/>
-        </w:rPr>
-        <w:t>|---|---|</w:t>
-      </w:r>
-    </w:p>
-    <w:p>
-      <w:pPr>
-        <w:pBdr>
-          <w:left w:val="single" w:sz="12" w:space="6" w:color="A6A6A6"/>
-        </w:pBdr>
-        <w:shd w:val="clear" w:color="auto" w:fill="F2F2F2"/>
-        <w:ind w:left="180"/>
-      </w:pPr>
-      <w:r>
-        <w:rPr>
-          <w:rFonts w:ascii="Consolas" w:eastAsia="Consolas" w:hAnsi="Consolas" w:cs="Consolas"/>
-          <w:sz w:val="16"/>
-          <w:szCs w:val="16"/>
-        </w:rPr>
-        <w:t>| docs/ | Numbered document set (00, 01, 02, 12, 13, 14, 15, 20, 21, 22, 23, 25, 26) |</w:t>
-      </w:r>
-    </w:p>
-    <w:p>
-      <w:pPr>
-        <w:pBdr>
-          <w:left w:val="single" w:sz="12" w:space="6" w:color="A6A6A6"/>
-        </w:pBdr>
-        <w:shd w:val="clear" w:color="auto" w:fill="F2F2F2"/>
-        <w:ind w:left="180"/>
-      </w:pPr>
-      <w:r>
-        <w:rPr>
-          <w:rFonts w:ascii="Consolas" w:eastAsia="Consolas" w:hAnsi="Consolas" w:cs="Consolas"/>
-          <w:sz w:val="16"/>
-          <w:szCs w:val="16"/>
-        </w:rPr>
-        <w:t xml:space="preserve">| </w:t>
-      </w:r>
-      <w:proofErr w:type="spellStart"/>
-      <w:r>
-        <w:rPr>
-          <w:rFonts w:ascii="Consolas" w:eastAsia="Consolas" w:hAnsi="Consolas" w:cs="Consolas"/>
-          <w:sz w:val="16"/>
-          <w:szCs w:val="16"/>
-        </w:rPr>
-        <w:t>sql</w:t>
-      </w:r>
-      <w:proofErr w:type="spellEnd"/>
-      <w:r>
-        <w:rPr>
-          <w:rFonts w:ascii="Consolas" w:eastAsia="Consolas" w:hAnsi="Consolas" w:cs="Consolas"/>
-          <w:sz w:val="16"/>
-          <w:szCs w:val="16"/>
-        </w:rPr>
-        <w:t>/ | Warehouse build scripts, run 01 through 08 in order |</w:t>
-      </w:r>
-    </w:p>
-    <w:p>
-      <w:pPr>
-        <w:pBdr>
-          <w:left w:val="single" w:sz="12" w:space="6" w:color="A6A6A6"/>
-        </w:pBdr>
-        <w:shd w:val="clear" w:color="auto" w:fill="F2F2F2"/>
-        <w:ind w:left="180"/>
-      </w:pPr>
-      <w:r>
-        <w:rPr>
-          <w:rFonts w:ascii="Consolas" w:eastAsia="Consolas" w:hAnsi="Consolas" w:cs="Consolas"/>
-          <w:sz w:val="16"/>
-          <w:szCs w:val="16"/>
-        </w:rPr>
-        <w:t xml:space="preserve">| </w:t>
-      </w:r>
-      <w:proofErr w:type="spellStart"/>
-      <w:r>
-        <w:rPr>
-          <w:rFonts w:ascii="Consolas" w:eastAsia="Consolas" w:hAnsi="Consolas" w:cs="Consolas"/>
-          <w:sz w:val="16"/>
-          <w:szCs w:val="16"/>
-        </w:rPr>
-        <w:t>powerquery</w:t>
-      </w:r>
-      <w:proofErr w:type="spellEnd"/>
-      <w:r>
-        <w:rPr>
-          <w:rFonts w:ascii="Consolas" w:eastAsia="Consolas" w:hAnsi="Consolas" w:cs="Consolas"/>
-          <w:sz w:val="16"/>
-          <w:szCs w:val="16"/>
-        </w:rPr>
-        <w:t>/ | M source for the API and file queries |</w:t>
-      </w:r>
-    </w:p>
-    <w:p>
-      <w:pPr>
-        <w:pBdr>
-          <w:left w:val="single" w:sz="12" w:space="6" w:color="A6A6A6"/>
-        </w:pBdr>
-        <w:shd w:val="clear" w:color="auto" w:fill="F2F2F2"/>
-        <w:ind w:left="180"/>
-      </w:pPr>
-      <w:r>
-        <w:rPr>
-          <w:rFonts w:ascii="Consolas" w:eastAsia="Consolas" w:hAnsi="Consolas" w:cs="Consolas"/>
-          <w:sz w:val="16"/>
-          <w:szCs w:val="16"/>
-        </w:rPr>
-        <w:t xml:space="preserve">| </w:t>
-      </w:r>
-      <w:proofErr w:type="spellStart"/>
-      <w:r>
-        <w:rPr>
-          <w:rFonts w:ascii="Consolas" w:eastAsia="Consolas" w:hAnsi="Consolas" w:cs="Consolas"/>
-          <w:sz w:val="16"/>
-          <w:szCs w:val="16"/>
-        </w:rPr>
-        <w:t>dax</w:t>
-      </w:r>
-      <w:proofErr w:type="spellEnd"/>
-      <w:r>
-        <w:rPr>
-          <w:rFonts w:ascii="Consolas" w:eastAsia="Consolas" w:hAnsi="Consolas" w:cs="Consolas"/>
-          <w:sz w:val="16"/>
-          <w:szCs w:val="16"/>
-        </w:rPr>
-        <w:t>/ | Measure catalog by display folder |</w:t>
-      </w:r>
-    </w:p>
-    <w:p>
-      <w:pPr>
-        <w:pBdr>
-          <w:left w:val="single" w:sz="12" w:space="6" w:color="A6A6A6"/>
-        </w:pBdr>
-        <w:shd w:val="clear" w:color="auto" w:fill="F2F2F2"/>
-        <w:ind w:left="180"/>
-      </w:pPr>
-      <w:r>
-        <w:rPr>
-          <w:rFonts w:ascii="Consolas" w:eastAsia="Consolas" w:hAnsi="Consolas" w:cs="Consolas"/>
-          <w:sz w:val="16"/>
-          <w:szCs w:val="16"/>
-        </w:rPr>
-        <w:t xml:space="preserve">| </w:t>
-      </w:r>
-      <w:proofErr w:type="spellStart"/>
-      <w:r>
-        <w:rPr>
-          <w:rFonts w:ascii="Consolas" w:eastAsia="Consolas" w:hAnsi="Consolas" w:cs="Consolas"/>
-          <w:sz w:val="16"/>
-          <w:szCs w:val="16"/>
-        </w:rPr>
-        <w:t>pbip</w:t>
-      </w:r>
-      <w:proofErr w:type="spellEnd"/>
-      <w:r>
-        <w:rPr>
-          <w:rFonts w:ascii="Consolas" w:eastAsia="Consolas" w:hAnsi="Consolas" w:cs="Consolas"/>
-          <w:sz w:val="16"/>
-          <w:szCs w:val="16"/>
-        </w:rPr>
-        <w:t>/ | Power BI Project text - the diffable source |</w:t>
-      </w:r>
-    </w:p>
-    <w:p>
-      <w:pPr>
-        <w:pBdr>
-          <w:left w:val="single" w:sz="12" w:space="6" w:color="A6A6A6"/>
-        </w:pBdr>
-        <w:shd w:val="clear" w:color="auto" w:fill="F2F2F2"/>
-        <w:ind w:left="180"/>
-      </w:pPr>
-      <w:r>
-        <w:rPr>
-          <w:rFonts w:ascii="Consolas" w:eastAsia="Consolas" w:hAnsi="Consolas" w:cs="Consolas"/>
-          <w:sz w:val="16"/>
-          <w:szCs w:val="16"/>
-        </w:rPr>
-        <w:t xml:space="preserve">| </w:t>
-      </w:r>
-      <w:proofErr w:type="spellStart"/>
-      <w:r>
-        <w:rPr>
-          <w:rFonts w:ascii="Consolas" w:eastAsia="Consolas" w:hAnsi="Consolas" w:cs="Consolas"/>
-          <w:sz w:val="16"/>
-          <w:szCs w:val="16"/>
-        </w:rPr>
-        <w:t>pbix</w:t>
-      </w:r>
-      <w:proofErr w:type="spellEnd"/>
-      <w:r>
-        <w:rPr>
-          <w:rFonts w:ascii="Consolas" w:eastAsia="Consolas" w:hAnsi="Consolas" w:cs="Consolas"/>
-          <w:sz w:val="16"/>
-          <w:szCs w:val="16"/>
-        </w:rPr>
-        <w:t>/ | Four binaries: model + three reports |</w:t>
-      </w:r>
-    </w:p>
-    <w:p>
-      <w:pPr>
-        <w:pBdr>
-          <w:left w:val="single" w:sz="12" w:space="6" w:color="A6A6A6"/>
-        </w:pBdr>
-        <w:shd w:val="clear" w:color="auto" w:fill="F2F2F2"/>
-        <w:ind w:left="180"/>
-      </w:pPr>
-      <w:r>
-        <w:rPr>
-          <w:rFonts w:ascii="Consolas" w:eastAsia="Consolas" w:hAnsi="Consolas" w:cs="Consolas"/>
-          <w:sz w:val="16"/>
-          <w:szCs w:val="16"/>
-        </w:rPr>
-        <w:t>| reference/ | RefMappings.xlsx |</w:t>
-      </w:r>
-    </w:p>
-    <w:p>
-      <w:pPr>
-        <w:pBdr>
-          <w:left w:val="single" w:sz="12" w:space="6" w:color="A6A6A6"/>
-        </w:pBdr>
-        <w:shd w:val="clear" w:color="auto" w:fill="F2F2F2"/>
-        <w:ind w:left="180"/>
-      </w:pPr>
-      <w:r>
-        <w:rPr>
-          <w:rFonts w:ascii="Consolas" w:eastAsia="Consolas" w:hAnsi="Consolas" w:cs="Consolas"/>
-          <w:sz w:val="16"/>
-          <w:szCs w:val="16"/>
-        </w:rPr>
-        <w:t>| theme/ | Report theme JSON |</w:t>
-      </w:r>
-    </w:p>
-    <w:p>
-      <w:pPr>
-        <w:pBdr>
-          <w:left w:val="single" w:sz="12" w:space="6" w:color="A6A6A6"/>
-        </w:pBdr>
-        <w:shd w:val="clear" w:color="auto" w:fill="F2F2F2"/>
-        <w:ind w:left="180"/>
-      </w:pPr>
-      <w:r>
-        <w:rPr>
-          <w:rFonts w:ascii="Consolas" w:eastAsia="Consolas" w:hAnsi="Consolas" w:cs="Consolas"/>
-          <w:sz w:val="16"/>
-          <w:szCs w:val="16"/>
-        </w:rPr>
-        <w:t>| assets/ | Page and model screenshots |</w:t>
-      </w:r>
-    </w:p>
-    <w:p>
-      <w:pPr>
-        <w:pBdr>
-          <w:left w:val="single" w:sz="12" w:space="6" w:color="A6A6A6"/>
-        </w:pBdr>
-        <w:shd w:val="clear" w:color="auto" w:fill="F2F2F2"/>
+        <w:spacing w:before="120"/>
+        <w:ind w:left="180"/>
+      </w:pPr>
+      <w:r>
+        <w:rPr>
+          <w:rFonts w:ascii="Consolas" w:eastAsia="Consolas" w:hAnsi="Consolas" w:cs="Consolas"/>
+          <w:sz w:val="16"/>
+          <w:szCs w:val="16"/>
+        </w:rPr>
+        <w:t xml:space="preserve">## Repository map</w:t>
+      </w:r>
+    </w:p>
+    <w:p>
+      <w:pPr>
+        <w:pBdr>
+          <w:left w:val="single" w:sz="12" w:space="6" w:color="A6A6A6"/>
+        </w:pBdr>
+        <w:shd w:val="clear" w:color="auto" w:fill="F2F2F2"/>
+        <w:spacing w:before="120"/>
+        <w:ind w:left="180"/>
+      </w:pPr>
+      <w:r>
+        <w:rPr>
+          <w:rFonts w:ascii="Consolas" w:eastAsia="Consolas" w:hAnsi="Consolas" w:cs="Consolas"/>
+          <w:sz w:val="16"/>
+          <w:szCs w:val="16"/>
+        </w:rPr>
+        <w:t xml:space="preserve">| Folder | Contents |</w:t>
+      </w:r>
+    </w:p>
+    <w:p>
+      <w:pPr>
+        <w:pBdr>
+          <w:left w:val="single" w:sz="12" w:space="6" w:color="A6A6A6"/>
+        </w:pBdr>
+        <w:shd w:val="clear" w:color="auto" w:fill="F2F2F2"/>
+        <w:spacing w:before="120"/>
+        <w:ind w:left="180"/>
+      </w:pPr>
+      <w:r>
+        <w:rPr>
+          <w:rFonts w:ascii="Consolas" w:eastAsia="Consolas" w:hAnsi="Consolas" w:cs="Consolas"/>
+          <w:sz w:val="16"/>
+          <w:szCs w:val="16"/>
+        </w:rPr>
+        <w:t xml:space="preserve">|---|---|</w:t>
+      </w:r>
+    </w:p>
+    <w:p>
+      <w:pPr>
+        <w:pBdr>
+          <w:left w:val="single" w:sz="12" w:space="6" w:color="A6A6A6"/>
+        </w:pBdr>
+        <w:shd w:val="clear" w:color="auto" w:fill="F2F2F2"/>
+        <w:spacing w:before="120"/>
+        <w:ind w:left="180"/>
+      </w:pPr>
+      <w:r>
+        <w:rPr>
+          <w:rFonts w:ascii="Consolas" w:eastAsia="Consolas" w:hAnsi="Consolas" w:cs="Consolas"/>
+          <w:sz w:val="16"/>
+          <w:szCs w:val="16"/>
+        </w:rPr>
+        <w:t xml:space="preserve">| docs/ | Numbered documentation set (00, 01, 02, 12, 13, 14, 15, 20, 21, 22, 23, 25, 26) |</w:t>
+      </w:r>
+    </w:p>
+    <w:p>
+      <w:pPr>
+        <w:pBdr>
+          <w:left w:val="single" w:sz="12" w:space="6" w:color="A6A6A6"/>
+        </w:pBdr>
+        <w:shd w:val="clear" w:color="auto" w:fill="F2F2F2"/>
+        <w:spacing w:before="120"/>
+        <w:ind w:left="180"/>
+      </w:pPr>
+      <w:r>
+        <w:rPr>
+          <w:rFonts w:ascii="Consolas" w:eastAsia="Consolas" w:hAnsi="Consolas" w:cs="Consolas"/>
+          <w:sz w:val="16"/>
+          <w:szCs w:val="16"/>
+        </w:rPr>
+        <w:t xml:space="preserve">| docs/validation/ | One step-by-step procedure per check, V01 to V17, in .docx and .xlsx |</w:t>
+      </w:r>
+    </w:p>
+    <w:p>
+      <w:pPr>
+        <w:pBdr>
+          <w:left w:val="single" w:sz="12" w:space="6" w:color="A6A6A6"/>
+        </w:pBdr>
+        <w:shd w:val="clear" w:color="auto" w:fill="F2F2F2"/>
+        <w:spacing w:before="120"/>
+        <w:ind w:left="180"/>
+      </w:pPr>
+      <w:r>
+        <w:rPr>
+          <w:rFonts w:ascii="Consolas" w:eastAsia="Consolas" w:hAnsi="Consolas" w:cs="Consolas"/>
+          <w:sz w:val="16"/>
+          <w:szCs w:val="16"/>
+        </w:rPr>
+        <w:t xml:space="preserve">| sql/ | Warehouse build scripts, run 01 through 08 in order |</w:t>
+      </w:r>
+    </w:p>
+    <w:p>
+      <w:pPr>
+        <w:pBdr>
+          <w:left w:val="single" w:sz="12" w:space="6" w:color="A6A6A6"/>
+        </w:pBdr>
+        <w:shd w:val="clear" w:color="auto" w:fill="F2F2F2"/>
+        <w:spacing w:before="120"/>
+        <w:ind w:left="180"/>
+      </w:pPr>
+      <w:r>
+        <w:rPr>
+          <w:rFonts w:ascii="Consolas" w:eastAsia="Consolas" w:hAnsi="Consolas" w:cs="Consolas"/>
+          <w:sz w:val="16"/>
+          <w:szCs w:val="16"/>
+        </w:rPr>
+        <w:t xml:space="preserve">| powerquery/ | M source for the API and file queries |</w:t>
+      </w:r>
+    </w:p>
+    <w:p>
+      <w:pPr>
+        <w:pBdr>
+          <w:left w:val="single" w:sz="12" w:space="6" w:color="A6A6A6"/>
+        </w:pBdr>
+        <w:shd w:val="clear" w:color="auto" w:fill="F2F2F2"/>
+        <w:spacing w:before="120"/>
+        <w:ind w:left="180"/>
+      </w:pPr>
+      <w:r>
+        <w:rPr>
+          <w:rFonts w:ascii="Consolas" w:eastAsia="Consolas" w:hAnsi="Consolas" w:cs="Consolas"/>
+          <w:sz w:val="16"/>
+          <w:szCs w:val="16"/>
+        </w:rPr>
+        <w:t xml:space="preserve">| dax/ | Measure catalog by display folder |</w:t>
+      </w:r>
+    </w:p>
+    <w:p>
+      <w:pPr>
+        <w:pBdr>
+          <w:left w:val="single" w:sz="12" w:space="6" w:color="A6A6A6"/>
+        </w:pBdr>
+        <w:shd w:val="clear" w:color="auto" w:fill="F2F2F2"/>
+        <w:spacing w:before="120"/>
+        <w:ind w:left="180"/>
+      </w:pPr>
+      <w:r>
+        <w:rPr>
+          <w:rFonts w:ascii="Consolas" w:eastAsia="Consolas" w:hAnsi="Consolas" w:cs="Consolas"/>
+          <w:sz w:val="16"/>
+          <w:szCs w:val="16"/>
+        </w:rPr>
+        <w:t xml:space="preserve">| pbip/ | Power BI Project text - the diffable source |</w:t>
+      </w:r>
+    </w:p>
+    <w:p>
+      <w:pPr>
+        <w:pBdr>
+          <w:left w:val="single" w:sz="12" w:space="6" w:color="A6A6A6"/>
+        </w:pBdr>
+        <w:shd w:val="clear" w:color="auto" w:fill="F2F2F2"/>
+        <w:spacing w:before="120"/>
+        <w:ind w:left="180"/>
+      </w:pPr>
+      <w:r>
+        <w:rPr>
+          <w:rFonts w:ascii="Consolas" w:eastAsia="Consolas" w:hAnsi="Consolas" w:cs="Consolas"/>
+          <w:sz w:val="16"/>
+          <w:szCs w:val="16"/>
+        </w:rPr>
+        <w:t xml:space="preserve">| pbix/ | Four binaries: model + three reports |</w:t>
+      </w:r>
+    </w:p>
+    <w:p>
+      <w:pPr>
+        <w:pBdr>
+          <w:left w:val="single" w:sz="12" w:space="6" w:color="A6A6A6"/>
+        </w:pBdr>
+        <w:shd w:val="clear" w:color="auto" w:fill="F2F2F2"/>
+        <w:spacing w:before="120"/>
+        <w:ind w:left="180"/>
+      </w:pPr>
+      <w:r>
+        <w:rPr>
+          <w:rFonts w:ascii="Consolas" w:eastAsia="Consolas" w:hAnsi="Consolas" w:cs="Consolas"/>
+          <w:sz w:val="16"/>
+          <w:szCs w:val="16"/>
+        </w:rPr>
+        <w:t xml:space="preserve">| reference/ | RefMappings.xlsx |</w:t>
+      </w:r>
+    </w:p>
+    <w:p>
+      <w:pPr>
+        <w:pBdr>
+          <w:left w:val="single" w:sz="12" w:space="6" w:color="A6A6A6"/>
+        </w:pBdr>
+        <w:shd w:val="clear" w:color="auto" w:fill="F2F2F2"/>
+        <w:spacing w:before="120"/>
+        <w:ind w:left="180"/>
+      </w:pPr>
+      <w:r>
+        <w:rPr>
+          <w:rFonts w:ascii="Consolas" w:eastAsia="Consolas" w:hAnsi="Consolas" w:cs="Consolas"/>
+          <w:sz w:val="16"/>
+          <w:szCs w:val="16"/>
+        </w:rPr>
+        <w:t xml:space="preserve">| theme/ | Report theme JSON |</w:t>
+      </w:r>
+    </w:p>
+    <w:p>
+      <w:pPr>
+        <w:pBdr>
+          <w:left w:val="single" w:sz="12" w:space="6" w:color="A6A6A6"/>
+        </w:pBdr>
+        <w:shd w:val="clear" w:color="auto" w:fill="F2F2F2"/>
+        <w:spacing w:before="120"/>
+        <w:ind w:left="180"/>
+      </w:pPr>
+      <w:r>
+        <w:rPr>
+          <w:rFonts w:ascii="Consolas" w:eastAsia="Consolas" w:hAnsi="Consolas" w:cs="Consolas"/>
+          <w:sz w:val="16"/>
+          <w:szCs w:val="16"/>
+        </w:rPr>
+        <w:t xml:space="preserve">| assets/ | Page and model screenshots |</w:t>
+      </w:r>
+    </w:p>
+    <w:p>
+      <w:pPr>
+        <w:pBdr>
+          <w:left w:val="single" w:sz="12" w:space="6" w:color="A6A6A6"/>
+        </w:pBdr>
+        <w:shd w:val="clear" w:color="auto" w:fill="F2F2F2"/>
+        <w:spacing w:before="120"/>
         <w:ind w:left="180"/>
       </w:pPr>
       <w:r>
@@ -10766,67 +12094,70 @@
           <w:left w:val="single" w:sz="12" w:space="6" w:color="A6A6A6"/>
         </w:pBdr>
         <w:shd w:val="clear" w:color="auto" w:fill="F2F2F2"/>
-        <w:ind w:left="180"/>
-      </w:pPr>
-      <w:r>
-        <w:rPr>
-          <w:rFonts w:ascii="Consolas" w:eastAsia="Consolas" w:hAnsi="Consolas" w:cs="Consolas"/>
-          <w:sz w:val="16"/>
-          <w:szCs w:val="16"/>
-        </w:rPr>
-        <w:t>## Limitations</w:t>
-      </w:r>
-    </w:p>
-    <w:p>
-      <w:pPr>
-        <w:pBdr>
-          <w:left w:val="single" w:sz="12" w:space="6" w:color="A6A6A6"/>
-        </w:pBdr>
-        <w:shd w:val="clear" w:color="auto" w:fill="F2F2F2"/>
-        <w:ind w:left="180"/>
-      </w:pPr>
-      <w:r>
-        <w:rPr>
-          <w:rFonts w:ascii="Consolas" w:eastAsia="Consolas" w:hAnsi="Consolas" w:cs="Consolas"/>
-          <w:sz w:val="16"/>
-          <w:szCs w:val="16"/>
-        </w:rPr>
-        <w:t>Item-level data covers one Maryland county and one product category;</w:t>
-      </w:r>
-    </w:p>
-    <w:p>
-      <w:pPr>
-        <w:pBdr>
-          <w:left w:val="single" w:sz="12" w:space="6" w:color="A6A6A6"/>
-        </w:pBdr>
-        <w:shd w:val="clear" w:color="auto" w:fill="F2F2F2"/>
-        <w:ind w:left="180"/>
-      </w:pPr>
-      <w:r>
-        <w:rPr>
-          <w:rFonts w:ascii="Consolas" w:eastAsia="Consolas" w:hAnsi="Consolas" w:cs="Consolas"/>
-          <w:sz w:val="16"/>
-          <w:szCs w:val="16"/>
-        </w:rPr>
-        <w:t>it is used for grain, not for national inference. Regression coefficients</w:t>
-      </w:r>
-    </w:p>
-    <w:p>
-      <w:pPr>
-        <w:pBdr>
-          <w:left w:val="single" w:sz="12" w:space="6" w:color="A6A6A6"/>
-        </w:pBdr>
-        <w:shd w:val="clear" w:color="auto" w:fill="F2F2F2"/>
-        <w:spacing w:after="160"/>
-        <w:ind w:left="180"/>
-      </w:pPr>
-      <w:r>
-        <w:rPr>
-          <w:rFonts w:ascii="Consolas" w:eastAsia="Consolas" w:hAnsi="Consolas" w:cs="Consolas"/>
-          <w:sz w:val="16"/>
-          <w:szCs w:val="16"/>
-        </w:rPr>
-        <w:t>are descriptive, not inferential. See docs/01 section 8.</w:t>
+        <w:spacing w:before="120"/>
+        <w:ind w:left="180"/>
+      </w:pPr>
+      <w:r>
+        <w:rPr>
+          <w:rFonts w:ascii="Consolas" w:eastAsia="Consolas" w:hAnsi="Consolas" w:cs="Consolas"/>
+          <w:sz w:val="16"/>
+          <w:szCs w:val="16"/>
+        </w:rPr>
+        <w:t xml:space="preserve">## Limitations</w:t>
+      </w:r>
+    </w:p>
+    <w:p>
+      <w:pPr>
+        <w:pBdr>
+          <w:left w:val="single" w:sz="12" w:space="6" w:color="A6A6A6"/>
+        </w:pBdr>
+        <w:shd w:val="clear" w:color="auto" w:fill="F2F2F2"/>
+        <w:spacing w:before="120"/>
+        <w:ind w:left="180"/>
+      </w:pPr>
+      <w:r>
+        <w:rPr>
+          <w:rFonts w:ascii="Consolas" w:eastAsia="Consolas" w:hAnsi="Consolas" w:cs="Consolas"/>
+          <w:sz w:val="16"/>
+          <w:szCs w:val="16"/>
+        </w:rPr>
+        <w:t xml:space="preserve">Item-level data covers one Maryland county and one product category;</w:t>
+      </w:r>
+    </w:p>
+    <w:p>
+      <w:pPr>
+        <w:pBdr>
+          <w:left w:val="single" w:sz="12" w:space="6" w:color="A6A6A6"/>
+        </w:pBdr>
+        <w:shd w:val="clear" w:color="auto" w:fill="F2F2F2"/>
+        <w:spacing w:before="120"/>
+        <w:ind w:left="180"/>
+      </w:pPr>
+      <w:r>
+        <w:rPr>
+          <w:rFonts w:ascii="Consolas" w:eastAsia="Consolas" w:hAnsi="Consolas" w:cs="Consolas"/>
+          <w:sz w:val="16"/>
+          <w:szCs w:val="16"/>
+        </w:rPr>
+        <w:t xml:space="preserve">it is used for grain, not for national inference. Regression coefficients</w:t>
+      </w:r>
+    </w:p>
+    <w:p>
+      <w:pPr>
+        <w:pBdr>
+          <w:left w:val="single" w:sz="12" w:space="6" w:color="A6A6A6"/>
+        </w:pBdr>
+        <w:shd w:val="clear" w:color="auto" w:fill="F2F2F2"/>
+        <w:spacing w:before="120"/>
+        <w:ind w:left="180"/>
+      </w:pPr>
+      <w:r>
+        <w:rPr>
+          <w:rFonts w:ascii="Consolas" w:eastAsia="Consolas" w:hAnsi="Consolas" w:cs="Consolas"/>
+          <w:sz w:val="16"/>
+          <w:szCs w:val="16"/>
+        </w:rPr>
+        <w:t xml:space="preserve">are descriptive, not inferential. See docs/01 section 8.</w:t>
       </w:r>
     </w:p>
     <w:p>
@@ -14147,15 +15478,16 @@
           <w:sz w:val="16"/>
           <w:szCs w:val="16"/>
         </w:rPr>
-        <w:t># docs/</w:t>
-      </w:r>
-    </w:p>
-    <w:p>
-      <w:pPr>
-        <w:pBdr>
-          <w:left w:val="single" w:sz="12" w:space="6" w:color="A6A6A6"/>
-        </w:pBdr>
-        <w:shd w:val="clear" w:color="auto" w:fill="F2F2F2"/>
+        <w:t xml:space="preserve"># docs/</w:t>
+      </w:r>
+    </w:p>
+    <w:p>
+      <w:pPr>
+        <w:pBdr>
+          <w:left w:val="single" w:sz="12" w:space="6" w:color="A6A6A6"/>
+        </w:pBdr>
+        <w:shd w:val="clear" w:color="auto" w:fill="F2F2F2"/>
+        <w:spacing w:before="120"/>
         <w:ind w:left="180"/>
       </w:pPr>
       <w:r>
@@ -14173,58 +15505,43 @@
           <w:left w:val="single" w:sz="12" w:space="6" w:color="A6A6A6"/>
         </w:pBdr>
         <w:shd w:val="clear" w:color="auto" w:fill="F2F2F2"/>
-        <w:ind w:left="180"/>
-      </w:pPr>
-      <w:r>
-        <w:rPr>
-          <w:rFonts w:ascii="Consolas" w:eastAsia="Consolas" w:hAnsi="Consolas" w:cs="Consolas"/>
-          <w:sz w:val="16"/>
-          <w:szCs w:val="16"/>
-        </w:rPr>
-        <w:t xml:space="preserve">The numbered document set. Everything a </w:t>
-      </w:r>
-      <w:proofErr w:type="gramStart"/>
-      <w:r>
-        <w:rPr>
-          <w:rFonts w:ascii="Consolas" w:eastAsia="Consolas" w:hAnsi="Consolas" w:cs="Consolas"/>
-          <w:sz w:val="16"/>
-          <w:szCs w:val="16"/>
-        </w:rPr>
-        <w:t>human reads</w:t>
-      </w:r>
-      <w:proofErr w:type="gramEnd"/>
-      <w:r>
-        <w:rPr>
-          <w:rFonts w:ascii="Consolas" w:eastAsia="Consolas" w:hAnsi="Consolas" w:cs="Consolas"/>
-          <w:sz w:val="16"/>
-          <w:szCs w:val="16"/>
-        </w:rPr>
-        <w:t xml:space="preserve"> in lifecycle sequence</w:t>
-      </w:r>
-    </w:p>
-    <w:p>
-      <w:pPr>
-        <w:pBdr>
-          <w:left w:val="single" w:sz="12" w:space="6" w:color="A6A6A6"/>
-        </w:pBdr>
-        <w:shd w:val="clear" w:color="auto" w:fill="F2F2F2"/>
-        <w:ind w:left="180"/>
-      </w:pPr>
-      <w:r>
-        <w:rPr>
-          <w:rFonts w:ascii="Consolas" w:eastAsia="Consolas" w:hAnsi="Consolas" w:cs="Consolas"/>
-          <w:sz w:val="16"/>
-          <w:szCs w:val="16"/>
-        </w:rPr>
-        <w:t>lives here; nothing a system consumes does.</w:t>
-      </w:r>
-    </w:p>
-    <w:p>
-      <w:pPr>
-        <w:pBdr>
-          <w:left w:val="single" w:sz="12" w:space="6" w:color="A6A6A6"/>
-        </w:pBdr>
-        <w:shd w:val="clear" w:color="auto" w:fill="F2F2F2"/>
+        <w:spacing w:before="120"/>
+        <w:ind w:left="180"/>
+      </w:pPr>
+      <w:r>
+        <w:rPr>
+          <w:rFonts w:ascii="Consolas" w:eastAsia="Consolas" w:hAnsi="Consolas" w:cs="Consolas"/>
+          <w:sz w:val="16"/>
+          <w:szCs w:val="16"/>
+        </w:rPr>
+        <w:t xml:space="preserve">The numbered document set. Everything a human reads in lifecycle sequence</w:t>
+      </w:r>
+    </w:p>
+    <w:p>
+      <w:pPr>
+        <w:pBdr>
+          <w:left w:val="single" w:sz="12" w:space="6" w:color="A6A6A6"/>
+        </w:pBdr>
+        <w:shd w:val="clear" w:color="auto" w:fill="F2F2F2"/>
+        <w:spacing w:before="120"/>
+        <w:ind w:left="180"/>
+      </w:pPr>
+      <w:r>
+        <w:rPr>
+          <w:rFonts w:ascii="Consolas" w:eastAsia="Consolas" w:hAnsi="Consolas" w:cs="Consolas"/>
+          <w:sz w:val="16"/>
+          <w:szCs w:val="16"/>
+        </w:rPr>
+        <w:t xml:space="preserve">lives here; nothing a system consumes does.</w:t>
+      </w:r>
+    </w:p>
+    <w:p>
+      <w:pPr>
+        <w:pBdr>
+          <w:left w:val="single" w:sz="12" w:space="6" w:color="A6A6A6"/>
+        </w:pBdr>
+        <w:shd w:val="clear" w:color="auto" w:fill="F2F2F2"/>
+        <w:spacing w:before="120"/>
         <w:ind w:left="180"/>
       </w:pPr>
       <w:r>
@@ -14242,227 +15559,241 @@
           <w:left w:val="single" w:sz="12" w:space="6" w:color="A6A6A6"/>
         </w:pBdr>
         <w:shd w:val="clear" w:color="auto" w:fill="F2F2F2"/>
-        <w:ind w:left="180"/>
-      </w:pPr>
-      <w:r>
-        <w:rPr>
-          <w:rFonts w:ascii="Consolas" w:eastAsia="Consolas" w:hAnsi="Consolas" w:cs="Consolas"/>
-          <w:sz w:val="16"/>
-          <w:szCs w:val="16"/>
-        </w:rPr>
-        <w:t>| Doc | File | What it answers |</w:t>
-      </w:r>
-    </w:p>
-    <w:p>
-      <w:pPr>
-        <w:pBdr>
-          <w:left w:val="single" w:sz="12" w:space="6" w:color="A6A6A6"/>
-        </w:pBdr>
-        <w:shd w:val="clear" w:color="auto" w:fill="F2F2F2"/>
-        <w:ind w:left="180"/>
-      </w:pPr>
-      <w:r>
-        <w:rPr>
-          <w:rFonts w:ascii="Consolas" w:eastAsia="Consolas" w:hAnsi="Consolas" w:cs="Consolas"/>
-          <w:sz w:val="16"/>
-          <w:szCs w:val="16"/>
-        </w:rPr>
-        <w:t>|---|---|---|</w:t>
-      </w:r>
-    </w:p>
-    <w:p>
-      <w:pPr>
-        <w:pBdr>
-          <w:left w:val="single" w:sz="12" w:space="6" w:color="A6A6A6"/>
-        </w:pBdr>
-        <w:shd w:val="clear" w:color="auto" w:fill="F2F2F2"/>
-        <w:ind w:left="180"/>
-      </w:pPr>
-      <w:r>
-        <w:rPr>
-          <w:rFonts w:ascii="Consolas" w:eastAsia="Consolas" w:hAnsi="Consolas" w:cs="Consolas"/>
-          <w:sz w:val="16"/>
-          <w:szCs w:val="16"/>
-        </w:rPr>
-        <w:t>| 00 | 00_Development_Environment_and_Source_Control_Setup_Guide.docx | Where does the work live? |</w:t>
-      </w:r>
-    </w:p>
-    <w:p>
-      <w:pPr>
-        <w:pBdr>
-          <w:left w:val="single" w:sz="12" w:space="6" w:color="A6A6A6"/>
-        </w:pBdr>
-        <w:shd w:val="clear" w:color="auto" w:fill="F2F2F2"/>
-        <w:ind w:left="180"/>
-      </w:pPr>
-      <w:r>
-        <w:rPr>
-          <w:rFonts w:ascii="Consolas" w:eastAsia="Consolas" w:hAnsi="Consolas" w:cs="Consolas"/>
-          <w:sz w:val="16"/>
-          <w:szCs w:val="16"/>
-        </w:rPr>
-        <w:t>| 01 | 01_Project_Plan_Retail_Sector_Health.docx | What are we building? |</w:t>
-      </w:r>
-    </w:p>
-    <w:p>
-      <w:pPr>
-        <w:pBdr>
-          <w:left w:val="single" w:sz="12" w:space="6" w:color="A6A6A6"/>
-        </w:pBdr>
-        <w:shd w:val="clear" w:color="auto" w:fill="F2F2F2"/>
-        <w:ind w:left="180"/>
-      </w:pPr>
-      <w:r>
-        <w:rPr>
-          <w:rFonts w:ascii="Consolas" w:eastAsia="Consolas" w:hAnsi="Consolas" w:cs="Consolas"/>
-          <w:sz w:val="16"/>
-          <w:szCs w:val="16"/>
-        </w:rPr>
-        <w:t>| 02 | 02_Data_Setup_and_Semantic_Model_Guide.docx | How does data get in? |</w:t>
-      </w:r>
-    </w:p>
-    <w:p>
-      <w:pPr>
-        <w:pBdr>
-          <w:left w:val="single" w:sz="12" w:space="6" w:color="A6A6A6"/>
-        </w:pBdr>
-        <w:shd w:val="clear" w:color="auto" w:fill="F2F2F2"/>
-        <w:ind w:left="180"/>
-      </w:pPr>
-      <w:r>
-        <w:rPr>
-          <w:rFonts w:ascii="Consolas" w:eastAsia="Consolas" w:hAnsi="Consolas" w:cs="Consolas"/>
-          <w:sz w:val="16"/>
-          <w:szCs w:val="16"/>
-        </w:rPr>
-        <w:t>| 12 | 12_R1_Report_Mockup.html | What should R1 look like? |</w:t>
-      </w:r>
-    </w:p>
-    <w:p>
-      <w:pPr>
-        <w:pBdr>
-          <w:left w:val="single" w:sz="12" w:space="6" w:color="A6A6A6"/>
-        </w:pBdr>
-        <w:shd w:val="clear" w:color="auto" w:fill="F2F2F2"/>
-        <w:ind w:left="180"/>
-      </w:pPr>
-      <w:r>
-        <w:rPr>
-          <w:rFonts w:ascii="Consolas" w:eastAsia="Consolas" w:hAnsi="Consolas" w:cs="Consolas"/>
-          <w:sz w:val="16"/>
-          <w:szCs w:val="16"/>
-        </w:rPr>
-        <w:t>| 13 | 13_R2_Report_Mockup.html | What should R2 look like? |</w:t>
-      </w:r>
-    </w:p>
-    <w:p>
-      <w:pPr>
-        <w:pBdr>
-          <w:left w:val="single" w:sz="12" w:space="6" w:color="A6A6A6"/>
-        </w:pBdr>
-        <w:shd w:val="clear" w:color="auto" w:fill="F2F2F2"/>
-        <w:ind w:left="180"/>
-      </w:pPr>
-      <w:r>
-        <w:rPr>
-          <w:rFonts w:ascii="Consolas" w:eastAsia="Consolas" w:hAnsi="Consolas" w:cs="Consolas"/>
-          <w:sz w:val="16"/>
-          <w:szCs w:val="16"/>
-        </w:rPr>
-        <w:t>| 14 | 14_R3_Report_Mockup.html | What should R3 look like? |</w:t>
-      </w:r>
-    </w:p>
-    <w:p>
-      <w:pPr>
-        <w:pBdr>
-          <w:left w:val="single" w:sz="12" w:space="6" w:color="A6A6A6"/>
-        </w:pBdr>
-        <w:shd w:val="clear" w:color="auto" w:fill="F2F2F2"/>
-        <w:ind w:left="180"/>
-      </w:pPr>
-      <w:r>
-        <w:rPr>
-          <w:rFonts w:ascii="Consolas" w:eastAsia="Consolas" w:hAnsi="Consolas" w:cs="Consolas"/>
-          <w:sz w:val="16"/>
-          <w:szCs w:val="16"/>
-        </w:rPr>
-        <w:t>| 15 | 15_Report_Build_Instructions.docx | How is each visual built? |</w:t>
-      </w:r>
-    </w:p>
-    <w:p>
-      <w:pPr>
-        <w:pBdr>
-          <w:left w:val="single" w:sz="12" w:space="6" w:color="A6A6A6"/>
-        </w:pBdr>
-        <w:shd w:val="clear" w:color="auto" w:fill="F2F2F2"/>
-        <w:ind w:left="180"/>
-      </w:pPr>
-      <w:r>
-        <w:rPr>
-          <w:rFonts w:ascii="Consolas" w:eastAsia="Consolas" w:hAnsi="Consolas" w:cs="Consolas"/>
-          <w:sz w:val="16"/>
-          <w:szCs w:val="16"/>
-        </w:rPr>
-        <w:t>| 20 | 20_Data_Dictionary.xlsx | What is this column or measure? |</w:t>
-      </w:r>
-    </w:p>
-    <w:p>
-      <w:pPr>
-        <w:pBdr>
-          <w:left w:val="single" w:sz="12" w:space="6" w:color="A6A6A6"/>
-        </w:pBdr>
-        <w:shd w:val="clear" w:color="auto" w:fill="F2F2F2"/>
-        <w:ind w:left="180"/>
-      </w:pPr>
-      <w:r>
-        <w:rPr>
-          <w:rFonts w:ascii="Consolas" w:eastAsia="Consolas" w:hAnsi="Consolas" w:cs="Consolas"/>
-          <w:sz w:val="16"/>
-          <w:szCs w:val="16"/>
-        </w:rPr>
-        <w:t>| 21 | 21_Development_Checklist.xlsx | Was this step completed? Is this step necessary?  How much is completed? |</w:t>
-      </w:r>
-    </w:p>
-    <w:p>
-      <w:pPr>
-        <w:pBdr>
-          <w:left w:val="single" w:sz="12" w:space="6" w:color="A6A6A6"/>
-        </w:pBdr>
-        <w:shd w:val="clear" w:color="auto" w:fill="F2F2F2"/>
-        <w:ind w:left="180"/>
-      </w:pPr>
-      <w:r>
-        <w:rPr>
-          <w:rFonts w:ascii="Consolas" w:eastAsia="Consolas" w:hAnsi="Consolas" w:cs="Consolas"/>
-          <w:sz w:val="16"/>
-          <w:szCs w:val="16"/>
-        </w:rPr>
-        <w:t>| 22 | 22_Validation_Results.xlsx | Did the seventeen checks pass, on what date, with what numbers? |</w:t>
-      </w:r>
-    </w:p>
-    <w:p>
-      <w:pPr>
-        <w:pBdr>
-          <w:left w:val="single" w:sz="12" w:space="6" w:color="A6A6A6"/>
-        </w:pBdr>
-        <w:shd w:val="clear" w:color="auto" w:fill="F2F2F2"/>
-        <w:ind w:left="180"/>
-      </w:pPr>
-      <w:r>
-        <w:rPr>
-          <w:rFonts w:ascii="Consolas" w:eastAsia="Consolas" w:hAnsi="Consolas" w:cs="Consolas"/>
-          <w:sz w:val="16"/>
-          <w:szCs w:val="16"/>
-        </w:rPr>
-        <w:t>| 23 | 23_Glossary.docx | What does this term mean here? |</w:t>
-      </w:r>
-    </w:p>
-    <w:p>
-      <w:pPr>
-        <w:pBdr>
-          <w:left w:val="single" w:sz="12" w:space="6" w:color="A6A6A6"/>
-        </w:pBdr>
-        <w:shd w:val="clear" w:color="auto" w:fill="F2F2F2"/>
+        <w:spacing w:before="120"/>
+        <w:ind w:left="180"/>
+      </w:pPr>
+      <w:r>
+        <w:rPr>
+          <w:rFonts w:ascii="Consolas" w:eastAsia="Consolas" w:hAnsi="Consolas" w:cs="Consolas"/>
+          <w:sz w:val="16"/>
+          <w:szCs w:val="16"/>
+        </w:rPr>
+        <w:t xml:space="preserve">| Doc | File | What it answers |</w:t>
+      </w:r>
+    </w:p>
+    <w:p>
+      <w:pPr>
+        <w:pBdr>
+          <w:left w:val="single" w:sz="12" w:space="6" w:color="A6A6A6"/>
+        </w:pBdr>
+        <w:shd w:val="clear" w:color="auto" w:fill="F2F2F2"/>
+        <w:spacing w:before="120"/>
+        <w:ind w:left="180"/>
+      </w:pPr>
+      <w:r>
+        <w:rPr>
+          <w:rFonts w:ascii="Consolas" w:eastAsia="Consolas" w:hAnsi="Consolas" w:cs="Consolas"/>
+          <w:sz w:val="16"/>
+          <w:szCs w:val="16"/>
+        </w:rPr>
+        <w:t xml:space="preserve">|---|---|---|</w:t>
+      </w:r>
+    </w:p>
+    <w:p>
+      <w:pPr>
+        <w:pBdr>
+          <w:left w:val="single" w:sz="12" w:space="6" w:color="A6A6A6"/>
+        </w:pBdr>
+        <w:shd w:val="clear" w:color="auto" w:fill="F2F2F2"/>
+        <w:spacing w:before="120"/>
+        <w:ind w:left="180"/>
+      </w:pPr>
+      <w:r>
+        <w:rPr>
+          <w:rFonts w:ascii="Consolas" w:eastAsia="Consolas" w:hAnsi="Consolas" w:cs="Consolas"/>
+          <w:sz w:val="16"/>
+          <w:szCs w:val="16"/>
+        </w:rPr>
+        <w:t xml:space="preserve">| 00 | 00_Development_Environment_and_Source_Control_Setup_Guide.docx | Where does the work live? |</w:t>
+      </w:r>
+    </w:p>
+    <w:p>
+      <w:pPr>
+        <w:pBdr>
+          <w:left w:val="single" w:sz="12" w:space="6" w:color="A6A6A6"/>
+        </w:pBdr>
+        <w:shd w:val="clear" w:color="auto" w:fill="F2F2F2"/>
+        <w:spacing w:before="120"/>
+        <w:ind w:left="180"/>
+      </w:pPr>
+      <w:r>
+        <w:rPr>
+          <w:rFonts w:ascii="Consolas" w:eastAsia="Consolas" w:hAnsi="Consolas" w:cs="Consolas"/>
+          <w:sz w:val="16"/>
+          <w:szCs w:val="16"/>
+        </w:rPr>
+        <w:t xml:space="preserve">| 01 | 01_Project_Plan_Retail_Sector_Health.docx | What are we building? |</w:t>
+      </w:r>
+    </w:p>
+    <w:p>
+      <w:pPr>
+        <w:pBdr>
+          <w:left w:val="single" w:sz="12" w:space="6" w:color="A6A6A6"/>
+        </w:pBdr>
+        <w:shd w:val="clear" w:color="auto" w:fill="F2F2F2"/>
+        <w:spacing w:before="120"/>
+        <w:ind w:left="180"/>
+      </w:pPr>
+      <w:r>
+        <w:rPr>
+          <w:rFonts w:ascii="Consolas" w:eastAsia="Consolas" w:hAnsi="Consolas" w:cs="Consolas"/>
+          <w:sz w:val="16"/>
+          <w:szCs w:val="16"/>
+        </w:rPr>
+        <w:t xml:space="preserve">| 02 | 02_Data_Setup_and_Semantic_Model_Guide.docx | How does data get in? |</w:t>
+      </w:r>
+    </w:p>
+    <w:p>
+      <w:pPr>
+        <w:pBdr>
+          <w:left w:val="single" w:sz="12" w:space="6" w:color="A6A6A6"/>
+        </w:pBdr>
+        <w:shd w:val="clear" w:color="auto" w:fill="F2F2F2"/>
+        <w:spacing w:before="120"/>
+        <w:ind w:left="180"/>
+      </w:pPr>
+      <w:r>
+        <w:rPr>
+          <w:rFonts w:ascii="Consolas" w:eastAsia="Consolas" w:hAnsi="Consolas" w:cs="Consolas"/>
+          <w:sz w:val="16"/>
+          <w:szCs w:val="16"/>
+        </w:rPr>
+        <w:t xml:space="preserve">| 12 | 12_R1_Report_Mockup.html | What should R1 look like? |</w:t>
+      </w:r>
+    </w:p>
+    <w:p>
+      <w:pPr>
+        <w:pBdr>
+          <w:left w:val="single" w:sz="12" w:space="6" w:color="A6A6A6"/>
+        </w:pBdr>
+        <w:shd w:val="clear" w:color="auto" w:fill="F2F2F2"/>
+        <w:spacing w:before="120"/>
+        <w:ind w:left="180"/>
+      </w:pPr>
+      <w:r>
+        <w:rPr>
+          <w:rFonts w:ascii="Consolas" w:eastAsia="Consolas" w:hAnsi="Consolas" w:cs="Consolas"/>
+          <w:sz w:val="16"/>
+          <w:szCs w:val="16"/>
+        </w:rPr>
+        <w:t xml:space="preserve">| 13 | 13_R2_Report_Mockup.html | What should R2 look like? |</w:t>
+      </w:r>
+    </w:p>
+    <w:p>
+      <w:pPr>
+        <w:pBdr>
+          <w:left w:val="single" w:sz="12" w:space="6" w:color="A6A6A6"/>
+        </w:pBdr>
+        <w:shd w:val="clear" w:color="auto" w:fill="F2F2F2"/>
+        <w:spacing w:before="120"/>
+        <w:ind w:left="180"/>
+      </w:pPr>
+      <w:r>
+        <w:rPr>
+          <w:rFonts w:ascii="Consolas" w:eastAsia="Consolas" w:hAnsi="Consolas" w:cs="Consolas"/>
+          <w:sz w:val="16"/>
+          <w:szCs w:val="16"/>
+        </w:rPr>
+        <w:t xml:space="preserve">| 14 | 14_R3_Report_Mockup.html | What should R3 look like? |</w:t>
+      </w:r>
+    </w:p>
+    <w:p>
+      <w:pPr>
+        <w:pBdr>
+          <w:left w:val="single" w:sz="12" w:space="6" w:color="A6A6A6"/>
+        </w:pBdr>
+        <w:shd w:val="clear" w:color="auto" w:fill="F2F2F2"/>
+        <w:spacing w:before="120"/>
+        <w:ind w:left="180"/>
+      </w:pPr>
+      <w:r>
+        <w:rPr>
+          <w:rFonts w:ascii="Consolas" w:eastAsia="Consolas" w:hAnsi="Consolas" w:cs="Consolas"/>
+          <w:sz w:val="16"/>
+          <w:szCs w:val="16"/>
+        </w:rPr>
+        <w:t xml:space="preserve">| 15 | 15_Report_Build_Instructions.docx | How is each visual built? |</w:t>
+      </w:r>
+    </w:p>
+    <w:p>
+      <w:pPr>
+        <w:pBdr>
+          <w:left w:val="single" w:sz="12" w:space="6" w:color="A6A6A6"/>
+        </w:pBdr>
+        <w:shd w:val="clear" w:color="auto" w:fill="F2F2F2"/>
+        <w:spacing w:before="120"/>
+        <w:ind w:left="180"/>
+      </w:pPr>
+      <w:r>
+        <w:rPr>
+          <w:rFonts w:ascii="Consolas" w:eastAsia="Consolas" w:hAnsi="Consolas" w:cs="Consolas"/>
+          <w:sz w:val="16"/>
+          <w:szCs w:val="16"/>
+        </w:rPr>
+        <w:t xml:space="preserve">| 20 | 20_Data_Dictionary.xlsx | What is this column or measure? |</w:t>
+      </w:r>
+    </w:p>
+    <w:p>
+      <w:pPr>
+        <w:pBdr>
+          <w:left w:val="single" w:sz="12" w:space="6" w:color="A6A6A6"/>
+        </w:pBdr>
+        <w:shd w:val="clear" w:color="auto" w:fill="F2F2F2"/>
+        <w:spacing w:before="120"/>
+        <w:ind w:left="180"/>
+      </w:pPr>
+      <w:r>
+        <w:rPr>
+          <w:rFonts w:ascii="Consolas" w:eastAsia="Consolas" w:hAnsi="Consolas" w:cs="Consolas"/>
+          <w:sz w:val="16"/>
+          <w:szCs w:val="16"/>
+        </w:rPr>
+        <w:t xml:space="preserve">| 21 | 21_Development_Checklist.xlsx | Was this step completed? Is this step necessary?  How much is completed? |</w:t>
+      </w:r>
+    </w:p>
+    <w:p>
+      <w:pPr>
+        <w:pBdr>
+          <w:left w:val="single" w:sz="12" w:space="6" w:color="A6A6A6"/>
+        </w:pBdr>
+        <w:shd w:val="clear" w:color="auto" w:fill="F2F2F2"/>
+        <w:spacing w:before="120"/>
+        <w:ind w:left="180"/>
+      </w:pPr>
+      <w:r>
+        <w:rPr>
+          <w:rFonts w:ascii="Consolas" w:eastAsia="Consolas" w:hAnsi="Consolas" w:cs="Consolas"/>
+          <w:sz w:val="16"/>
+          <w:szCs w:val="16"/>
+        </w:rPr>
+        <w:t xml:space="preserve">| 22 | 22_Validation_Results.xlsx | Did the seventeen checks pass, on what date, with what numbers? |</w:t>
+      </w:r>
+    </w:p>
+    <w:p>
+      <w:pPr>
+        <w:pBdr>
+          <w:left w:val="single" w:sz="12" w:space="6" w:color="A6A6A6"/>
+        </w:pBdr>
+        <w:shd w:val="clear" w:color="auto" w:fill="F2F2F2"/>
+        <w:spacing w:before="120"/>
+        <w:ind w:left="180"/>
+      </w:pPr>
+      <w:r>
+        <w:rPr>
+          <w:rFonts w:ascii="Consolas" w:eastAsia="Consolas" w:hAnsi="Consolas" w:cs="Consolas"/>
+          <w:sz w:val="16"/>
+          <w:szCs w:val="16"/>
+        </w:rPr>
+        <w:t xml:space="preserve">| 23 | 23_Glossary.docx | What does this term mean here? |</w:t>
+      </w:r>
+    </w:p>
+    <w:p>
+      <w:pPr>
+        <w:pBdr>
+          <w:left w:val="single" w:sz="12" w:space="6" w:color="A6A6A6"/>
+        </w:pBdr>
+        <w:shd w:val="clear" w:color="auto" w:fill="F2F2F2"/>
+        <w:spacing w:before="120"/>
         <w:ind w:left="180"/>
       </w:pPr>
       <w:r>
@@ -14480,6 +15811,7 @@
           <w:left w:val="single" w:sz="12" w:space="6" w:color="A6A6A6"/>
         </w:pBdr>
         <w:shd w:val="clear" w:color="auto" w:fill="F2F2F2"/>
+        <w:spacing w:before="120"/>
         <w:ind w:left="180"/>
       </w:pPr>
       <w:r>
@@ -14497,6 +15829,25 @@
           <w:left w:val="single" w:sz="12" w:space="6" w:color="A6A6A6"/>
         </w:pBdr>
         <w:shd w:val="clear" w:color="auto" w:fill="F2F2F2"/>
+        <w:spacing w:before="120"/>
+        <w:ind w:left="180"/>
+      </w:pPr>
+      <w:r>
+        <w:rPr>
+          <w:rFonts w:ascii="Consolas" w:eastAsia="Consolas" w:hAnsi="Consolas" w:cs="Consolas"/>
+          <w:sz w:val="16"/>
+          <w:szCs w:val="16"/>
+        </w:rPr>
+        <w:t xml:space="preserve">| -- | validation/ | How do I actually run check N, step by step? |</w:t>
+      </w:r>
+    </w:p>
+    <w:p>
+      <w:pPr>
+        <w:pBdr>
+          <w:left w:val="single" w:sz="12" w:space="6" w:color="A6A6A6"/>
+        </w:pBdr>
+        <w:shd w:val="clear" w:color="auto" w:fill="F2F2F2"/>
+        <w:spacing w:before="120"/>
         <w:ind w:left="180"/>
       </w:pPr>
       <w:r>
@@ -14514,40 +15865,43 @@
           <w:left w:val="single" w:sz="12" w:space="6" w:color="A6A6A6"/>
         </w:pBdr>
         <w:shd w:val="clear" w:color="auto" w:fill="F2F2F2"/>
-        <w:ind w:left="180"/>
-      </w:pPr>
-      <w:r>
-        <w:rPr>
-          <w:rFonts w:ascii="Consolas" w:eastAsia="Consolas" w:hAnsi="Consolas" w:cs="Consolas"/>
-          <w:sz w:val="16"/>
-          <w:szCs w:val="16"/>
-        </w:rPr>
-        <w:t>Read 00 first. It is numbered 00 because the repository has to exist</w:t>
-      </w:r>
-    </w:p>
-    <w:p>
-      <w:pPr>
-        <w:pBdr>
-          <w:left w:val="single" w:sz="12" w:space="6" w:color="A6A6A6"/>
-        </w:pBdr>
-        <w:shd w:val="clear" w:color="auto" w:fill="F2F2F2"/>
-        <w:ind w:left="180"/>
-      </w:pPr>
-      <w:r>
-        <w:rPr>
-          <w:rFonts w:ascii="Consolas" w:eastAsia="Consolas" w:hAnsi="Consolas" w:cs="Consolas"/>
-          <w:sz w:val="16"/>
-          <w:szCs w:val="16"/>
-        </w:rPr>
-        <w:t>before anything else in the project does.</w:t>
-      </w:r>
-    </w:p>
-    <w:p>
-      <w:pPr>
-        <w:pBdr>
-          <w:left w:val="single" w:sz="12" w:space="6" w:color="A6A6A6"/>
-        </w:pBdr>
-        <w:shd w:val="clear" w:color="auto" w:fill="F2F2F2"/>
+        <w:spacing w:before="120"/>
+        <w:ind w:left="180"/>
+      </w:pPr>
+      <w:r>
+        <w:rPr>
+          <w:rFonts w:ascii="Consolas" w:eastAsia="Consolas" w:hAnsi="Consolas" w:cs="Consolas"/>
+          <w:sz w:val="16"/>
+          <w:szCs w:val="16"/>
+        </w:rPr>
+        <w:t xml:space="preserve">Read 00 first. It is numbered 00 because the repository has to exist</w:t>
+      </w:r>
+    </w:p>
+    <w:p>
+      <w:pPr>
+        <w:pBdr>
+          <w:left w:val="single" w:sz="12" w:space="6" w:color="A6A6A6"/>
+        </w:pBdr>
+        <w:shd w:val="clear" w:color="auto" w:fill="F2F2F2"/>
+        <w:spacing w:before="120"/>
+        <w:ind w:left="180"/>
+      </w:pPr>
+      <w:r>
+        <w:rPr>
+          <w:rFonts w:ascii="Consolas" w:eastAsia="Consolas" w:hAnsi="Consolas" w:cs="Consolas"/>
+          <w:sz w:val="16"/>
+          <w:szCs w:val="16"/>
+        </w:rPr>
+        <w:t xml:space="preserve">before anything else in the project does.</w:t>
+      </w:r>
+    </w:p>
+    <w:p>
+      <w:pPr>
+        <w:pBdr>
+          <w:left w:val="single" w:sz="12" w:space="6" w:color="A6A6A6"/>
+        </w:pBdr>
+        <w:shd w:val="clear" w:color="auto" w:fill="F2F2F2"/>
+        <w:spacing w:before="120"/>
         <w:ind w:left="180"/>
       </w:pPr>
       <w:r>
@@ -14565,40 +15919,43 @@
           <w:left w:val="single" w:sz="12" w:space="6" w:color="A6A6A6"/>
         </w:pBdr>
         <w:shd w:val="clear" w:color="auto" w:fill="F2F2F2"/>
-        <w:ind w:left="180"/>
-      </w:pPr>
-      <w:r>
-        <w:rPr>
-          <w:rFonts w:ascii="Consolas" w:eastAsia="Consolas" w:hAnsi="Consolas" w:cs="Consolas"/>
-          <w:sz w:val="16"/>
-          <w:szCs w:val="16"/>
-        </w:rPr>
-        <w:t>Numbering is gapped on purpose. 05, 24 and 30 are reserved, so a</w:t>
-      </w:r>
-    </w:p>
-    <w:p>
-      <w:pPr>
-        <w:pBdr>
-          <w:left w:val="single" w:sz="12" w:space="6" w:color="A6A6A6"/>
-        </w:pBdr>
-        <w:shd w:val="clear" w:color="auto" w:fill="F2F2F2"/>
-        <w:ind w:left="180"/>
-      </w:pPr>
-      <w:r>
-        <w:rPr>
-          <w:rFonts w:ascii="Consolas" w:eastAsia="Consolas" w:hAnsi="Consolas" w:cs="Consolas"/>
-          <w:sz w:val="16"/>
-          <w:szCs w:val="16"/>
-        </w:rPr>
-        <w:t>later document slots in without renumbering anything already cited.</w:t>
-      </w:r>
-    </w:p>
-    <w:p>
-      <w:pPr>
-        <w:pBdr>
-          <w:left w:val="single" w:sz="12" w:space="6" w:color="A6A6A6"/>
-        </w:pBdr>
-        <w:shd w:val="clear" w:color="auto" w:fill="F2F2F2"/>
+        <w:spacing w:before="120"/>
+        <w:ind w:left="180"/>
+      </w:pPr>
+      <w:r>
+        <w:rPr>
+          <w:rFonts w:ascii="Consolas" w:eastAsia="Consolas" w:hAnsi="Consolas" w:cs="Consolas"/>
+          <w:sz w:val="16"/>
+          <w:szCs w:val="16"/>
+        </w:rPr>
+        <w:t xml:space="preserve">Numbering is gapped on purpose. 05, 24 and 30 are reserved, so a</w:t>
+      </w:r>
+    </w:p>
+    <w:p>
+      <w:pPr>
+        <w:pBdr>
+          <w:left w:val="single" w:sz="12" w:space="6" w:color="A6A6A6"/>
+        </w:pBdr>
+        <w:shd w:val="clear" w:color="auto" w:fill="F2F2F2"/>
+        <w:spacing w:before="120"/>
+        <w:ind w:left="180"/>
+      </w:pPr>
+      <w:r>
+        <w:rPr>
+          <w:rFonts w:ascii="Consolas" w:eastAsia="Consolas" w:hAnsi="Consolas" w:cs="Consolas"/>
+          <w:sz w:val="16"/>
+          <w:szCs w:val="16"/>
+        </w:rPr>
+        <w:t xml:space="preserve">later document slots in without renumbering anything already cited.</w:t>
+      </w:r>
+    </w:p>
+    <w:p>
+      <w:pPr>
+        <w:pBdr>
+          <w:left w:val="single" w:sz="12" w:space="6" w:color="A6A6A6"/>
+        </w:pBdr>
+        <w:shd w:val="clear" w:color="auto" w:fill="F2F2F2"/>
+        <w:spacing w:before="120"/>
         <w:ind w:left="180"/>
       </w:pPr>
       <w:r>
@@ -14616,57 +15973,313 @@
           <w:left w:val="single" w:sz="12" w:space="6" w:color="A6A6A6"/>
         </w:pBdr>
         <w:shd w:val="clear" w:color="auto" w:fill="F2F2F2"/>
-        <w:ind w:left="180"/>
-      </w:pPr>
-      <w:r>
-        <w:rPr>
-          <w:rFonts w:ascii="Consolas" w:eastAsia="Consolas" w:hAnsi="Consolas" w:cs="Consolas"/>
-          <w:sz w:val="16"/>
-          <w:szCs w:val="16"/>
-        </w:rPr>
-        <w:t>## Rules</w:t>
-      </w:r>
-    </w:p>
-    <w:p>
-      <w:pPr>
-        <w:pBdr>
-          <w:left w:val="single" w:sz="12" w:space="6" w:color="A6A6A6"/>
-        </w:pBdr>
-        <w:shd w:val="clear" w:color="auto" w:fill="F2F2F2"/>
-        <w:ind w:left="180"/>
-      </w:pPr>
-      <w:r>
-        <w:rPr>
-          <w:rFonts w:ascii="Consolas" w:eastAsia="Consolas" w:hAnsi="Consolas" w:cs="Consolas"/>
-          <w:sz w:val="16"/>
-          <w:szCs w:val="16"/>
-        </w:rPr>
-        <w:t>- Never renumber a delivered document. Other documents cite it by number.</w:t>
-      </w:r>
-    </w:p>
-    <w:p>
-      <w:pPr>
-        <w:pBdr>
-          <w:left w:val="single" w:sz="12" w:space="6" w:color="A6A6A6"/>
-        </w:pBdr>
-        <w:shd w:val="clear" w:color="auto" w:fill="F2F2F2"/>
-        <w:ind w:left="180"/>
-      </w:pPr>
-      <w:r>
-        <w:rPr>
-          <w:rFonts w:ascii="Consolas" w:eastAsia="Consolas" w:hAnsi="Consolas" w:cs="Consolas"/>
-          <w:sz w:val="16"/>
-          <w:szCs w:val="16"/>
-        </w:rPr>
-        <w:t>- The three .html mockups are self-contained and can be published with</w:t>
-      </w:r>
-    </w:p>
-    <w:p>
-      <w:pPr>
-        <w:pBdr>
-          <w:left w:val="single" w:sz="12" w:space="6" w:color="A6A6A6"/>
-        </w:pBdr>
-        <w:shd w:val="clear" w:color="auto" w:fill="F2F2F2"/>
+        <w:spacing w:before="120"/>
+        <w:ind w:left="180"/>
+      </w:pPr>
+      <w:r>
+        <w:rPr>
+          <w:rFonts w:ascii="Consolas" w:eastAsia="Consolas" w:hAnsi="Consolas" w:cs="Consolas"/>
+          <w:sz w:val="16"/>
+          <w:szCs w:val="16"/>
+        </w:rPr>
+        <w:t xml:space="preserve">## validation/</w:t>
+      </w:r>
+    </w:p>
+    <w:p>
+      <w:pPr>
+        <w:pBdr>
+          <w:left w:val="single" w:sz="12" w:space="6" w:color="A6A6A6"/>
+        </w:pBdr>
+        <w:shd w:val="clear" w:color="auto" w:fill="F2F2F2"/>
+        <w:spacing w:before="120"/>
+        <w:ind w:left="180"/>
+      </w:pPr>
+      <w:r>
+        <w:rPr>
+          <w:rFonts w:ascii="Consolas" w:eastAsia="Consolas" w:hAnsi="Consolas" w:cs="Consolas"/>
+          <w:sz w:val="16"/>
+          <w:szCs w:val="16"/>
+        </w:rPr>
+        <w:t xml:space="preserve"> </w:t>
+      </w:r>
+    </w:p>
+    <w:p>
+      <w:pPr>
+        <w:pBdr>
+          <w:left w:val="single" w:sz="12" w:space="6" w:color="A6A6A6"/>
+        </w:pBdr>
+        <w:shd w:val="clear" w:color="auto" w:fill="F2F2F2"/>
+        <w:spacing w:before="120"/>
+        <w:ind w:left="180"/>
+      </w:pPr>
+      <w:r>
+        <w:rPr>
+          <w:rFonts w:ascii="Consolas" w:eastAsia="Consolas" w:hAnsi="Consolas" w:cs="Consolas"/>
+          <w:sz w:val="16"/>
+          <w:szCs w:val="16"/>
+        </w:rPr>
+        <w:t xml:space="preserve">One step-by-step procedure per check, for the seventeen pre-publication</w:t>
+      </w:r>
+    </w:p>
+    <w:p>
+      <w:pPr>
+        <w:pBdr>
+          <w:left w:val="single" w:sz="12" w:space="6" w:color="A6A6A6"/>
+        </w:pBdr>
+        <w:shd w:val="clear" w:color="auto" w:fill="F2F2F2"/>
+        <w:spacing w:before="120"/>
+        <w:ind w:left="180"/>
+      </w:pPr>
+      <w:r>
+        <w:rPr>
+          <w:rFonts w:ascii="Consolas" w:eastAsia="Consolas" w:hAnsi="Consolas" w:cs="Consolas"/>
+          <w:sz w:val="16"/>
+          <w:szCs w:val="16"/>
+        </w:rPr>
+        <w:t xml:space="preserve">checks in document 02 section 9. V01 to V17, each in two formats with the</w:t>
+      </w:r>
+    </w:p>
+    <w:p>
+      <w:pPr>
+        <w:pBdr>
+          <w:left w:val="single" w:sz="12" w:space="6" w:color="A6A6A6"/>
+        </w:pBdr>
+        <w:shd w:val="clear" w:color="auto" w:fill="F2F2F2"/>
+        <w:spacing w:before="120"/>
+        <w:ind w:left="180"/>
+      </w:pPr>
+      <w:r>
+        <w:rPr>
+          <w:rFonts w:ascii="Consolas" w:eastAsia="Consolas" w:hAnsi="Consolas" w:cs="Consolas"/>
+          <w:sz w:val="16"/>
+          <w:szCs w:val="16"/>
+        </w:rPr>
+        <w:t xml:space="preserve">same content: a .docx to read and print, and an .xlsx with a Pass/Fail</w:t>
+      </w:r>
+    </w:p>
+    <w:p>
+      <w:pPr>
+        <w:pBdr>
+          <w:left w:val="single" w:sz="12" w:space="6" w:color="A6A6A6"/>
+        </w:pBdr>
+        <w:shd w:val="clear" w:color="auto" w:fill="F2F2F2"/>
+        <w:spacing w:before="120"/>
+        <w:ind w:left="180"/>
+      </w:pPr>
+      <w:r>
+        <w:rPr>
+          <w:rFonts w:ascii="Consolas" w:eastAsia="Consolas" w:hAnsi="Consolas" w:cs="Consolas"/>
+          <w:sz w:val="16"/>
+          <w:szCs w:val="16"/>
+        </w:rPr>
+        <w:t xml:space="preserve">drop-down on every tick table. Written for someone who has never run the</w:t>
+      </w:r>
+    </w:p>
+    <w:p>
+      <w:pPr>
+        <w:pBdr>
+          <w:left w:val="single" w:sz="12" w:space="6" w:color="A6A6A6"/>
+        </w:pBdr>
+        <w:shd w:val="clear" w:color="auto" w:fill="F2F2F2"/>
+        <w:spacing w:before="120"/>
+        <w:ind w:left="180"/>
+      </w:pPr>
+      <w:r>
+        <w:rPr>
+          <w:rFonts w:ascii="Consolas" w:eastAsia="Consolas" w:hAnsi="Consolas" w:cs="Consolas"/>
+          <w:sz w:val="16"/>
+          <w:szCs w:val="16"/>
+        </w:rPr>
+        <w:t xml:space="preserve">check: every click, every query, how to decide pass or fail, how to record</w:t>
+      </w:r>
+    </w:p>
+    <w:p>
+      <w:pPr>
+        <w:pBdr>
+          <w:left w:val="single" w:sz="12" w:space="6" w:color="A6A6A6"/>
+        </w:pBdr>
+        <w:shd w:val="clear" w:color="auto" w:fill="F2F2F2"/>
+        <w:spacing w:before="120"/>
+        <w:ind w:left="180"/>
+      </w:pPr>
+      <w:r>
+        <w:rPr>
+          <w:rFonts w:ascii="Consolas" w:eastAsia="Consolas" w:hAnsi="Consolas" w:cs="Consolas"/>
+          <w:sz w:val="16"/>
+          <w:szCs w:val="16"/>
+        </w:rPr>
+        <w:t xml:space="preserve">the result, and what to do if it fails.</w:t>
+      </w:r>
+    </w:p>
+    <w:p>
+      <w:pPr>
+        <w:pBdr>
+          <w:left w:val="single" w:sz="12" w:space="6" w:color="A6A6A6"/>
+        </w:pBdr>
+        <w:shd w:val="clear" w:color="auto" w:fill="F2F2F2"/>
+        <w:spacing w:before="120"/>
+        <w:ind w:left="180"/>
+      </w:pPr>
+      <w:r>
+        <w:rPr>
+          <w:rFonts w:ascii="Consolas" w:eastAsia="Consolas" w:hAnsi="Consolas" w:cs="Consolas"/>
+          <w:sz w:val="16"/>
+          <w:szCs w:val="16"/>
+        </w:rPr>
+        <w:t xml:space="preserve"> </w:t>
+      </w:r>
+    </w:p>
+    <w:p>
+      <w:pPr>
+        <w:pBdr>
+          <w:left w:val="single" w:sz="12" w:space="6" w:color="A6A6A6"/>
+        </w:pBdr>
+        <w:shd w:val="clear" w:color="auto" w:fill="F2F2F2"/>
+        <w:spacing w:before="120"/>
+        <w:ind w:left="180"/>
+      </w:pPr>
+      <w:r>
+        <w:rPr>
+          <w:rFonts w:ascii="Consolas" w:eastAsia="Consolas" w:hAnsi="Consolas" w:cs="Consolas"/>
+          <w:sz w:val="16"/>
+          <w:szCs w:val="16"/>
+        </w:rPr>
+        <w:t xml:space="preserve">The subfolder has its own README with the check-to-procedure table. Results</w:t>
+      </w:r>
+    </w:p>
+    <w:p>
+      <w:pPr>
+        <w:pBdr>
+          <w:left w:val="single" w:sz="12" w:space="6" w:color="A6A6A6"/>
+        </w:pBdr>
+        <w:shd w:val="clear" w:color="auto" w:fill="F2F2F2"/>
+        <w:spacing w:before="120"/>
+        <w:ind w:left="180"/>
+      </w:pPr>
+      <w:r>
+        <w:rPr>
+          <w:rFonts w:ascii="Consolas" w:eastAsia="Consolas" w:hAnsi="Consolas" w:cs="Consolas"/>
+          <w:sz w:val="16"/>
+          <w:szCs w:val="16"/>
+        </w:rPr>
+        <w:t xml:space="preserve">still go in document 22; the V files are the instructions, not the record.</w:t>
+      </w:r>
+    </w:p>
+    <w:p>
+      <w:pPr>
+        <w:pBdr>
+          <w:left w:val="single" w:sz="12" w:space="6" w:color="A6A6A6"/>
+        </w:pBdr>
+        <w:shd w:val="clear" w:color="auto" w:fill="F2F2F2"/>
+        <w:spacing w:before="120"/>
+        <w:ind w:left="180"/>
+      </w:pPr>
+      <w:r>
+        <w:rPr>
+          <w:rFonts w:ascii="Consolas" w:eastAsia="Consolas" w:hAnsi="Consolas" w:cs="Consolas"/>
+          <w:sz w:val="16"/>
+          <w:szCs w:val="16"/>
+        </w:rPr>
+        <w:t xml:space="preserve"> </w:t>
+      </w:r>
+    </w:p>
+    <w:p>
+      <w:pPr>
+        <w:pBdr>
+          <w:left w:val="single" w:sz="12" w:space="6" w:color="A6A6A6"/>
+        </w:pBdr>
+        <w:shd w:val="clear" w:color="auto" w:fill="F2F2F2"/>
+        <w:spacing w:before="120"/>
+        <w:ind w:left="180"/>
+      </w:pPr>
+      <w:r>
+        <w:rPr>
+          <w:rFonts w:ascii="Consolas" w:eastAsia="Consolas" w:hAnsi="Consolas" w:cs="Consolas"/>
+          <w:sz w:val="16"/>
+          <w:szCs w:val="16"/>
+        </w:rPr>
+        <w:t xml:space="preserve">## Rules</w:t>
+      </w:r>
+    </w:p>
+    <w:p>
+      <w:pPr>
+        <w:pBdr>
+          <w:left w:val="single" w:sz="12" w:space="6" w:color="A6A6A6"/>
+        </w:pBdr>
+        <w:shd w:val="clear" w:color="auto" w:fill="F2F2F2"/>
+        <w:spacing w:before="120"/>
+        <w:ind w:left="180"/>
+      </w:pPr>
+      <w:r>
+        <w:rPr>
+          <w:rFonts w:ascii="Consolas" w:eastAsia="Consolas" w:hAnsi="Consolas" w:cs="Consolas"/>
+          <w:sz w:val="16"/>
+          <w:szCs w:val="16"/>
+        </w:rPr>
+        <w:t xml:space="preserve">- Never renumber a delivered document. Other documents cite it by number.</w:t>
+      </w:r>
+    </w:p>
+    <w:p>
+      <w:pPr>
+        <w:pBdr>
+          <w:left w:val="single" w:sz="12" w:space="6" w:color="A6A6A6"/>
+        </w:pBdr>
+        <w:shd w:val="clear" w:color="auto" w:fill="F2F2F2"/>
+        <w:spacing w:before="120"/>
+        <w:ind w:left="180"/>
+      </w:pPr>
+      <w:r>
+        <w:rPr>
+          <w:rFonts w:ascii="Consolas" w:eastAsia="Consolas" w:hAnsi="Consolas" w:cs="Consolas"/>
+          <w:sz w:val="16"/>
+          <w:szCs w:val="16"/>
+        </w:rPr>
+        <w:t xml:space="preserve">- The V files in validation/ are numbered by check, not by document number.</w:t>
+      </w:r>
+    </w:p>
+    <w:p>
+      <w:pPr>
+        <w:pBdr>
+          <w:left w:val="single" w:sz="12" w:space="6" w:color="A6A6A6"/>
+        </w:pBdr>
+        <w:shd w:val="clear" w:color="auto" w:fill="F2F2F2"/>
+        <w:spacing w:before="120"/>
+        <w:ind w:left="180"/>
+      </w:pPr>
+      <w:r>
+        <w:rPr>
+          <w:rFonts w:ascii="Consolas" w:eastAsia="Consolas" w:hAnsi="Consolas" w:cs="Consolas"/>
+          <w:sz w:val="16"/>
+          <w:szCs w:val="16"/>
+        </w:rPr>
+        <w:t xml:space="preserve">  V07 is the procedure for check 7. They are outside the gapped numbering.</w:t>
+      </w:r>
+    </w:p>
+    <w:p>
+      <w:pPr>
+        <w:pBdr>
+          <w:left w:val="single" w:sz="12" w:space="6" w:color="A6A6A6"/>
+        </w:pBdr>
+        <w:shd w:val="clear" w:color="auto" w:fill="F2F2F2"/>
+        <w:spacing w:before="120"/>
+        <w:ind w:left="180"/>
+      </w:pPr>
+      <w:r>
+        <w:rPr>
+          <w:rFonts w:ascii="Consolas" w:eastAsia="Consolas" w:hAnsi="Consolas" w:cs="Consolas"/>
+          <w:sz w:val="16"/>
+          <w:szCs w:val="16"/>
+        </w:rPr>
+        <w:t xml:space="preserve">- The three .html mockups are self-contained and can be published with</w:t>
+      </w:r>
+    </w:p>
+    <w:p>
+      <w:pPr>
+        <w:pBdr>
+          <w:left w:val="single" w:sz="12" w:space="6" w:color="A6A6A6"/>
+        </w:pBdr>
+        <w:shd w:val="clear" w:color="auto" w:fill="F2F2F2"/>
+        <w:spacing w:before="120"/>
         <w:ind w:left="180"/>
       </w:pPr>
       <w:r>
@@ -14684,23 +16297,25 @@
           <w:left w:val="single" w:sz="12" w:space="6" w:color="A6A6A6"/>
         </w:pBdr>
         <w:shd w:val="clear" w:color="auto" w:fill="F2F2F2"/>
-        <w:ind w:left="180"/>
-      </w:pPr>
-      <w:r>
-        <w:rPr>
-          <w:rFonts w:ascii="Consolas" w:eastAsia="Consolas" w:hAnsi="Consolas" w:cs="Consolas"/>
-          <w:sz w:val="16"/>
-          <w:szCs w:val="16"/>
-        </w:rPr>
-        <w:t>- Documents are committed with git from the local clone. Document 00</w:t>
-      </w:r>
-    </w:p>
-    <w:p>
-      <w:pPr>
-        <w:pBdr>
-          <w:left w:val="single" w:sz="12" w:space="6" w:color="A6A6A6"/>
-        </w:pBdr>
-        <w:shd w:val="clear" w:color="auto" w:fill="F2F2F2"/>
+        <w:spacing w:before="120"/>
+        <w:ind w:left="180"/>
+      </w:pPr>
+      <w:r>
+        <w:rPr>
+          <w:rFonts w:ascii="Consolas" w:eastAsia="Consolas" w:hAnsi="Consolas" w:cs="Consolas"/>
+          <w:sz w:val="16"/>
+          <w:szCs w:val="16"/>
+        </w:rPr>
+        <w:t xml:space="preserve">- Documents are committed with git from the local clone. Document 00</w:t>
+      </w:r>
+    </w:p>
+    <w:p>
+      <w:pPr>
+        <w:pBdr>
+          <w:left w:val="single" w:sz="12" w:space="6" w:color="A6A6A6"/>
+        </w:pBdr>
+        <w:shd w:val="clear" w:color="auto" w:fill="F2F2F2"/>
+        <w:spacing w:before="120"/>
         <w:ind w:left="180"/>
       </w:pPr>
       <w:r>

</xml_diff>